<commit_message>
Update website: 8 file(s) changed — Makefile,assets/pdf/Chakraborty.docx,assets/pdf/Chakraborty.pdf,assets/pdf/papers.bib,cv-2page.html,index.html
</commit_message>
<xml_diff>
--- a/assets/pdf/Chakraborty.docx
+++ b/assets/pdf/Chakraborty.docx
@@ -3254,8 +3254,83 @@
           <w:sz w:val="18"/>
           <w:szCs w:val="18"/>
         </w:rPr>
-        <w:t>Wu, H., Wang, W., Shi, X., Lin, D., Hartinger, M. D., Baker, J. B. H., &amp; Chakraborty, S. (2026). Global impacts of ultra-low-frequency waves: 1. Thermospheric responses and traveling atmospheric disturbances. Geophysical Research Letters, 53, e2025GL119835. https://doi.org/10.1029/2025GL119835</w:t>
-      </w:r>
+        <w:t xml:space="preserve">Chakraborty, S., Bullett, T., </w:t>
+      </w:r>
+      <w:proofErr w:type="spellStart"/>
+      <w:r>
+        <w:rPr>
+          <w:sz w:val="18"/>
+          <w:szCs w:val="18"/>
+        </w:rPr>
+        <w:t>Barjatya</w:t>
+      </w:r>
+      <w:proofErr w:type="spellEnd"/>
+      <w:r>
+        <w:rPr>
+          <w:sz w:val="18"/>
+          <w:szCs w:val="18"/>
+        </w:rPr>
+        <w:t xml:space="preserve">, A., &amp; Mabie, J. (2026). </w:t>
+      </w:r>
+      <w:proofErr w:type="spellStart"/>
+      <w:r>
+        <w:rPr>
+          <w:sz w:val="18"/>
+          <w:szCs w:val="18"/>
+        </w:rPr>
+        <w:t>pynasonde</w:t>
+      </w:r>
+      <w:proofErr w:type="spellEnd"/>
+      <w:r>
+        <w:rPr>
+          <w:sz w:val="18"/>
+          <w:szCs w:val="18"/>
+        </w:rPr>
+        <w:t xml:space="preserve">: An open-source Python library for ionosonde data processing. </w:t>
+      </w:r>
+      <w:proofErr w:type="spellStart"/>
+      <w:r>
+        <w:rPr>
+          <w:i/>
+          <w:iCs/>
+          <w:sz w:val="18"/>
+          <w:szCs w:val="18"/>
+        </w:rPr>
+        <w:t>SoftwareX</w:t>
+      </w:r>
+      <w:proofErr w:type="spellEnd"/>
+      <w:r>
+        <w:rPr>
+          <w:sz w:val="18"/>
+          <w:szCs w:val="18"/>
+        </w:rPr>
+        <w:t xml:space="preserve">, </w:t>
+      </w:r>
+      <w:r>
+        <w:rPr>
+          <w:i/>
+          <w:iCs/>
+          <w:sz w:val="18"/>
+          <w:szCs w:val="18"/>
+        </w:rPr>
+        <w:t>34</w:t>
+      </w:r>
+      <w:r>
+        <w:rPr>
+          <w:sz w:val="18"/>
+          <w:szCs w:val="18"/>
+        </w:rPr>
+        <w:t xml:space="preserve">, 102617. </w:t>
+      </w:r>
+      <w:hyperlink r:id="rId5" w:tgtFrame="_blank" w:history="1">
+        <w:r>
+          <w:rPr>
+            <w:sz w:val="18"/>
+            <w:szCs w:val="18"/>
+          </w:rPr>
+          <w:t>https://doi.org/10.1016/j.softx.2026.102617</w:t>
+        </w:r>
+      </w:hyperlink>
     </w:p>
     <w:p>
       <w:pPr>
@@ -3265,38 +3340,17 @@
           <w:numId w:val="2"/>
         </w:numPr>
         <w:spacing w:before="28" w:after="28"/>
-      </w:pPr>
-      <w:proofErr w:type="spellStart"/>
-      <w:r>
-        <w:rPr>
-          <w:sz w:val="18"/>
-          <w:szCs w:val="18"/>
-        </w:rPr>
-        <w:t>Inchin</w:t>
-      </w:r>
-      <w:proofErr w:type="spellEnd"/>
-      <w:r>
-        <w:rPr>
-          <w:sz w:val="18"/>
-          <w:szCs w:val="18"/>
-        </w:rPr>
-        <w:t xml:space="preserve">, P. A., Heale, C., Zettergren, M. D., Bergsson, B., </w:t>
-      </w:r>
-      <w:proofErr w:type="spellStart"/>
-      <w:r>
-        <w:rPr>
-          <w:sz w:val="18"/>
-          <w:szCs w:val="18"/>
-        </w:rPr>
-        <w:t>Debchoudhury</w:t>
-      </w:r>
-      <w:proofErr w:type="spellEnd"/>
-      <w:r>
-        <w:rPr>
-          <w:sz w:val="18"/>
-          <w:szCs w:val="18"/>
-        </w:rPr>
-        <w:t>, S., &amp; Chakraborty, S. (2025). Severe weather-generated acoustic and gravity wave impacts on the ionosphere: A model-guided case study. Journal of Geophysical Research: Space Physics, 130, e2025JA034012. https://doi.org/10.1029/2025JA034012</w:t>
+        <w:rPr>
+          <w:sz w:val="18"/>
+          <w:szCs w:val="18"/>
+        </w:rPr>
+      </w:pPr>
+      <w:r>
+        <w:rPr>
+          <w:sz w:val="18"/>
+          <w:szCs w:val="18"/>
+        </w:rPr>
+        <w:t>Wu, H., Wang, W., Shi, X., Lin, D., Hartinger, M. D., Baker, J. B. H., &amp; Chakraborty, S. (2026). Global impacts of ultra-low-frequency waves: 1. Thermospheric responses and traveling atmospheric disturbances. Geophysical Research Letters, 53, e2025GL119835. https://doi.org/10.1029/2025GL119835</w:t>
       </w:r>
     </w:p>
     <w:p>
@@ -3308,20 +3362,13 @@
         </w:numPr>
         <w:spacing w:before="28" w:after="28"/>
       </w:pPr>
-      <w:r>
-        <w:rPr>
-          <w:sz w:val="18"/>
-          <w:szCs w:val="18"/>
-        </w:rPr>
-        <w:t xml:space="preserve">Prikryl, P., </w:t>
-      </w:r>
       <w:proofErr w:type="spellStart"/>
       <w:r>
         <w:rPr>
           <w:sz w:val="18"/>
           <w:szCs w:val="18"/>
         </w:rPr>
-        <w:t>Themens</w:t>
+        <w:t>Inchin</w:t>
       </w:r>
       <w:proofErr w:type="spellEnd"/>
       <w:r>
@@ -3329,7 +3376,23 @@
           <w:sz w:val="18"/>
           <w:szCs w:val="18"/>
         </w:rPr>
-        <w:t>, D. R., Chum, J., Chakraborty, S., Gillies, R. G., and Weygand, J. M. (2025). Observations of traveling ionospheric disturbances driven by gravity waves from sources in the upper and lower atmosphere. Ann. Geophys., 43, 511-534, https://doi.org/10.5194/angeo-43-511-2025</w:t>
+        <w:t xml:space="preserve">, P. A., Heale, C., Zettergren, M. D., Bergsson, B., </w:t>
+      </w:r>
+      <w:proofErr w:type="spellStart"/>
+      <w:r>
+        <w:rPr>
+          <w:sz w:val="18"/>
+          <w:szCs w:val="18"/>
+        </w:rPr>
+        <w:t>Debchoudhury</w:t>
+      </w:r>
+      <w:proofErr w:type="spellEnd"/>
+      <w:r>
+        <w:rPr>
+          <w:sz w:val="18"/>
+          <w:szCs w:val="18"/>
+        </w:rPr>
+        <w:t>, S., &amp; Chakraborty, S. (2025). Severe weather-generated acoustic and gravity wave impacts on the ionosphere: A model-guided case study. Journal of Geophysical Research: Space Physics, 130, e2025JA034012. https://doi.org/10.1029/2025JA034012</w:t>
       </w:r>
     </w:p>
     <w:p>
@@ -3346,7 +3409,7 @@
           <w:sz w:val="18"/>
           <w:szCs w:val="18"/>
         </w:rPr>
-        <w:t xml:space="preserve">Chakraborty, S., Qian, L., Mrak, S., Mabie, J., Goncharenko, L., </w:t>
+        <w:t xml:space="preserve">Prikryl, P., </w:t>
       </w:r>
       <w:proofErr w:type="spellStart"/>
       <w:r>
@@ -3354,7 +3417,7 @@
           <w:sz w:val="18"/>
           <w:szCs w:val="18"/>
         </w:rPr>
-        <w:t>Mclnerney</w:t>
+        <w:t>Themens</w:t>
       </w:r>
       <w:proofErr w:type="spellEnd"/>
       <w:r>
@@ -3362,7 +3425,7 @@
           <w:sz w:val="18"/>
           <w:szCs w:val="18"/>
         </w:rPr>
-        <w:t>, J. M., &amp; Bullett, T. (2025). Formation of the ionospheric G-condition following the 2017 Great American Eclipse. Earth and Space Science, 12, e2024EA004007. https://doi.org/10.1029/2024EA004007</w:t>
+        <w:t>, D. R., Chum, J., Chakraborty, S., Gillies, R. G., and Weygand, J. M. (2025). Observations of traveling ionospheric disturbances driven by gravity waves from sources in the upper and lower atmosphere. Ann. Geophys., 43, 511-534, https://doi.org/10.5194/angeo-43-511-2025</w:t>
       </w:r>
     </w:p>
     <w:p>
@@ -3379,7 +3442,7 @@
           <w:sz w:val="18"/>
           <w:szCs w:val="18"/>
         </w:rPr>
-        <w:t xml:space="preserve">Oberheide, J., Aggarwal, D., Bergsson, B., Chakraborty, S. et al. (2025). Impact of Terrestrial Weather on the Space Weather of the Ionosphere-Thermosphere: Initial Results from a NASA Living with a Star Focused Science Topic. </w:t>
+        <w:t xml:space="preserve">Chakraborty, S., Qian, L., Mrak, S., Mabie, J., Goncharenko, L., </w:t>
       </w:r>
       <w:proofErr w:type="spellStart"/>
       <w:r>
@@ -3387,7 +3450,7 @@
           <w:sz w:val="18"/>
           <w:szCs w:val="18"/>
         </w:rPr>
-        <w:t>Surv</w:t>
+        <w:t>Mclnerney</w:t>
       </w:r>
       <w:proofErr w:type="spellEnd"/>
       <w:r>
@@ -3395,7 +3458,7 @@
           <w:sz w:val="18"/>
           <w:szCs w:val="18"/>
         </w:rPr>
-        <w:t xml:space="preserve"> Geophys. https://doi.org/10.1007/s10712-025-09895-7</w:t>
+        <w:t>, J. M., &amp; Bullett, T. (2025). Formation of the ionospheric G-condition following the 2017 Great American Eclipse. Earth and Space Science, 12, e2024EA004007. https://doi.org/10.1029/2024EA004007</w:t>
       </w:r>
     </w:p>
     <w:p>
@@ -3412,7 +3475,23 @@
           <w:sz w:val="18"/>
           <w:szCs w:val="18"/>
         </w:rPr>
-        <w:t>Rout, D., Kumar, A., Singh, R., Patra, S., Karan, D. K., Chakraborty, S., et al. (2024). Evidence of unusually strong equatorial ionization anomaly at three local time sectors during the Mother's Day geomagnetic storm on 10-11 May 2024. Geophysical Research Letters, 52, e2024GL111269. https://doi.org/10.1029/2024GL111269</w:t>
+        <w:t xml:space="preserve">Oberheide, J., Aggarwal, D., Bergsson, B., Chakraborty, S. et al. (2025). Impact of Terrestrial Weather on the Space Weather of the Ionosphere-Thermosphere: Initial Results from a NASA Living with a Star Focused Science Topic. </w:t>
+      </w:r>
+      <w:proofErr w:type="spellStart"/>
+      <w:r>
+        <w:rPr>
+          <w:sz w:val="18"/>
+          <w:szCs w:val="18"/>
+        </w:rPr>
+        <w:t>Surv</w:t>
+      </w:r>
+      <w:proofErr w:type="spellEnd"/>
+      <w:r>
+        <w:rPr>
+          <w:sz w:val="18"/>
+          <w:szCs w:val="18"/>
+        </w:rPr>
+        <w:t xml:space="preserve"> Geophys. https://doi.org/10.1007/s10712-025-09895-7</w:t>
       </w:r>
     </w:p>
     <w:p>
@@ -3429,7 +3508,7 @@
           <w:sz w:val="18"/>
           <w:szCs w:val="18"/>
         </w:rPr>
-        <w:t>Shi, X., Chakraborty, S., Baker, J. B. H., Hartinger, M. D., Wang, W., Ruohoniemi, J. M., et al. (2025). Statistical characterization of joule heating associated with ionospheric ULF perturbations using SuperDARN data. Journal of Geophysical Research: Space Physics, 130, e2024JA033452. https://doi.org/10.1029/2024JA033452</w:t>
+        <w:t>Rout, D., Kumar, A., Singh, R., Patra, S., Karan, D. K., Chakraborty, S., et al. (2024). Evidence of unusually strong equatorial ionization anomaly at three local time sectors during the Mother's Day geomagnetic storm on 10-11 May 2024. Geophysical Research Letters, 52, e2024GL111269. https://doi.org/10.1029/2024GL111269</w:t>
       </w:r>
     </w:p>
     <w:p>
@@ -3446,7 +3525,7 @@
           <w:sz w:val="18"/>
           <w:szCs w:val="18"/>
         </w:rPr>
-        <w:t>Liu, X., Zhang, D., Coster, A. J., Xu, Z., Shi, X., &amp; Chakraborty, S. (2024). The morphology and oscillations of nightside mid-latitude ionospheric trough at designated longitudes in the Northern Hemisphere. Journal of Geophysical Research: Space Physics, 129, e2024JA032864. https://doi.org/10.1029/2024JA032864</w:t>
+        <w:t>Shi, X., Chakraborty, S., Baker, J. B. H., Hartinger, M. D., Wang, W., Ruohoniemi, J. M., et al. (2025). Statistical characterization of joule heating associated with ionospheric ULF perturbations using SuperDARN data. Journal of Geophysical Research: Space Physics, 130, e2024JA033452. https://doi.org/10.1029/2024JA033452</w:t>
       </w:r>
     </w:p>
     <w:p>
@@ -3458,37 +3537,12 @@
         </w:numPr>
         <w:spacing w:before="28" w:after="28"/>
       </w:pPr>
-      <w:proofErr w:type="spellStart"/>
-      <w:r>
-        <w:rPr>
-          <w:sz w:val="18"/>
-          <w:szCs w:val="18"/>
-        </w:rPr>
-        <w:t>Inchin</w:t>
-      </w:r>
-      <w:proofErr w:type="spellEnd"/>
-      <w:r>
-        <w:rPr>
-          <w:sz w:val="18"/>
-          <w:szCs w:val="18"/>
-        </w:rPr>
-        <w:t xml:space="preserve">, P. A., Bhatt, A., Bramberger, M., Chakraborty, S., </w:t>
-      </w:r>
-      <w:proofErr w:type="spellStart"/>
-      <w:r>
-        <w:rPr>
-          <w:sz w:val="18"/>
-          <w:szCs w:val="18"/>
-        </w:rPr>
-        <w:t>Debchoudhury</w:t>
-      </w:r>
-      <w:proofErr w:type="spellEnd"/>
-      <w:r>
-        <w:rPr>
-          <w:sz w:val="18"/>
-          <w:szCs w:val="18"/>
-        </w:rPr>
-        <w:t>, S., &amp; Heale, C. (2024). Atmospheric and ionospheric responses to orographic gravity waves prior to the December 2022 cold air outbreak. Journal of Geophysical Research: Space Physics, 129, e2024JA032485. https://doi.org/10.1029/2024JA032485</w:t>
+      <w:r>
+        <w:rPr>
+          <w:sz w:val="18"/>
+          <w:szCs w:val="18"/>
+        </w:rPr>
+        <w:t>Liu, X., Zhang, D., Coster, A. J., Xu, Z., Shi, X., &amp; Chakraborty, S. (2024). The morphology and oscillations of nightside mid-latitude ionospheric trough at designated longitudes in the Northern Hemisphere. Journal of Geophysical Research: Space Physics, 129, e2024JA032864. https://doi.org/10.1029/2024JA032864</w:t>
       </w:r>
     </w:p>
     <w:p>
@@ -3506,7 +3560,7 @@
           <w:sz w:val="18"/>
           <w:szCs w:val="18"/>
         </w:rPr>
-        <w:t>Gowtam</w:t>
+        <w:t>Inchin</w:t>
       </w:r>
       <w:proofErr w:type="spellEnd"/>
       <w:r>
@@ -3514,7 +3568,7 @@
           <w:sz w:val="18"/>
           <w:szCs w:val="18"/>
         </w:rPr>
-        <w:t xml:space="preserve">, V. S., Connor, H., </w:t>
+        <w:t xml:space="preserve">, P. A., Bhatt, A., Bramberger, M., Chakraborty, S., </w:t>
       </w:r>
       <w:proofErr w:type="spellStart"/>
       <w:r>
@@ -3522,7 +3576,7 @@
           <w:sz w:val="18"/>
           <w:szCs w:val="18"/>
         </w:rPr>
-        <w:t>Kunduri</w:t>
+        <w:t>Debchoudhury</w:t>
       </w:r>
       <w:proofErr w:type="spellEnd"/>
       <w:r>
@@ -3530,23 +3584,7 @@
           <w:sz w:val="18"/>
           <w:szCs w:val="18"/>
         </w:rPr>
-        <w:t xml:space="preserve">, B. S. R., Raeder, J., Laundal, K. M., Tulasi Ram, S., Chakraborty S., et al. (2024). Calculating </w:t>
-      </w:r>
-      <w:proofErr w:type="gramStart"/>
-      <w:r>
-        <w:rPr>
-          <w:sz w:val="18"/>
-          <w:szCs w:val="18"/>
-        </w:rPr>
-        <w:t>the high</w:t>
-      </w:r>
-      <w:proofErr w:type="gramEnd"/>
-      <w:r>
-        <w:rPr>
-          <w:sz w:val="18"/>
-          <w:szCs w:val="18"/>
-        </w:rPr>
-        <w:t>-latitude ionospheric electrodynamics using a machine learning-based field-aligned current model. Space Weather, 22, e2023SW003683. https://doi.org/10.1029/2023SW003683</w:t>
+        <w:t>, S., &amp; Heale, C. (2024). Atmospheric and ionospheric responses to orographic gravity waves prior to the December 2022 cold air outbreak. Journal of Geophysical Research: Space Physics, 129, e2024JA032485. https://doi.org/10.1029/2024JA032485</w:t>
       </w:r>
     </w:p>
     <w:p>
@@ -3558,12 +3596,53 @@
         </w:numPr>
         <w:spacing w:before="28" w:after="28"/>
       </w:pPr>
-      <w:r>
-        <w:rPr>
-          <w:sz w:val="18"/>
-          <w:szCs w:val="18"/>
-        </w:rPr>
-        <w:t>Boteler, D. H., Chakraborty, S., Shi, X., Hartinger, M. D., &amp; Wang, X. (2024). An examination of geomagnetic induction in submarine cables. Space Weather, 22, e2023SW003687. https://doi.org/10.1029/2023SW003687</w:t>
+      <w:proofErr w:type="spellStart"/>
+      <w:r>
+        <w:rPr>
+          <w:sz w:val="18"/>
+          <w:szCs w:val="18"/>
+        </w:rPr>
+        <w:t>Gowtam</w:t>
+      </w:r>
+      <w:proofErr w:type="spellEnd"/>
+      <w:r>
+        <w:rPr>
+          <w:sz w:val="18"/>
+          <w:szCs w:val="18"/>
+        </w:rPr>
+        <w:t xml:space="preserve">, V. S., Connor, H., </w:t>
+      </w:r>
+      <w:proofErr w:type="spellStart"/>
+      <w:r>
+        <w:rPr>
+          <w:sz w:val="18"/>
+          <w:szCs w:val="18"/>
+        </w:rPr>
+        <w:t>Kunduri</w:t>
+      </w:r>
+      <w:proofErr w:type="spellEnd"/>
+      <w:r>
+        <w:rPr>
+          <w:sz w:val="18"/>
+          <w:szCs w:val="18"/>
+        </w:rPr>
+        <w:t xml:space="preserve">, B. S. R., Raeder, J., Laundal, K. M., Tulasi Ram, S., Chakraborty S., et al. (2024). Calculating </w:t>
+      </w:r>
+      <w:proofErr w:type="gramStart"/>
+      <w:r>
+        <w:rPr>
+          <w:sz w:val="18"/>
+          <w:szCs w:val="18"/>
+        </w:rPr>
+        <w:t>the high</w:t>
+      </w:r>
+      <w:proofErr w:type="gramEnd"/>
+      <w:r>
+        <w:rPr>
+          <w:sz w:val="18"/>
+          <w:szCs w:val="18"/>
+        </w:rPr>
+        <w:t>-latitude ionospheric electrodynamics using a machine learning-based field-aligned current model. Space Weather, 22, e2023SW003683. https://doi.org/10.1029/2023SW003683</w:t>
       </w:r>
     </w:p>
     <w:p>
@@ -3581,7 +3660,7 @@
           <w:szCs w:val="18"/>
         </w:rPr>
         <w:lastRenderedPageBreak/>
-        <w:t>Coyle, S. E., Baker, J. B. H., Chakraborty, S., Hartinger, M. D., Freeman, M. P., Clauer, C. R., et al. (2023). Substorms and solar eclipses: A mutual information-based study. Geophysical Research Letters, 50, e2023GL106432. https://doi.org/10.1029/2023GL106432</w:t>
+        <w:t>Boteler, D. H., Chakraborty, S., Shi, X., Hartinger, M. D., &amp; Wang, X. (2024). An examination of geomagnetic induction in submarine cables. Space Weather, 22, e2023SW003687. https://doi.org/10.1029/2023SW003687</w:t>
       </w:r>
     </w:p>
     <w:p>
@@ -3598,55 +3677,7 @@
           <w:sz w:val="18"/>
           <w:szCs w:val="18"/>
         </w:rPr>
-        <w:t xml:space="preserve">Reiss, M. A., </w:t>
-      </w:r>
-      <w:proofErr w:type="spellStart"/>
-      <w:r>
-        <w:rPr>
-          <w:sz w:val="18"/>
-          <w:szCs w:val="18"/>
-        </w:rPr>
-        <w:t>Muglach</w:t>
-      </w:r>
-      <w:proofErr w:type="spellEnd"/>
-      <w:r>
-        <w:rPr>
-          <w:sz w:val="18"/>
-          <w:szCs w:val="18"/>
-        </w:rPr>
-        <w:t xml:space="preserve">, K., Mason, E., Davies, E. E., Chakraborty, S., </w:t>
-      </w:r>
-      <w:proofErr w:type="spellStart"/>
-      <w:r>
-        <w:rPr>
-          <w:sz w:val="18"/>
-          <w:szCs w:val="18"/>
-        </w:rPr>
-        <w:t>Delouille</w:t>
-      </w:r>
-      <w:proofErr w:type="spellEnd"/>
-      <w:r>
-        <w:rPr>
-          <w:sz w:val="18"/>
-          <w:szCs w:val="18"/>
-        </w:rPr>
-        <w:t xml:space="preserve">, V., ... &amp; </w:t>
-      </w:r>
-      <w:proofErr w:type="spellStart"/>
-      <w:r>
-        <w:rPr>
-          <w:sz w:val="18"/>
-          <w:szCs w:val="18"/>
-        </w:rPr>
-        <w:t>Veronig</w:t>
-      </w:r>
-      <w:proofErr w:type="spellEnd"/>
-      <w:r>
-        <w:rPr>
-          <w:sz w:val="18"/>
-          <w:szCs w:val="18"/>
-        </w:rPr>
-        <w:t>, A. (2023). A Community Dataset for Comparing Automated Coronal Hole Detection Schemes. Astrophysical Journal Supplement. https://ore.exeter.ac.uk/repository/handle/10871/134745</w:t>
+        <w:t>Coyle, S. E., Baker, J. B. H., Chakraborty, S., Hartinger, M. D., Freeman, M. P., Clauer, C. R., et al. (2023). Substorms and solar eclipses: A mutual information-based study. Geophysical Research Letters, 50, e2023GL106432. https://doi.org/10.1029/2023GL106432</w:t>
       </w:r>
     </w:p>
     <w:p>
@@ -3663,7 +3694,7 @@
           <w:sz w:val="18"/>
           <w:szCs w:val="18"/>
         </w:rPr>
-        <w:t xml:space="preserve">Boteler, D., Chakraborty, S., Shi, X., Hartinger, M. and Wang, X. (2023). Transmission Line Modelling of Geomagnetic Induction in the Ocean/Earth Conductivity Structure. International Journal of Geosciences, 14, 767-791. </w:t>
+        <w:t xml:space="preserve">Reiss, M. A., </w:t>
       </w:r>
       <w:proofErr w:type="spellStart"/>
       <w:r>
@@ -3671,7 +3702,7 @@
           <w:sz w:val="18"/>
           <w:szCs w:val="18"/>
         </w:rPr>
-        <w:t>doi</w:t>
+        <w:t>Muglach</w:t>
       </w:r>
       <w:proofErr w:type="spellEnd"/>
       <w:r>
@@ -3679,7 +3710,39 @@
           <w:sz w:val="18"/>
           <w:szCs w:val="18"/>
         </w:rPr>
-        <w:t>: 10.4236/ijg.2023.148041</w:t>
+        <w:t xml:space="preserve">, K., Mason, E., Davies, E. E., Chakraborty, S., </w:t>
+      </w:r>
+      <w:proofErr w:type="spellStart"/>
+      <w:r>
+        <w:rPr>
+          <w:sz w:val="18"/>
+          <w:szCs w:val="18"/>
+        </w:rPr>
+        <w:t>Delouille</w:t>
+      </w:r>
+      <w:proofErr w:type="spellEnd"/>
+      <w:r>
+        <w:rPr>
+          <w:sz w:val="18"/>
+          <w:szCs w:val="18"/>
+        </w:rPr>
+        <w:t xml:space="preserve">, V., ... &amp; </w:t>
+      </w:r>
+      <w:proofErr w:type="spellStart"/>
+      <w:r>
+        <w:rPr>
+          <w:sz w:val="18"/>
+          <w:szCs w:val="18"/>
+        </w:rPr>
+        <w:t>Veronig</w:t>
+      </w:r>
+      <w:proofErr w:type="spellEnd"/>
+      <w:r>
+        <w:rPr>
+          <w:sz w:val="18"/>
+          <w:szCs w:val="18"/>
+        </w:rPr>
+        <w:t>, A. (2023). A Community Dataset for Comparing Automated Coronal Hole Detection Schemes. Astrophysical Journal Supplement. https://ore.exeter.ac.uk/repository/handle/10871/134745</w:t>
       </w:r>
     </w:p>
     <w:p>
@@ -3696,7 +3759,7 @@
           <w:sz w:val="18"/>
           <w:szCs w:val="18"/>
         </w:rPr>
-        <w:t xml:space="preserve">Rout, D., Patra, S., Kumar, S., Chakrabarty, D., Reeves, G. D., Stolle, C., Pandey, K., Chakraborty, S., Spencer E. A. (2023). The growth of ring current/SYM-H under northward IMF </w:t>
+        <w:t xml:space="preserve">Boteler, D., Chakraborty, S., Shi, X., Hartinger, M. and Wang, X. (2023). Transmission Line Modelling of Geomagnetic Induction in the Ocean/Earth Conductivity Structure. International Journal of Geosciences, 14, 767-791. </w:t>
       </w:r>
       <w:proofErr w:type="spellStart"/>
       <w:r>
@@ -3704,7 +3767,7 @@
           <w:sz w:val="18"/>
           <w:szCs w:val="18"/>
         </w:rPr>
-        <w:t>Bz</w:t>
+        <w:t>doi</w:t>
       </w:r>
       <w:proofErr w:type="spellEnd"/>
       <w:r>
@@ -3712,7 +3775,7 @@
           <w:sz w:val="18"/>
           <w:szCs w:val="18"/>
         </w:rPr>
-        <w:t xml:space="preserve"> conditions present during the 21-22 January 2005 geomagnetic storm. Space Weather, 21, e2023SW003489. https://doi.org/10.1029/2023SW003489</w:t>
+        <w:t>: 10.4236/ijg.2023.148041</w:t>
       </w:r>
     </w:p>
     <w:p>
@@ -3729,7 +3792,7 @@
           <w:sz w:val="18"/>
           <w:szCs w:val="18"/>
         </w:rPr>
-        <w:t xml:space="preserve">Liu, J., Chakraborty, S., Chen, X., Wang, Z., He, F., Hu, Z., et al. (2023). Transient response of polar-cusp ionosphere to an interplanetary shock. Journal of Geophysical Research: Space Physics, 128, e2022JA030565. </w:t>
+        <w:t xml:space="preserve">Rout, D., Patra, S., Kumar, S., Chakrabarty, D., Reeves, G. D., Stolle, C., Pandey, K., Chakraborty, S., Spencer E. A. (2023). The growth of ring current/SYM-H under northward IMF </w:t>
       </w:r>
       <w:proofErr w:type="spellStart"/>
       <w:r>
@@ -3737,7 +3800,7 @@
           <w:sz w:val="18"/>
           <w:szCs w:val="18"/>
         </w:rPr>
-        <w:t>doi</w:t>
+        <w:t>Bz</w:t>
       </w:r>
       <w:proofErr w:type="spellEnd"/>
       <w:r>
@@ -3745,7 +3808,7 @@
           <w:sz w:val="18"/>
           <w:szCs w:val="18"/>
         </w:rPr>
-        <w:t>: 10.1029/2022JA030565</w:t>
+        <w:t xml:space="preserve"> conditions present during the 21-22 January 2005 geomagnetic storm. Space Weather, 21, e2023SW003489. https://doi.org/10.1029/2023SW003489</w:t>
       </w:r>
     </w:p>
     <w:p>
@@ -3762,7 +3825,7 @@
           <w:sz w:val="18"/>
           <w:szCs w:val="18"/>
         </w:rPr>
-        <w:t xml:space="preserve">Collins, K., Gibbons, J., Frissell, N., </w:t>
+        <w:t xml:space="preserve">Liu, J., Chakraborty, S., Chen, X., Wang, Z., He, F., Hu, Z., et al. (2023). Transient response of polar-cusp ionosphere to an interplanetary shock. Journal of Geophysical Research: Space Physics, 128, e2022JA030565. </w:t>
       </w:r>
       <w:proofErr w:type="spellStart"/>
       <w:r>
@@ -3770,7 +3833,7 @@
           <w:sz w:val="18"/>
           <w:szCs w:val="18"/>
         </w:rPr>
-        <w:t>Montare</w:t>
+        <w:t>doi</w:t>
       </w:r>
       <w:proofErr w:type="spellEnd"/>
       <w:r>
@@ -3778,55 +3841,7 @@
           <w:sz w:val="18"/>
           <w:szCs w:val="18"/>
         </w:rPr>
-        <w:t xml:space="preserve">, A., </w:t>
-      </w:r>
-      <w:proofErr w:type="spellStart"/>
-      <w:r>
-        <w:rPr>
-          <w:sz w:val="18"/>
-          <w:szCs w:val="18"/>
-        </w:rPr>
-        <w:t>Kazdan</w:t>
-      </w:r>
-      <w:proofErr w:type="spellEnd"/>
-      <w:r>
-        <w:rPr>
-          <w:sz w:val="18"/>
-          <w:szCs w:val="18"/>
-        </w:rPr>
-        <w:t xml:space="preserve">, D., Kalmbach, D., Swartz, D., Benedict, R., Romanek, V., Boedicker, R., Liles, W., Engelke, W., McGaw, D. G., Farmer, J., </w:t>
-      </w:r>
-      <w:proofErr w:type="spellStart"/>
-      <w:r>
-        <w:rPr>
-          <w:sz w:val="18"/>
-          <w:szCs w:val="18"/>
-        </w:rPr>
-        <w:t>Mikitin</w:t>
-      </w:r>
-      <w:proofErr w:type="spellEnd"/>
-      <w:r>
-        <w:rPr>
-          <w:sz w:val="18"/>
-          <w:szCs w:val="18"/>
-        </w:rPr>
-        <w:t xml:space="preserve">, G., Hobart, J., Kavanagh, G., and Chakraborty, S. (2023). Crowdsourced Doppler measurements of time standard stations </w:t>
-      </w:r>
-      <w:proofErr w:type="gramStart"/>
-      <w:r>
-        <w:rPr>
-          <w:sz w:val="18"/>
-          <w:szCs w:val="18"/>
-        </w:rPr>
-        <w:t>demonstrating</w:t>
-      </w:r>
-      <w:proofErr w:type="gramEnd"/>
-      <w:r>
-        <w:rPr>
-          <w:sz w:val="18"/>
-          <w:szCs w:val="18"/>
-        </w:rPr>
-        <w:t xml:space="preserve"> ionospheric variability. Earth Syst. Sci. Data, 15, 1403-1418, doi:10.5194/essd-15-1403-2023</w:t>
+        <w:t>: 10.1029/2022JA030565</w:t>
       </w:r>
     </w:p>
     <w:p>
@@ -3843,7 +3858,7 @@
           <w:sz w:val="18"/>
           <w:szCs w:val="18"/>
         </w:rPr>
-        <w:t xml:space="preserve">Chakraborty, S., Boteler DH, Shi X, Murphy BS, Hartinger MD, Wang X, Lucas G and Baker JBH (2022). Modeling geomagnetic induction in submarine cables. Front. Phys. 10:1022475. </w:t>
+        <w:t xml:space="preserve">Collins, K., Gibbons, J., Frissell, N., </w:t>
       </w:r>
       <w:proofErr w:type="spellStart"/>
       <w:r>
@@ -3851,7 +3866,7 @@
           <w:sz w:val="18"/>
           <w:szCs w:val="18"/>
         </w:rPr>
-        <w:t>doi</w:t>
+        <w:t>Montare</w:t>
       </w:r>
       <w:proofErr w:type="spellEnd"/>
       <w:r>
@@ -3859,7 +3874,55 @@
           <w:sz w:val="18"/>
           <w:szCs w:val="18"/>
         </w:rPr>
-        <w:t>: 10.3389/fphy.2022.1022475</w:t>
+        <w:t xml:space="preserve">, A., </w:t>
+      </w:r>
+      <w:proofErr w:type="spellStart"/>
+      <w:r>
+        <w:rPr>
+          <w:sz w:val="18"/>
+          <w:szCs w:val="18"/>
+        </w:rPr>
+        <w:t>Kazdan</w:t>
+      </w:r>
+      <w:proofErr w:type="spellEnd"/>
+      <w:r>
+        <w:rPr>
+          <w:sz w:val="18"/>
+          <w:szCs w:val="18"/>
+        </w:rPr>
+        <w:t xml:space="preserve">, D., Kalmbach, D., Swartz, D., Benedict, R., Romanek, V., Boedicker, R., Liles, W., Engelke, W., McGaw, D. G., Farmer, J., </w:t>
+      </w:r>
+      <w:proofErr w:type="spellStart"/>
+      <w:r>
+        <w:rPr>
+          <w:sz w:val="18"/>
+          <w:szCs w:val="18"/>
+        </w:rPr>
+        <w:t>Mikitin</w:t>
+      </w:r>
+      <w:proofErr w:type="spellEnd"/>
+      <w:r>
+        <w:rPr>
+          <w:sz w:val="18"/>
+          <w:szCs w:val="18"/>
+        </w:rPr>
+        <w:t xml:space="preserve">, G., Hobart, J., Kavanagh, G., and Chakraborty, S. (2023). Crowdsourced Doppler measurements of time standard stations </w:t>
+      </w:r>
+      <w:proofErr w:type="gramStart"/>
+      <w:r>
+        <w:rPr>
+          <w:sz w:val="18"/>
+          <w:szCs w:val="18"/>
+        </w:rPr>
+        <w:t>demonstrating</w:t>
+      </w:r>
+      <w:proofErr w:type="gramEnd"/>
+      <w:r>
+        <w:rPr>
+          <w:sz w:val="18"/>
+          <w:szCs w:val="18"/>
+        </w:rPr>
+        <w:t xml:space="preserve"> ionospheric variability. Earth Syst. Sci. Data, 15, 1403-1418, doi:10.5194/essd-15-1403-2023</w:t>
       </w:r>
     </w:p>
     <w:p>
@@ -3876,7 +3939,7 @@
           <w:sz w:val="18"/>
           <w:szCs w:val="18"/>
         </w:rPr>
-        <w:t xml:space="preserve">Prikryl, P., Gillies, R. G., </w:t>
+        <w:t xml:space="preserve">Chakraborty, S., Boteler DH, Shi X, Murphy BS, Hartinger MD, Wang X, Lucas G and Baker JBH (2022). Modeling geomagnetic induction in submarine cables. Front. Phys. 10:1022475. </w:t>
       </w:r>
       <w:proofErr w:type="spellStart"/>
       <w:r>
@@ -3884,7 +3947,7 @@
           <w:sz w:val="18"/>
           <w:szCs w:val="18"/>
         </w:rPr>
-        <w:t>Themens</w:t>
+        <w:t>doi</w:t>
       </w:r>
       <w:proofErr w:type="spellEnd"/>
       <w:r>
@@ -3892,23 +3955,7 @@
           <w:sz w:val="18"/>
           <w:szCs w:val="18"/>
         </w:rPr>
-        <w:t xml:space="preserve">, D. R., Weygand, J. M., Thomas, E. G., and Chakraborty, S. (2022). Multi-instrument observations of polar cap patches and traveling ionospheric disturbances generated by solar wind Alfven waves coupling to the dayside magnetosphere. Ann. Geophys., 40, 619-639, </w:t>
-      </w:r>
-      <w:proofErr w:type="spellStart"/>
-      <w:r>
-        <w:rPr>
-          <w:sz w:val="18"/>
-          <w:szCs w:val="18"/>
-        </w:rPr>
-        <w:t>doi</w:t>
-      </w:r>
-      <w:proofErr w:type="spellEnd"/>
-      <w:r>
-        <w:rPr>
-          <w:sz w:val="18"/>
-          <w:szCs w:val="18"/>
-        </w:rPr>
-        <w:t>: 10.5194/angeo-40-619-2022</w:t>
+        <w:t>: 10.3389/fphy.2022.1022475</w:t>
       </w:r>
     </w:p>
     <w:p>
@@ -3925,7 +3972,7 @@
           <w:sz w:val="18"/>
           <w:szCs w:val="18"/>
         </w:rPr>
-        <w:t xml:space="preserve">Chakraborty, S., Qian, L., Baker, J. B. H., Ruohoniemi, J. M., Kuyeng, K., and Mclnerney, J. M. (2022). Driving influences of the Doppler flash observed by SuperDARN HF radars in response to solar flares. Journal of Geophysical Research: Space Physics, 127, e2022JA030342. </w:t>
+        <w:t xml:space="preserve">Prikryl, P., Gillies, R. G., </w:t>
       </w:r>
       <w:proofErr w:type="spellStart"/>
       <w:r>
@@ -3933,6 +3980,22 @@
           <w:sz w:val="18"/>
           <w:szCs w:val="18"/>
         </w:rPr>
+        <w:t>Themens</w:t>
+      </w:r>
+      <w:proofErr w:type="spellEnd"/>
+      <w:r>
+        <w:rPr>
+          <w:sz w:val="18"/>
+          <w:szCs w:val="18"/>
+        </w:rPr>
+        <w:t xml:space="preserve">, D. R., Weygand, J. M., Thomas, E. G., and Chakraborty, S. (2022). Multi-instrument observations of polar cap patches and traveling ionospheric disturbances generated by solar wind Alfven waves coupling to the dayside magnetosphere. Ann. Geophys., 40, 619-639, </w:t>
+      </w:r>
+      <w:proofErr w:type="spellStart"/>
+      <w:r>
+        <w:rPr>
+          <w:sz w:val="18"/>
+          <w:szCs w:val="18"/>
+        </w:rPr>
         <w:t>doi</w:t>
       </w:r>
       <w:proofErr w:type="spellEnd"/>
@@ -3941,7 +4004,7 @@
           <w:sz w:val="18"/>
           <w:szCs w:val="18"/>
         </w:rPr>
-        <w:t>: 10.1029/2022JA030342</w:t>
+        <w:t>: 10.5194/angeo-40-619-2022</w:t>
       </w:r>
     </w:p>
     <w:p>
@@ -3958,7 +4021,7 @@
           <w:sz w:val="18"/>
           <w:szCs w:val="18"/>
         </w:rPr>
-        <w:t xml:space="preserve">Shi X, Schmidt M, Martin CJ, Billett DD, Bland E, </w:t>
+        <w:t xml:space="preserve">Chakraborty, S., Qian, L., Baker, J. B. H., Ruohoniemi, J. M., Kuyeng, K., and Mclnerney, J. M. (2022). Driving influences of the Doppler flash observed by SuperDARN HF radars in response to solar flares. Journal of Geophysical Research: Space Physics, 127, e2022JA030342. </w:t>
       </w:r>
       <w:proofErr w:type="spellStart"/>
       <w:r>
@@ -3966,7 +4029,7 @@
           <w:sz w:val="18"/>
           <w:szCs w:val="18"/>
         </w:rPr>
-        <w:t>Tholley</w:t>
+        <w:t>doi</w:t>
       </w:r>
       <w:proofErr w:type="spellEnd"/>
       <w:r>
@@ -3974,71 +4037,7 @@
           <w:sz w:val="18"/>
           <w:szCs w:val="18"/>
         </w:rPr>
-        <w:t xml:space="preserve"> FH, Frissell NA, Khanal K, Coyle S, Chakraborty S, Detwiller M, </w:t>
-      </w:r>
-      <w:proofErr w:type="spellStart"/>
-      <w:r>
-        <w:rPr>
-          <w:sz w:val="18"/>
-          <w:szCs w:val="18"/>
-        </w:rPr>
-        <w:t>Kunduri</w:t>
-      </w:r>
-      <w:proofErr w:type="spellEnd"/>
-      <w:r>
-        <w:rPr>
-          <w:sz w:val="18"/>
-          <w:szCs w:val="18"/>
-        </w:rPr>
-        <w:t xml:space="preserve"> B and McWilliams K (2022). </w:t>
-      </w:r>
-      <w:proofErr w:type="spellStart"/>
-      <w:r>
-        <w:rPr>
-          <w:sz w:val="18"/>
-          <w:szCs w:val="18"/>
-        </w:rPr>
-        <w:t>pyDARN</w:t>
-      </w:r>
-      <w:proofErr w:type="spellEnd"/>
-      <w:r>
-        <w:rPr>
-          <w:sz w:val="18"/>
-          <w:szCs w:val="18"/>
-        </w:rPr>
-        <w:t xml:space="preserve">: </w:t>
-      </w:r>
-      <w:proofErr w:type="gramStart"/>
-      <w:r>
-        <w:rPr>
-          <w:sz w:val="18"/>
-          <w:szCs w:val="18"/>
-        </w:rPr>
-        <w:t>A Python</w:t>
-      </w:r>
-      <w:proofErr w:type="gramEnd"/>
-      <w:r>
-        <w:rPr>
-          <w:sz w:val="18"/>
-          <w:szCs w:val="18"/>
-        </w:rPr>
-        <w:t xml:space="preserve"> software for visualizing SuperDARN radar data. Front. Astron. Space Sci. 9:1022690. </w:t>
-      </w:r>
-      <w:proofErr w:type="spellStart"/>
-      <w:r>
-        <w:rPr>
-          <w:sz w:val="18"/>
-          <w:szCs w:val="18"/>
-        </w:rPr>
-        <w:t>doi</w:t>
-      </w:r>
-      <w:proofErr w:type="spellEnd"/>
-      <w:r>
-        <w:rPr>
-          <w:sz w:val="18"/>
-          <w:szCs w:val="18"/>
-        </w:rPr>
-        <w:t>: 10.3389/fspas.2022.1022690</w:t>
+        <w:t>: 10.1029/2022JA030342</w:t>
       </w:r>
     </w:p>
     <w:p>
@@ -4055,7 +4054,7 @@
           <w:sz w:val="18"/>
           <w:szCs w:val="18"/>
         </w:rPr>
-        <w:t>Chakraborty, S., Baker, J. B. H., and Ruohoniemi, J. M. (2021). Probabilistic Short-wave Fadeout Detection in SuperDARN Time Series Observations, 2021 IEEE International Conference on Wireless for Space and Extreme Environments (</w:t>
+        <w:t xml:space="preserve">Shi X, Schmidt M, Martin CJ, Billett DD, Bland E, </w:t>
       </w:r>
       <w:proofErr w:type="spellStart"/>
       <w:r>
@@ -4063,7 +4062,7 @@
           <w:sz w:val="18"/>
           <w:szCs w:val="18"/>
         </w:rPr>
-        <w:t>WiSEE</w:t>
+        <w:t>Tholley</w:t>
       </w:r>
       <w:proofErr w:type="spellEnd"/>
       <w:r>
@@ -4071,7 +4070,7 @@
           <w:sz w:val="18"/>
           <w:szCs w:val="18"/>
         </w:rPr>
-        <w:t xml:space="preserve">), pp. 43-48, </w:t>
+        <w:t xml:space="preserve"> FH, Frissell NA, Khanal K, Coyle S, Chakraborty S, Detwiller M, </w:t>
       </w:r>
       <w:proofErr w:type="spellStart"/>
       <w:r>
@@ -4079,6 +4078,54 @@
           <w:sz w:val="18"/>
           <w:szCs w:val="18"/>
         </w:rPr>
+        <w:t>Kunduri</w:t>
+      </w:r>
+      <w:proofErr w:type="spellEnd"/>
+      <w:r>
+        <w:rPr>
+          <w:sz w:val="18"/>
+          <w:szCs w:val="18"/>
+        </w:rPr>
+        <w:t xml:space="preserve"> B and McWilliams K (2022). </w:t>
+      </w:r>
+      <w:proofErr w:type="spellStart"/>
+      <w:r>
+        <w:rPr>
+          <w:sz w:val="18"/>
+          <w:szCs w:val="18"/>
+        </w:rPr>
+        <w:t>pyDARN</w:t>
+      </w:r>
+      <w:proofErr w:type="spellEnd"/>
+      <w:r>
+        <w:rPr>
+          <w:sz w:val="18"/>
+          <w:szCs w:val="18"/>
+        </w:rPr>
+        <w:t xml:space="preserve">: </w:t>
+      </w:r>
+      <w:proofErr w:type="gramStart"/>
+      <w:r>
+        <w:rPr>
+          <w:sz w:val="18"/>
+          <w:szCs w:val="18"/>
+        </w:rPr>
+        <w:t>A Python</w:t>
+      </w:r>
+      <w:proofErr w:type="gramEnd"/>
+      <w:r>
+        <w:rPr>
+          <w:sz w:val="18"/>
+          <w:szCs w:val="18"/>
+        </w:rPr>
+        <w:t xml:space="preserve"> software for visualizing SuperDARN radar data. Front. Astron. Space Sci. 9:1022690. </w:t>
+      </w:r>
+      <w:proofErr w:type="spellStart"/>
+      <w:r>
+        <w:rPr>
+          <w:sz w:val="18"/>
+          <w:szCs w:val="18"/>
+        </w:rPr>
         <w:t>doi</w:t>
       </w:r>
       <w:proofErr w:type="spellEnd"/>
@@ -4087,7 +4134,7 @@
           <w:sz w:val="18"/>
           <w:szCs w:val="18"/>
         </w:rPr>
-        <w:t>: 10.1109/WiSEE50203.2021.9613835</w:t>
+        <w:t>: 10.3389/fspas.2022.1022690</w:t>
       </w:r>
     </w:p>
     <w:p>
@@ -4104,7 +4151,7 @@
           <w:sz w:val="18"/>
           <w:szCs w:val="18"/>
         </w:rPr>
-        <w:t xml:space="preserve">Chakraborty, S., Qian, L., Ruohoniemi, J. M., Baker, J. B. H., </w:t>
+        <w:t>Chakraborty, S., Baker, J. B. H., and Ruohoniemi, J. M. (2021). Probabilistic Short-wave Fadeout Detection in SuperDARN Time Series Observations, 2021 IEEE International Conference on Wireless for Space and Extreme Environments (</w:t>
       </w:r>
       <w:proofErr w:type="spellStart"/>
       <w:r>
@@ -4112,7 +4159,7 @@
           <w:sz w:val="18"/>
           <w:szCs w:val="18"/>
         </w:rPr>
-        <w:t>Mclnerney</w:t>
+        <w:t>WiSEE</w:t>
       </w:r>
       <w:proofErr w:type="spellEnd"/>
       <w:r>
@@ -4120,7 +4167,7 @@
           <w:sz w:val="18"/>
           <w:szCs w:val="18"/>
         </w:rPr>
-        <w:t xml:space="preserve">, J. M., and Nishitani, N. (2021). The role of flare-driven ionospheric electron density changes on the Doppler flash observed by SuperDARN HF radars. Journal of Geophysical Research: Space Physics, 126, e2021JA029300. </w:t>
+        <w:t xml:space="preserve">), pp. 43-48, </w:t>
       </w:r>
       <w:proofErr w:type="spellStart"/>
       <w:r>
@@ -4136,7 +4183,7 @@
           <w:sz w:val="18"/>
           <w:szCs w:val="18"/>
         </w:rPr>
-        <w:t>: 10.1029/2021JA029300</w:t>
+        <w:t>: 10.1109/WiSEE50203.2021.9613835</w:t>
       </w:r>
     </w:p>
     <w:p>
@@ -4153,7 +4200,7 @@
           <w:sz w:val="18"/>
           <w:szCs w:val="18"/>
         </w:rPr>
-        <w:t xml:space="preserve">Fiori, R.A.D., Chakraborty, S., Nikitina, L. (2022). Data-based optimization of a simple shortwave fadeout absorption model. Journal of Atmospheric and Solar-Terrestrial Physics. </w:t>
+        <w:t xml:space="preserve">Chakraborty, S., Qian, L., Ruohoniemi, J. M., Baker, J. B. H., </w:t>
       </w:r>
       <w:proofErr w:type="spellStart"/>
       <w:r>
@@ -4161,6 +4208,22 @@
           <w:sz w:val="18"/>
           <w:szCs w:val="18"/>
         </w:rPr>
+        <w:t>Mclnerney</w:t>
+      </w:r>
+      <w:proofErr w:type="spellEnd"/>
+      <w:r>
+        <w:rPr>
+          <w:sz w:val="18"/>
+          <w:szCs w:val="18"/>
+        </w:rPr>
+        <w:t xml:space="preserve">, J. M., and Nishitani, N. (2021). The role of flare-driven ionospheric electron density changes on the Doppler flash observed by SuperDARN HF radars. Journal of Geophysical Research: Space Physics, 126, e2021JA029300. </w:t>
+      </w:r>
+      <w:proofErr w:type="spellStart"/>
+      <w:r>
+        <w:rPr>
+          <w:sz w:val="18"/>
+          <w:szCs w:val="18"/>
+        </w:rPr>
         <w:t>doi</w:t>
       </w:r>
       <w:proofErr w:type="spellEnd"/>
@@ -4169,7 +4232,7 @@
           <w:sz w:val="18"/>
           <w:szCs w:val="18"/>
         </w:rPr>
-        <w:t>: 10.1016/j.jastp.2022.105843</w:t>
+        <w:t>: 10.1029/2021JA029300</w:t>
       </w:r>
     </w:p>
     <w:p>
@@ -4186,7 +4249,23 @@
           <w:sz w:val="18"/>
           <w:szCs w:val="18"/>
         </w:rPr>
-        <w:t>Chakraborty, S., Baker, J. B. H., Fiori, R. A. D., Ruohoniemi, J. M., and Zawdie, K. A. (2021). A modeling framework for estimating ionospheric HF absorption produced by solar flares. Radio Science, 56, e2021RS007285. doi:10.1029/2021RS007285</w:t>
+        <w:t xml:space="preserve">Fiori, R.A.D., Chakraborty, S., Nikitina, L. (2022). Data-based optimization of a simple shortwave fadeout absorption model. Journal of Atmospheric and Solar-Terrestrial Physics. </w:t>
+      </w:r>
+      <w:proofErr w:type="spellStart"/>
+      <w:r>
+        <w:rPr>
+          <w:sz w:val="18"/>
+          <w:szCs w:val="18"/>
+        </w:rPr>
+        <w:t>doi</w:t>
+      </w:r>
+      <w:proofErr w:type="spellEnd"/>
+      <w:r>
+        <w:rPr>
+          <w:sz w:val="18"/>
+          <w:szCs w:val="18"/>
+        </w:rPr>
+        <w:t>: 10.1016/j.jastp.2022.105843</w:t>
       </w:r>
     </w:p>
     <w:p>
@@ -4203,23 +4282,7 @@
           <w:sz w:val="18"/>
           <w:szCs w:val="18"/>
         </w:rPr>
-        <w:t xml:space="preserve">Chakraborty, S., Ruohoniemi, J. M., Baker, J. B. H., Fiori, R. A. D., Bailey, S. M., and Zawdie, K. A. (2021). Ionospheric Sluggishness: A Characteristic Time-Lag of the Ionospheric Response to Solar Flares. Journal of Geophysical Research: Space Physics, 126, e2020JA028813. </w:t>
-      </w:r>
-      <w:proofErr w:type="spellStart"/>
-      <w:r>
-        <w:rPr>
-          <w:sz w:val="18"/>
-          <w:szCs w:val="18"/>
-        </w:rPr>
-        <w:t>doi</w:t>
-      </w:r>
-      <w:proofErr w:type="spellEnd"/>
-      <w:r>
-        <w:rPr>
-          <w:sz w:val="18"/>
-          <w:szCs w:val="18"/>
-        </w:rPr>
-        <w:t>: 10.1029/2020JA028813</w:t>
+        <w:t>Chakraborty, S., Baker, J. B. H., Fiori, R. A. D., Ruohoniemi, J. M., and Zawdie, K. A. (2021). A modeling framework for estimating ionospheric HF absorption produced by solar flares. Radio Science, 56, e2021RS007285. doi:10.1029/2021RS007285</w:t>
       </w:r>
     </w:p>
     <w:p>
@@ -4236,7 +4299,7 @@
           <w:sz w:val="18"/>
           <w:szCs w:val="18"/>
         </w:rPr>
-        <w:t xml:space="preserve">Chakraborty, S. and Morley, S. K. (2020). Probabilistic Prediction of Geomagnetic Storms and the </w:t>
+        <w:t xml:space="preserve">Chakraborty, S., Ruohoniemi, J. M., Baker, J. B. H., Fiori, R. A. D., Bailey, S. M., and Zawdie, K. A. (2021). Ionospheric Sluggishness: A Characteristic Time-Lag of the Ionospheric Response to Solar Flares. Journal of Geophysical Research: Space Physics, 126, e2020JA028813. </w:t>
       </w:r>
       <w:proofErr w:type="spellStart"/>
       <w:r>
@@ -4244,7 +4307,7 @@
           <w:sz w:val="18"/>
           <w:szCs w:val="18"/>
         </w:rPr>
-        <w:t>Kp</w:t>
+        <w:t>doi</w:t>
       </w:r>
       <w:proofErr w:type="spellEnd"/>
       <w:r>
@@ -4252,23 +4315,7 @@
           <w:sz w:val="18"/>
           <w:szCs w:val="18"/>
         </w:rPr>
-        <w:t xml:space="preserve"> Index. Journal of Space Weather and Space Climate. doi:10.1051/</w:t>
-      </w:r>
-      <w:proofErr w:type="spellStart"/>
-      <w:r>
-        <w:rPr>
-          <w:sz w:val="18"/>
-          <w:szCs w:val="18"/>
-        </w:rPr>
-        <w:t>swsc</w:t>
-      </w:r>
-      <w:proofErr w:type="spellEnd"/>
-      <w:r>
-        <w:rPr>
-          <w:sz w:val="18"/>
-          <w:szCs w:val="18"/>
-        </w:rPr>
-        <w:t>/2020037</w:t>
+        <w:t>: 10.1029/2020JA028813</w:t>
       </w:r>
     </w:p>
     <w:p>
@@ -4285,7 +4332,7 @@
           <w:sz w:val="18"/>
           <w:szCs w:val="18"/>
         </w:rPr>
-        <w:t xml:space="preserve">Mukhopadhyay, A., Welling, D. T., </w:t>
+        <w:t xml:space="preserve">Chakraborty, S. and Morley, S. K. (2020). Probabilistic Prediction of Geomagnetic Storms and the </w:t>
       </w:r>
       <w:proofErr w:type="spellStart"/>
       <w:r>
@@ -4293,7 +4340,7 @@
           <w:sz w:val="18"/>
           <w:szCs w:val="18"/>
         </w:rPr>
-        <w:t>Liemohn</w:t>
+        <w:t>Kp</w:t>
       </w:r>
       <w:proofErr w:type="spellEnd"/>
       <w:r>
@@ -4301,7 +4348,23 @@
           <w:sz w:val="18"/>
           <w:szCs w:val="18"/>
         </w:rPr>
-        <w:t>, M. W., Ridley, A. J., Chakraborty, S., and Anderson, B. J. (2020). Conductance Model for Extreme Events: Impact of auroral conductance on space weather forecasts. Space Weather, 18, e2020SW002551. doi:10.1029/2020SW002551</w:t>
+        <w:t xml:space="preserve"> Index. Journal of Space Weather and Space Climate. doi:10.1051/</w:t>
+      </w:r>
+      <w:proofErr w:type="spellStart"/>
+      <w:r>
+        <w:rPr>
+          <w:sz w:val="18"/>
+          <w:szCs w:val="18"/>
+        </w:rPr>
+        <w:t>swsc</w:t>
+      </w:r>
+      <w:proofErr w:type="spellEnd"/>
+      <w:r>
+        <w:rPr>
+          <w:sz w:val="18"/>
+          <w:szCs w:val="18"/>
+        </w:rPr>
+        <w:t>/2020037</w:t>
       </w:r>
     </w:p>
     <w:p>
@@ -4318,7 +4381,7 @@
           <w:sz w:val="18"/>
           <w:szCs w:val="18"/>
         </w:rPr>
-        <w:t xml:space="preserve">Chakraborty, S., Baker, J. B. H., Ruohoniemi, J. M., </w:t>
+        <w:t xml:space="preserve">Mukhopadhyay, A., Welling, D. T., </w:t>
       </w:r>
       <w:proofErr w:type="spellStart"/>
       <w:r>
@@ -4326,7 +4389,7 @@
           <w:sz w:val="18"/>
           <w:szCs w:val="18"/>
         </w:rPr>
-        <w:t>Kunduri</w:t>
+        <w:t>Liemohn</w:t>
       </w:r>
       <w:proofErr w:type="spellEnd"/>
       <w:r>
@@ -4334,7 +4397,7 @@
           <w:sz w:val="18"/>
           <w:szCs w:val="18"/>
         </w:rPr>
-        <w:t>, B., Nishitani, N., and Shepherd, S. G. (2019). A Study of SuperDARN Response to Co-occurring Space Weather Phenomena. Space Weather, 17. doi:10.1029/2019SW002179</w:t>
+        <w:t>, M. W., Ridley, A. J., Chakraborty, S., and Anderson, B. J. (2020). Conductance Model for Extreme Events: Impact of auroral conductance on space weather forecasts. Space Weather, 18, e2020SW002551. doi:10.1029/2020SW002551</w:t>
       </w:r>
     </w:p>
     <w:p>
@@ -4351,7 +4414,23 @@
           <w:sz w:val="18"/>
           <w:szCs w:val="18"/>
         </w:rPr>
-        <w:t>Chakraborty, S., Ruohoniemi, J. M., Baker, J. B. H., and Nishitani, N. (2018). Characterization of short-wave fadeout seen in daytime SuperDARN ground scatter observations. Radio Science, 53, 472-484. doi:10.1002/2017RS006488</w:t>
+        <w:t xml:space="preserve">Chakraborty, S., Baker, J. B. H., Ruohoniemi, J. M., </w:t>
+      </w:r>
+      <w:proofErr w:type="spellStart"/>
+      <w:r>
+        <w:rPr>
+          <w:sz w:val="18"/>
+          <w:szCs w:val="18"/>
+        </w:rPr>
+        <w:t>Kunduri</w:t>
+      </w:r>
+      <w:proofErr w:type="spellEnd"/>
+      <w:r>
+        <w:rPr>
+          <w:sz w:val="18"/>
+          <w:szCs w:val="18"/>
+        </w:rPr>
+        <w:t>, B., Nishitani, N., and Shepherd, S. G. (2019). A Study of SuperDARN Response to Co-occurring Space Weather Phenomena. Space Weather, 17. doi:10.1029/2019SW002179</w:t>
       </w:r>
     </w:p>
     <w:p>
@@ -4368,51 +4447,8 @@
           <w:sz w:val="18"/>
           <w:szCs w:val="18"/>
         </w:rPr>
-        <w:t xml:space="preserve">Fiori, R. A. D., </w:t>
-      </w:r>
-      <w:proofErr w:type="spellStart"/>
-      <w:r>
-        <w:rPr>
-          <w:sz w:val="18"/>
-          <w:szCs w:val="18"/>
-        </w:rPr>
-        <w:t>Koustov</w:t>
-      </w:r>
-      <w:proofErr w:type="spellEnd"/>
-      <w:r>
-        <w:rPr>
-          <w:sz w:val="18"/>
-          <w:szCs w:val="18"/>
-        </w:rPr>
-        <w:t>, A. V., Chakraborty, S., Ruohoniemi, J. M., Danskin, D. W., Boteler, D. H., and Shepherd, S. G. (2018). Examining the Potential of the Super Dual Auroral Radar Network for Monitoring the Space Weather Impact of Solar X-Ray Flares. Space Weather, 16. doi:10.1029/2018SW001905</w:t>
-      </w:r>
-    </w:p>
-    <w:p>
-      <w:pPr>
-        <w:pBdr>
-          <w:left w:val="single" w:sz="24" w:space="8" w:color="C9A800"/>
-        </w:pBdr>
-        <w:spacing w:before="260" w:after="60"/>
-        <w:ind w:left="120"/>
-      </w:pPr>
-      <w:r>
-        <w:rPr>
-          <w:b/>
-          <w:bCs/>
-          <w:color w:val="003366"/>
-          <w:sz w:val="24"/>
-          <w:szCs w:val="24"/>
-        </w:rPr>
-        <w:t>CONFERENCE PAPERS</w:t>
-      </w:r>
-    </w:p>
-    <w:p>
-      <w:pPr>
-        <w:pBdr>
-          <w:bottom w:val="single" w:sz="4" w:space="1" w:color="003366"/>
-        </w:pBdr>
-        <w:spacing w:after="80"/>
-      </w:pPr>
+        <w:t>Chakraborty, S., Ruohoniemi, J. M., Baker, J. B. H., and Nishitani, N. (2018). Characterization of short-wave fadeout seen in daytime SuperDARN ground scatter observations. Radio Science, 53, 472-484. doi:10.1002/2017RS006488</w:t>
+      </w:r>
     </w:p>
     <w:p>
       <w:pPr>
@@ -4428,7 +4464,7 @@
           <w:sz w:val="18"/>
           <w:szCs w:val="18"/>
         </w:rPr>
-        <w:t xml:space="preserve">Chakraborty, S., Ruohoniemi, J. M., Baker, J. B. H., Fiori, R., Zawdie, K., Bailey, S., Nishitani, N., and Drob, D. et al. (2020). Sluggishness of the Ionosphere: Characteristic time-lag in Response to Solar Flares, 2020 </w:t>
+        <w:t xml:space="preserve">Fiori, R. A. D., </w:t>
       </w:r>
       <w:proofErr w:type="spellStart"/>
       <w:r>
@@ -4436,7 +4472,7 @@
           <w:sz w:val="18"/>
           <w:szCs w:val="18"/>
         </w:rPr>
-        <w:t>XXXIIIrd</w:t>
+        <w:t>Koustov</w:t>
       </w:r>
       <w:proofErr w:type="spellEnd"/>
       <w:r>
@@ -4444,24 +4480,35 @@
           <w:sz w:val="18"/>
           <w:szCs w:val="18"/>
         </w:rPr>
-        <w:t xml:space="preserve"> General Assembly and Scientific Symposium of the International Union of Radio Science, Rome, Italy, pp. 1-4, </w:t>
-      </w:r>
-      <w:proofErr w:type="spellStart"/>
-      <w:r>
-        <w:rPr>
-          <w:sz w:val="18"/>
-          <w:szCs w:val="18"/>
-        </w:rPr>
-        <w:t>doi</w:t>
-      </w:r>
-      <w:proofErr w:type="spellEnd"/>
-      <w:r>
-        <w:rPr>
-          <w:sz w:val="18"/>
-          <w:szCs w:val="18"/>
-        </w:rPr>
-        <w:t>: 10.23919/URSIGASS49373.2020.9232206</w:t>
-      </w:r>
+        <w:t>, A. V., Chakraborty, S., Ruohoniemi, J. M., Danskin, D. W., Boteler, D. H., and Shepherd, S. G. (2018). Examining the Potential of the Super Dual Auroral Radar Network for Monitoring the Space Weather Impact of Solar X-Ray Flares. Space Weather, 16. doi:10.1029/2018SW001905</w:t>
+      </w:r>
+    </w:p>
+    <w:p>
+      <w:pPr>
+        <w:pBdr>
+          <w:left w:val="single" w:sz="24" w:space="8" w:color="C9A800"/>
+        </w:pBdr>
+        <w:spacing w:before="260" w:after="60"/>
+        <w:ind w:left="120"/>
+      </w:pPr>
+      <w:r>
+        <w:rPr>
+          <w:b/>
+          <w:bCs/>
+          <w:color w:val="003366"/>
+          <w:sz w:val="24"/>
+          <w:szCs w:val="24"/>
+        </w:rPr>
+        <w:t>CONFERENCE PAPERS</w:t>
+      </w:r>
+    </w:p>
+    <w:p>
+      <w:pPr>
+        <w:pBdr>
+          <w:bottom w:val="single" w:sz="4" w:space="1" w:color="003366"/>
+        </w:pBdr>
+        <w:spacing w:after="80"/>
+      </w:pPr>
     </w:p>
     <w:p>
       <w:pPr>
@@ -4477,8 +4524,47 @@
           <w:sz w:val="18"/>
           <w:szCs w:val="18"/>
         </w:rPr>
+        <w:t xml:space="preserve">Chakraborty, S., Ruohoniemi, J. M., Baker, J. B. H., Fiori, R., Zawdie, K., Bailey, S., Nishitani, N., and Drob, D. et al. (2020). Sluggishness of the Ionosphere: Characteristic time-lag in Response to Solar Flares, 2020 </w:t>
+      </w:r>
+      <w:proofErr w:type="spellStart"/>
+      <w:r>
+        <w:rPr>
+          <w:sz w:val="18"/>
+          <w:szCs w:val="18"/>
+        </w:rPr>
+        <w:t>XXXIIIrd</w:t>
+      </w:r>
+      <w:proofErr w:type="spellEnd"/>
+      <w:r>
+        <w:rPr>
+          <w:sz w:val="18"/>
+          <w:szCs w:val="18"/>
+        </w:rPr>
+        <w:t xml:space="preserve"> General Assembly and </w:t>
+      </w:r>
+      <w:r>
+        <w:rPr>
+          <w:sz w:val="18"/>
+          <w:szCs w:val="18"/>
+        </w:rPr>
         <w:lastRenderedPageBreak/>
-        <w:t>Chakraborty, S., Mukherjee, U. (2015). Circular Micro-strip Antenna Modelling using FDTD method and Design using Genetic Algorithms. CALCON-2015, ID: EC20140700015</w:t>
+        <w:t xml:space="preserve">Scientific Symposium of the International Union of Radio Science, Rome, Italy, pp. 1-4, </w:t>
+      </w:r>
+      <w:proofErr w:type="spellStart"/>
+      <w:r>
+        <w:rPr>
+          <w:sz w:val="18"/>
+          <w:szCs w:val="18"/>
+        </w:rPr>
+        <w:t>doi</w:t>
+      </w:r>
+      <w:proofErr w:type="spellEnd"/>
+      <w:r>
+        <w:rPr>
+          <w:sz w:val="18"/>
+          <w:szCs w:val="18"/>
+        </w:rPr>
+        <w:t>: 10.23919/URSIGASS49373.2020.9232206</w:t>
       </w:r>
     </w:p>
     <w:p>
@@ -4495,7 +4581,7 @@
           <w:sz w:val="18"/>
           <w:szCs w:val="18"/>
         </w:rPr>
-        <w:t>Chakraborty, S., Mukherjee, U. (2014). Circular Micro-strip (Coax Feed) Antenna Modelling using FDTD Method and Design using Genetic Algorithms: A Comparative Study on Different Types of Design Techniques. ICCCT-2014, IEEE Digital Xplore. doi:10.1109/ICCCT.2014.7001514</w:t>
+        <w:t>Chakraborty, S., Mukherjee, U. (2015). Circular Micro-strip Antenna Modelling using FDTD method and Design using Genetic Algorithms. CALCON-2015, ID: EC20140700015</w:t>
       </w:r>
     </w:p>
     <w:p>
@@ -4512,7 +4598,7 @@
           <w:sz w:val="18"/>
           <w:szCs w:val="18"/>
         </w:rPr>
-        <w:t>Chakraborty, S., Mukherjee, U. (2011). Comparative Study of Micro-strip antennas designed by coaxial feed and line feed. ICCCT-2011, IEEE Digital Xplore. doi:10.1109/ICCCT.2011.6075196</w:t>
+        <w:t>Chakraborty, S., Mukherjee, U. (2014). Circular Micro-strip (Coax Feed) Antenna Modelling using FDTD Method and Design using Genetic Algorithms: A Comparative Study on Different Types of Design Techniques. ICCCT-2014, IEEE Digital Xplore. doi:10.1109/ICCCT.2014.7001514</w:t>
       </w:r>
     </w:p>
     <w:p>
@@ -4529,6 +4615,23 @@
           <w:sz w:val="18"/>
           <w:szCs w:val="18"/>
         </w:rPr>
+        <w:t>Chakraborty, S., Mukherjee, U. (2011). Comparative Study of Micro-strip antennas designed by coaxial feed and line feed. ICCCT-2011, IEEE Digital Xplore. doi:10.1109/ICCCT.2011.6075196</w:t>
+      </w:r>
+    </w:p>
+    <w:p>
+      <w:pPr>
+        <w:pStyle w:val="ListParagraph"/>
+        <w:numPr>
+          <w:ilvl w:val="0"/>
+          <w:numId w:val="2"/>
+        </w:numPr>
+        <w:spacing w:before="28" w:after="28"/>
+      </w:pPr>
+      <w:r>
+        <w:rPr>
+          <w:sz w:val="18"/>
+          <w:szCs w:val="18"/>
+        </w:rPr>
         <w:t>Chakraborty, S., Mukherjee, U. (2010). Micro-strip antenna optimization using genetic algorithms. ICCCT-2010, IEEE Digital Xplore. doi:10.1109/ICCCT.2011.6075196</w:t>
       </w:r>
     </w:p>
@@ -5053,6 +5156,7 @@
           <w:sz w:val="24"/>
           <w:szCs w:val="24"/>
         </w:rPr>
+        <w:lastRenderedPageBreak/>
         <w:t>INDUSTRIAL WORK EXPERIENCE</w:t>
       </w:r>
     </w:p>

</xml_diff>

<commit_message>
Update website: 2 file(s) changed — assets/pdf/Chakraborty.docx,assets/pdf/Chakraborty.pdf
</commit_message>
<xml_diff>
--- a/assets/pdf/Chakraborty.docx
+++ b/assets/pdf/Chakraborty.docx
@@ -77,61 +77,7 @@
                 <w:sz w:val="17"/>
                 <w:szCs w:val="17"/>
               </w:rPr>
-              <w:t xml:space="preserve">Space </w:t>
-            </w:r>
-            <w:proofErr w:type="gramStart"/>
-            <w:r>
-              <w:rPr>
-                <w:color w:val="9FBBDA"/>
-                <w:sz w:val="17"/>
-                <w:szCs w:val="17"/>
-              </w:rPr>
-              <w:t>Weather  ·</w:t>
-            </w:r>
-            <w:proofErr w:type="gramEnd"/>
-            <w:r>
-              <w:rPr>
-                <w:color w:val="9FBBDA"/>
-                <w:sz w:val="17"/>
-                <w:szCs w:val="17"/>
-              </w:rPr>
-              <w:t xml:space="preserve">  Ionospheric </w:t>
-            </w:r>
-            <w:proofErr w:type="gramStart"/>
-            <w:r>
-              <w:rPr>
-                <w:color w:val="9FBBDA"/>
-                <w:sz w:val="17"/>
-                <w:szCs w:val="17"/>
-              </w:rPr>
-              <w:t>Physics  ·</w:t>
-            </w:r>
-            <w:proofErr w:type="gramEnd"/>
-            <w:r>
-              <w:rPr>
-                <w:color w:val="9FBBDA"/>
-                <w:sz w:val="17"/>
-                <w:szCs w:val="17"/>
-              </w:rPr>
-              <w:t xml:space="preserve">  HF </w:t>
-            </w:r>
-            <w:proofErr w:type="gramStart"/>
-            <w:r>
-              <w:rPr>
-                <w:color w:val="9FBBDA"/>
-                <w:sz w:val="17"/>
-                <w:szCs w:val="17"/>
-              </w:rPr>
-              <w:t>Propagation  ·</w:t>
-            </w:r>
-            <w:proofErr w:type="gramEnd"/>
-            <w:r>
-              <w:rPr>
-                <w:color w:val="9FBBDA"/>
-                <w:sz w:val="17"/>
-                <w:szCs w:val="17"/>
-              </w:rPr>
-              <w:t xml:space="preserve">  ML/AI</w:t>
+              <w:t>Space Weather  ·  Ionospheric Physics  ·  HF Propagation  ·  ML/AI</w:t>
             </w:r>
           </w:p>
         </w:tc>
@@ -1904,17 +1850,8 @@
                 <w:sz w:val="19"/>
                 <w:szCs w:val="19"/>
               </w:rPr>
-              <w:t>IEEE/</w:t>
-            </w:r>
-            <w:proofErr w:type="spellStart"/>
-            <w:r>
-              <w:rPr>
-                <w:sz w:val="19"/>
-                <w:szCs w:val="19"/>
-              </w:rPr>
-              <w:t>WiSEE</w:t>
-            </w:r>
-            <w:proofErr w:type="spellEnd"/>
+              <w:t>IEEE/WiSEE</w:t>
+            </w:r>
           </w:p>
         </w:tc>
         <w:tc>
@@ -2297,23 +2234,7 @@
                 <w:sz w:val="19"/>
                 <w:szCs w:val="19"/>
               </w:rPr>
-              <w:t>Won 'Electronically Yours' event in category '</w:t>
-            </w:r>
-            <w:proofErr w:type="spellStart"/>
-            <w:r>
-              <w:rPr>
-                <w:sz w:val="19"/>
-                <w:szCs w:val="19"/>
-              </w:rPr>
-              <w:t>Newron</w:t>
-            </w:r>
-            <w:proofErr w:type="spellEnd"/>
-            <w:r>
-              <w:rPr>
-                <w:sz w:val="19"/>
-                <w:szCs w:val="19"/>
-              </w:rPr>
-              <w:t>'</w:t>
+              <w:t>Won 'Electronically Yours' event in category 'Newron'</w:t>
             </w:r>
           </w:p>
         </w:tc>
@@ -3254,41 +3175,8 @@
           <w:sz w:val="18"/>
           <w:szCs w:val="18"/>
         </w:rPr>
-        <w:t xml:space="preserve">Chakraborty, S., Bullett, T., </w:t>
-      </w:r>
-      <w:proofErr w:type="spellStart"/>
-      <w:r>
-        <w:rPr>
-          <w:sz w:val="18"/>
-          <w:szCs w:val="18"/>
-        </w:rPr>
-        <w:t>Barjatya</w:t>
-      </w:r>
-      <w:proofErr w:type="spellEnd"/>
-      <w:r>
-        <w:rPr>
-          <w:sz w:val="18"/>
-          <w:szCs w:val="18"/>
-        </w:rPr>
-        <w:t xml:space="preserve">, A., &amp; Mabie, J. (2026). </w:t>
-      </w:r>
-      <w:proofErr w:type="spellStart"/>
-      <w:r>
-        <w:rPr>
-          <w:sz w:val="18"/>
-          <w:szCs w:val="18"/>
-        </w:rPr>
-        <w:t>pynasonde</w:t>
-      </w:r>
-      <w:proofErr w:type="spellEnd"/>
-      <w:r>
-        <w:rPr>
-          <w:sz w:val="18"/>
-          <w:szCs w:val="18"/>
-        </w:rPr>
-        <w:t xml:space="preserve">: An open-source Python library for ionosonde data processing. </w:t>
-      </w:r>
-      <w:proofErr w:type="spellStart"/>
+        <w:t xml:space="preserve">Chakraborty, S., Bullett, T., Barjatya, A., &amp; Mabie, J. (2026). pynasonde: An open-source Python library for ionosonde data processing. </w:t>
+      </w:r>
       <w:r>
         <w:rPr>
           <w:i/>
@@ -3298,7 +3186,6 @@
         </w:rPr>
         <w:t>SoftwareX</w:t>
       </w:r>
-      <w:proofErr w:type="spellEnd"/>
       <w:r>
         <w:rPr>
           <w:sz w:val="18"/>
@@ -3361,38 +3248,17 @@
           <w:numId w:val="2"/>
         </w:numPr>
         <w:spacing w:before="28" w:after="28"/>
-      </w:pPr>
-      <w:proofErr w:type="spellStart"/>
-      <w:r>
         <w:rPr>
           <w:sz w:val="18"/>
           <w:szCs w:val="18"/>
         </w:rPr>
-        <w:t>Inchin</w:t>
-      </w:r>
-      <w:proofErr w:type="spellEnd"/>
+      </w:pPr>
       <w:r>
         <w:rPr>
           <w:sz w:val="18"/>
           <w:szCs w:val="18"/>
         </w:rPr>
-        <w:t xml:space="preserve">, P. A., Heale, C., Zettergren, M. D., Bergsson, B., </w:t>
-      </w:r>
-      <w:proofErr w:type="spellStart"/>
-      <w:r>
-        <w:rPr>
-          <w:sz w:val="18"/>
-          <w:szCs w:val="18"/>
-        </w:rPr>
-        <w:t>Debchoudhury</w:t>
-      </w:r>
-      <w:proofErr w:type="spellEnd"/>
-      <w:r>
-        <w:rPr>
-          <w:sz w:val="18"/>
-          <w:szCs w:val="18"/>
-        </w:rPr>
-        <w:t>, S., &amp; Chakraborty, S. (2025). Severe weather-generated acoustic and gravity wave impacts on the ionosphere: A model-guided case study. Journal of Geophysical Research: Space Physics, 130, e2025JA034012. https://doi.org/10.1029/2025JA034012</w:t>
+        <w:t>Chakraborty, S., Nishitani, N., Shi, X., Ponomarenko, P., Ruohoniemi, J. M., Baker, J. B. H., Coster, A. J., &amp; Häggström, I. (2025). Solar Flare-Induced Gradient Drift Instability Observed by SuperDARN HF Radars. Journal of Geophysical Research: Space Physics, 130(10), e2025JA033824.</w:t>
       </w:r>
     </w:p>
     <w:p>
@@ -3403,29 +3269,17 @@
           <w:numId w:val="2"/>
         </w:numPr>
         <w:spacing w:before="28" w:after="28"/>
-      </w:pPr>
-      <w:r>
         <w:rPr>
           <w:sz w:val="18"/>
           <w:szCs w:val="18"/>
         </w:rPr>
-        <w:t xml:space="preserve">Prikryl, P., </w:t>
-      </w:r>
-      <w:proofErr w:type="spellStart"/>
+      </w:pPr>
       <w:r>
         <w:rPr>
           <w:sz w:val="18"/>
           <w:szCs w:val="18"/>
         </w:rPr>
-        <w:t>Themens</w:t>
-      </w:r>
-      <w:proofErr w:type="spellEnd"/>
-      <w:r>
-        <w:rPr>
-          <w:sz w:val="18"/>
-          <w:szCs w:val="18"/>
-        </w:rPr>
-        <w:t>, D. R., Chum, J., Chakraborty, S., Gillies, R. G., and Weygand, J. M. (2025). Observations of traveling ionospheric disturbances driven by gravity waves from sources in the upper and lower atmosphere. Ann. Geophys., 43, 511-534, https://doi.org/10.5194/angeo-43-511-2025</w:t>
+        <w:t>Bergsson, B., Debchoudhury, S., Inchin, P., Heale, C., Chakraborty, S., &amp; Zettergren, M. (2025). The Impact of Receiver-Satellite Line-of-Sight Orientation on GNSS TEC Observations of TIDs Induced by Gravity Waves From Convective Sources. Journal of Geophysical Research: Space Physics, 130(9), e2025JA033938.</w:t>
       </w:r>
     </w:p>
     <w:p>
@@ -3442,23 +3296,7 @@
           <w:sz w:val="18"/>
           <w:szCs w:val="18"/>
         </w:rPr>
-        <w:t xml:space="preserve">Chakraborty, S., Qian, L., Mrak, S., Mabie, J., Goncharenko, L., </w:t>
-      </w:r>
-      <w:proofErr w:type="spellStart"/>
-      <w:r>
-        <w:rPr>
-          <w:sz w:val="18"/>
-          <w:szCs w:val="18"/>
-        </w:rPr>
-        <w:t>Mclnerney</w:t>
-      </w:r>
-      <w:proofErr w:type="spellEnd"/>
-      <w:r>
-        <w:rPr>
-          <w:sz w:val="18"/>
-          <w:szCs w:val="18"/>
-        </w:rPr>
-        <w:t>, J. M., &amp; Bullett, T. (2025). Formation of the ionospheric G-condition following the 2017 Great American Eclipse. Earth and Space Science, 12, e2024EA004007. https://doi.org/10.1029/2024EA004007</w:t>
+        <w:t>Inchin, P. A., Heale, C., Zettergren, M. D., Bergsson, B., Debchoudhury, S., &amp; Chakraborty, S. (2025). Severe weather-generated acoustic and gravity wave impacts on the ionosphere: A model-guided case study. Journal of Geophysical Research: Space Physics, 130, e2025JA034012. https://doi.org/10.1029/2025JA034012</w:t>
       </w:r>
     </w:p>
     <w:p>
@@ -3475,23 +3313,7 @@
           <w:sz w:val="18"/>
           <w:szCs w:val="18"/>
         </w:rPr>
-        <w:t xml:space="preserve">Oberheide, J., Aggarwal, D., Bergsson, B., Chakraborty, S. et al. (2025). Impact of Terrestrial Weather on the Space Weather of the Ionosphere-Thermosphere: Initial Results from a NASA Living with a Star Focused Science Topic. </w:t>
-      </w:r>
-      <w:proofErr w:type="spellStart"/>
-      <w:r>
-        <w:rPr>
-          <w:sz w:val="18"/>
-          <w:szCs w:val="18"/>
-        </w:rPr>
-        <w:t>Surv</w:t>
-      </w:r>
-      <w:proofErr w:type="spellEnd"/>
-      <w:r>
-        <w:rPr>
-          <w:sz w:val="18"/>
-          <w:szCs w:val="18"/>
-        </w:rPr>
-        <w:t xml:space="preserve"> Geophys. https://doi.org/10.1007/s10712-025-09895-7</w:t>
+        <w:t>Prikryl, P., Themens, D. R., Chum, J., Chakraborty, S., Gillies, R. G., and Weygand, J. M. (2025). Observations of traveling ionospheric disturbances driven by gravity waves from sources in the upper and lower atmosphere. Ann. Geophys., 43, 511-534, https://doi.org/10.5194/angeo-43-511-2025</w:t>
       </w:r>
     </w:p>
     <w:p>
@@ -3508,7 +3330,7 @@
           <w:sz w:val="18"/>
           <w:szCs w:val="18"/>
         </w:rPr>
-        <w:t>Rout, D., Kumar, A., Singh, R., Patra, S., Karan, D. K., Chakraborty, S., et al. (2024). Evidence of unusually strong equatorial ionization anomaly at three local time sectors during the Mother's Day geomagnetic storm on 10-11 May 2024. Geophysical Research Letters, 52, e2024GL111269. https://doi.org/10.1029/2024GL111269</w:t>
+        <w:t>Chakraborty, S., Qian, L., Mrak, S., Mabie, J., Goncharenko, L., Mclnerney, J. M., &amp; Bullett, T. (2025). Formation of the ionospheric G-condition following the 2017 Great American Eclipse. Earth and Space Science, 12, e2024EA004007. https://doi.org/10.1029/2024EA004007</w:t>
       </w:r>
     </w:p>
     <w:p>
@@ -3525,7 +3347,7 @@
           <w:sz w:val="18"/>
           <w:szCs w:val="18"/>
         </w:rPr>
-        <w:t>Shi, X., Chakraborty, S., Baker, J. B. H., Hartinger, M. D., Wang, W., Ruohoniemi, J. M., et al. (2025). Statistical characterization of joule heating associated with ionospheric ULF perturbations using SuperDARN data. Journal of Geophysical Research: Space Physics, 130, e2024JA033452. https://doi.org/10.1029/2024JA033452</w:t>
+        <w:t>Oberheide, J., Aggarwal, D., Bergsson, B., Chakraborty, S. et al. (2025). Impact of Terrestrial Weather on the Space Weather of the Ionosphere-Thermosphere: Initial Results from a NASA Living with a Star Focused Science Topic. Surv Geophys. https://doi.org/10.1007/s10712-025-09895-7</w:t>
       </w:r>
     </w:p>
     <w:p>
@@ -3542,7 +3364,21 @@
           <w:sz w:val="18"/>
           <w:szCs w:val="18"/>
         </w:rPr>
-        <w:t>Liu, X., Zhang, D., Coster, A. J., Xu, Z., Shi, X., &amp; Chakraborty, S. (2024). The morphology and oscillations of nightside mid-latitude ionospheric trough at designated longitudes in the Northern Hemisphere. Journal of Geophysical Research: Space Physics, 129, e2024JA032864. https://doi.org/10.1029/2024JA032864</w:t>
+        <w:t>Rout, D., Kumar, A., Singh, R., Patra, S., Karan, D. K., Chakraborty, S., et al. (202</w:t>
+      </w:r>
+      <w:r>
+        <w:rPr>
+          <w:sz w:val="18"/>
+          <w:szCs w:val="18"/>
+        </w:rPr>
+        <w:t>5</w:t>
+      </w:r>
+      <w:r>
+        <w:rPr>
+          <w:sz w:val="18"/>
+          <w:szCs w:val="18"/>
+        </w:rPr>
+        <w:t>). Evidence of unusually strong equatorial ionization anomaly at three local time sectors during the Mother's Day geomagnetic storm on 10-11 May 2024. Geophysical Research Letters, 52, e2024GL111269. https://doi.org/10.1029/2024GL111269</w:t>
       </w:r>
     </w:p>
     <w:p>
@@ -3554,37 +3390,12 @@
         </w:numPr>
         <w:spacing w:before="28" w:after="28"/>
       </w:pPr>
-      <w:proofErr w:type="spellStart"/>
       <w:r>
         <w:rPr>
           <w:sz w:val="18"/>
           <w:szCs w:val="18"/>
         </w:rPr>
-        <w:t>Inchin</w:t>
-      </w:r>
-      <w:proofErr w:type="spellEnd"/>
-      <w:r>
-        <w:rPr>
-          <w:sz w:val="18"/>
-          <w:szCs w:val="18"/>
-        </w:rPr>
-        <w:t xml:space="preserve">, P. A., Bhatt, A., Bramberger, M., Chakraborty, S., </w:t>
-      </w:r>
-      <w:proofErr w:type="spellStart"/>
-      <w:r>
-        <w:rPr>
-          <w:sz w:val="18"/>
-          <w:szCs w:val="18"/>
-        </w:rPr>
-        <w:t>Debchoudhury</w:t>
-      </w:r>
-      <w:proofErr w:type="spellEnd"/>
-      <w:r>
-        <w:rPr>
-          <w:sz w:val="18"/>
-          <w:szCs w:val="18"/>
-        </w:rPr>
-        <w:t>, S., &amp; Heale, C. (2024). Atmospheric and ionospheric responses to orographic gravity waves prior to the December 2022 cold air outbreak. Journal of Geophysical Research: Space Physics, 129, e2024JA032485. https://doi.org/10.1029/2024JA032485</w:t>
+        <w:t>Shi, X., Chakraborty, S., Baker, J. B. H., Hartinger, M. D., Wang, W., Ruohoniemi, J. M., et al. (2025). Statistical characterization of joule heating associated with ionospheric ULF perturbations using SuperDARN data. Journal of Geophysical Research: Space Physics, 130, e2024JA033452. https://doi.org/10.1029/2024JA033452</w:t>
       </w:r>
     </w:p>
     <w:p>
@@ -3596,53 +3407,12 @@
         </w:numPr>
         <w:spacing w:before="28" w:after="28"/>
       </w:pPr>
-      <w:proofErr w:type="spellStart"/>
       <w:r>
         <w:rPr>
           <w:sz w:val="18"/>
           <w:szCs w:val="18"/>
         </w:rPr>
-        <w:t>Gowtam</w:t>
-      </w:r>
-      <w:proofErr w:type="spellEnd"/>
-      <w:r>
-        <w:rPr>
-          <w:sz w:val="18"/>
-          <w:szCs w:val="18"/>
-        </w:rPr>
-        <w:t xml:space="preserve">, V. S., Connor, H., </w:t>
-      </w:r>
-      <w:proofErr w:type="spellStart"/>
-      <w:r>
-        <w:rPr>
-          <w:sz w:val="18"/>
-          <w:szCs w:val="18"/>
-        </w:rPr>
-        <w:t>Kunduri</w:t>
-      </w:r>
-      <w:proofErr w:type="spellEnd"/>
-      <w:r>
-        <w:rPr>
-          <w:sz w:val="18"/>
-          <w:szCs w:val="18"/>
-        </w:rPr>
-        <w:t xml:space="preserve">, B. S. R., Raeder, J., Laundal, K. M., Tulasi Ram, S., Chakraborty S., et al. (2024). Calculating </w:t>
-      </w:r>
-      <w:proofErr w:type="gramStart"/>
-      <w:r>
-        <w:rPr>
-          <w:sz w:val="18"/>
-          <w:szCs w:val="18"/>
-        </w:rPr>
-        <w:t>the high</w:t>
-      </w:r>
-      <w:proofErr w:type="gramEnd"/>
-      <w:r>
-        <w:rPr>
-          <w:sz w:val="18"/>
-          <w:szCs w:val="18"/>
-        </w:rPr>
-        <w:t>-latitude ionospheric electrodynamics using a machine learning-based field-aligned current model. Space Weather, 22, e2023SW003683. https://doi.org/10.1029/2023SW003683</w:t>
+        <w:t>Liu, X., Zhang, D., Coster, A. J., Xu, Z., Shi, X., &amp; Chakraborty, S. (2024). The morphology and oscillations of nightside mid-latitude ionospheric trough at designated longitudes in the Northern Hemisphere. Journal of Geophysical Research: Space Physics, 129, e2024JA032864. https://doi.org/10.1029/2024JA032864</w:t>
       </w:r>
     </w:p>
     <w:p>
@@ -3660,7 +3430,7 @@
           <w:szCs w:val="18"/>
         </w:rPr>
         <w:lastRenderedPageBreak/>
-        <w:t>Boteler, D. H., Chakraborty, S., Shi, X., Hartinger, M. D., &amp; Wang, X. (2024). An examination of geomagnetic induction in submarine cables. Space Weather, 22, e2023SW003687. https://doi.org/10.1029/2023SW003687</w:t>
+        <w:t>Inchin, P. A., Bhatt, A., Bramberger, M., Chakraborty, S., Debchoudhury, S., &amp; Heale, C. (2024). Atmospheric and ionospheric responses to orographic gravity waves prior to the December 2022 cold air outbreak. Journal of Geophysical Research: Space Physics, 129, e2024JA032485. https://doi.org/10.1029/2024JA032485</w:t>
       </w:r>
     </w:p>
     <w:p>
@@ -3677,7 +3447,7 @@
           <w:sz w:val="18"/>
           <w:szCs w:val="18"/>
         </w:rPr>
-        <w:t>Coyle, S. E., Baker, J. B. H., Chakraborty, S., Hartinger, M. D., Freeman, M. P., Clauer, C. R., et al. (2023). Substorms and solar eclipses: A mutual information-based study. Geophysical Research Letters, 50, e2023GL106432. https://doi.org/10.1029/2023GL106432</w:t>
+        <w:t>Gowtam, V. S., Connor, H., Kunduri, B. S. R., Raeder, J., Laundal, K. M., Tulasi Ram, S., Chakraborty S., et al. (2024). Calculating the high-latitude ionospheric electrodynamics using a machine learning-based field-aligned current model. Space Weather, 22, e2023SW003683. https://doi.org/10.1029/2023SW003683</w:t>
       </w:r>
     </w:p>
     <w:p>
@@ -3694,55 +3464,7 @@
           <w:sz w:val="18"/>
           <w:szCs w:val="18"/>
         </w:rPr>
-        <w:t xml:space="preserve">Reiss, M. A., </w:t>
-      </w:r>
-      <w:proofErr w:type="spellStart"/>
-      <w:r>
-        <w:rPr>
-          <w:sz w:val="18"/>
-          <w:szCs w:val="18"/>
-        </w:rPr>
-        <w:t>Muglach</w:t>
-      </w:r>
-      <w:proofErr w:type="spellEnd"/>
-      <w:r>
-        <w:rPr>
-          <w:sz w:val="18"/>
-          <w:szCs w:val="18"/>
-        </w:rPr>
-        <w:t xml:space="preserve">, K., Mason, E., Davies, E. E., Chakraborty, S., </w:t>
-      </w:r>
-      <w:proofErr w:type="spellStart"/>
-      <w:r>
-        <w:rPr>
-          <w:sz w:val="18"/>
-          <w:szCs w:val="18"/>
-        </w:rPr>
-        <w:t>Delouille</w:t>
-      </w:r>
-      <w:proofErr w:type="spellEnd"/>
-      <w:r>
-        <w:rPr>
-          <w:sz w:val="18"/>
-          <w:szCs w:val="18"/>
-        </w:rPr>
-        <w:t xml:space="preserve">, V., ... &amp; </w:t>
-      </w:r>
-      <w:proofErr w:type="spellStart"/>
-      <w:r>
-        <w:rPr>
-          <w:sz w:val="18"/>
-          <w:szCs w:val="18"/>
-        </w:rPr>
-        <w:t>Veronig</w:t>
-      </w:r>
-      <w:proofErr w:type="spellEnd"/>
-      <w:r>
-        <w:rPr>
-          <w:sz w:val="18"/>
-          <w:szCs w:val="18"/>
-        </w:rPr>
-        <w:t>, A. (2023). A Community Dataset for Comparing Automated Coronal Hole Detection Schemes. Astrophysical Journal Supplement. https://ore.exeter.ac.uk/repository/handle/10871/134745</w:t>
+        <w:t>Boteler, D. H., Chakraborty, S., Shi, X., Hartinger, M. D., &amp; Wang, X. (2024). An examination of geomagnetic induction in submarine cables. Space Weather, 22, e2023SW003687. https://doi.org/10.1029/2023SW003687</w:t>
       </w:r>
     </w:p>
     <w:p>
@@ -3759,23 +3481,7 @@
           <w:sz w:val="18"/>
           <w:szCs w:val="18"/>
         </w:rPr>
-        <w:t xml:space="preserve">Boteler, D., Chakraborty, S., Shi, X., Hartinger, M. and Wang, X. (2023). Transmission Line Modelling of Geomagnetic Induction in the Ocean/Earth Conductivity Structure. International Journal of Geosciences, 14, 767-791. </w:t>
-      </w:r>
-      <w:proofErr w:type="spellStart"/>
-      <w:r>
-        <w:rPr>
-          <w:sz w:val="18"/>
-          <w:szCs w:val="18"/>
-        </w:rPr>
-        <w:t>doi</w:t>
-      </w:r>
-      <w:proofErr w:type="spellEnd"/>
-      <w:r>
-        <w:rPr>
-          <w:sz w:val="18"/>
-          <w:szCs w:val="18"/>
-        </w:rPr>
-        <w:t>: 10.4236/ijg.2023.148041</w:t>
+        <w:t>Coyle, S. E., Baker, J. B. H., Chakraborty, S., Hartinger, M. D., Freeman, M. P., Clauer, C. R., et al. (2023). Substorms and solar eclipses: A mutual information-based study. Geophysical Research Letters, 50, e2023GL106432. https://doi.org/10.1029/2023GL106432</w:t>
       </w:r>
     </w:p>
     <w:p>
@@ -3792,23 +3498,7 @@
           <w:sz w:val="18"/>
           <w:szCs w:val="18"/>
         </w:rPr>
-        <w:t xml:space="preserve">Rout, D., Patra, S., Kumar, S., Chakrabarty, D., Reeves, G. D., Stolle, C., Pandey, K., Chakraborty, S., Spencer E. A. (2023). The growth of ring current/SYM-H under northward IMF </w:t>
-      </w:r>
-      <w:proofErr w:type="spellStart"/>
-      <w:r>
-        <w:rPr>
-          <w:sz w:val="18"/>
-          <w:szCs w:val="18"/>
-        </w:rPr>
-        <w:t>Bz</w:t>
-      </w:r>
-      <w:proofErr w:type="spellEnd"/>
-      <w:r>
-        <w:rPr>
-          <w:sz w:val="18"/>
-          <w:szCs w:val="18"/>
-        </w:rPr>
-        <w:t xml:space="preserve"> conditions present during the 21-22 January 2005 geomagnetic storm. Space Weather, 21, e2023SW003489. https://doi.org/10.1029/2023SW003489</w:t>
+        <w:t>Reiss, M. A., Muglach, K., Mason, E., Davies, E. E., Chakraborty, S., Delouille, V., ... &amp; Veronig, A. (2023). A Community Dataset for Comparing Automated Coronal Hole Detection Schemes. Astrophysical Journal Supplement. https://ore.exeter.ac.uk/repository/handle/10871/134745</w:t>
       </w:r>
     </w:p>
     <w:p>
@@ -3825,23 +3515,7 @@
           <w:sz w:val="18"/>
           <w:szCs w:val="18"/>
         </w:rPr>
-        <w:t xml:space="preserve">Liu, J., Chakraborty, S., Chen, X., Wang, Z., He, F., Hu, Z., et al. (2023). Transient response of polar-cusp ionosphere to an interplanetary shock. Journal of Geophysical Research: Space Physics, 128, e2022JA030565. </w:t>
-      </w:r>
-      <w:proofErr w:type="spellStart"/>
-      <w:r>
-        <w:rPr>
-          <w:sz w:val="18"/>
-          <w:szCs w:val="18"/>
-        </w:rPr>
-        <w:t>doi</w:t>
-      </w:r>
-      <w:proofErr w:type="spellEnd"/>
-      <w:r>
-        <w:rPr>
-          <w:sz w:val="18"/>
-          <w:szCs w:val="18"/>
-        </w:rPr>
-        <w:t>: 10.1029/2022JA030565</w:t>
+        <w:t>Boteler, D., Chakraborty, S., Shi, X., Hartinger, M. and Wang, X. (2023). Transmission Line Modelling of Geomagnetic Induction in the Ocean/Earth Conductivity Structure. International Journal of Geosciences, 14, 767-791. doi: 10.4236/ijg.2023.148041</w:t>
       </w:r>
     </w:p>
     <w:p>
@@ -3858,71 +3532,7 @@
           <w:sz w:val="18"/>
           <w:szCs w:val="18"/>
         </w:rPr>
-        <w:t xml:space="preserve">Collins, K., Gibbons, J., Frissell, N., </w:t>
-      </w:r>
-      <w:proofErr w:type="spellStart"/>
-      <w:r>
-        <w:rPr>
-          <w:sz w:val="18"/>
-          <w:szCs w:val="18"/>
-        </w:rPr>
-        <w:t>Montare</w:t>
-      </w:r>
-      <w:proofErr w:type="spellEnd"/>
-      <w:r>
-        <w:rPr>
-          <w:sz w:val="18"/>
-          <w:szCs w:val="18"/>
-        </w:rPr>
-        <w:t xml:space="preserve">, A., </w:t>
-      </w:r>
-      <w:proofErr w:type="spellStart"/>
-      <w:r>
-        <w:rPr>
-          <w:sz w:val="18"/>
-          <w:szCs w:val="18"/>
-        </w:rPr>
-        <w:t>Kazdan</w:t>
-      </w:r>
-      <w:proofErr w:type="spellEnd"/>
-      <w:r>
-        <w:rPr>
-          <w:sz w:val="18"/>
-          <w:szCs w:val="18"/>
-        </w:rPr>
-        <w:t xml:space="preserve">, D., Kalmbach, D., Swartz, D., Benedict, R., Romanek, V., Boedicker, R., Liles, W., Engelke, W., McGaw, D. G., Farmer, J., </w:t>
-      </w:r>
-      <w:proofErr w:type="spellStart"/>
-      <w:r>
-        <w:rPr>
-          <w:sz w:val="18"/>
-          <w:szCs w:val="18"/>
-        </w:rPr>
-        <w:t>Mikitin</w:t>
-      </w:r>
-      <w:proofErr w:type="spellEnd"/>
-      <w:r>
-        <w:rPr>
-          <w:sz w:val="18"/>
-          <w:szCs w:val="18"/>
-        </w:rPr>
-        <w:t xml:space="preserve">, G., Hobart, J., Kavanagh, G., and Chakraborty, S. (2023). Crowdsourced Doppler measurements of time standard stations </w:t>
-      </w:r>
-      <w:proofErr w:type="gramStart"/>
-      <w:r>
-        <w:rPr>
-          <w:sz w:val="18"/>
-          <w:szCs w:val="18"/>
-        </w:rPr>
-        <w:t>demonstrating</w:t>
-      </w:r>
-      <w:proofErr w:type="gramEnd"/>
-      <w:r>
-        <w:rPr>
-          <w:sz w:val="18"/>
-          <w:szCs w:val="18"/>
-        </w:rPr>
-        <w:t xml:space="preserve"> ionospheric variability. Earth Syst. Sci. Data, 15, 1403-1418, doi:10.5194/essd-15-1403-2023</w:t>
+        <w:t>Rout, D., Patra, S., Kumar, S., Chakrabarty, D., Reeves, G. D., Stolle, C., Pandey, K., Chakraborty, S., Spencer E. A. (2023). The growth of ring current/SYM-H under northward IMF Bz conditions present during the 21-22 January 2005 geomagnetic storm. Space Weather, 21, e2023SW003489. https://doi.org/10.1029/2023SW003489</w:t>
       </w:r>
     </w:p>
     <w:p>
@@ -3939,23 +3549,7 @@
           <w:sz w:val="18"/>
           <w:szCs w:val="18"/>
         </w:rPr>
-        <w:t xml:space="preserve">Chakraborty, S., Boteler DH, Shi X, Murphy BS, Hartinger MD, Wang X, Lucas G and Baker JBH (2022). Modeling geomagnetic induction in submarine cables. Front. Phys. 10:1022475. </w:t>
-      </w:r>
-      <w:proofErr w:type="spellStart"/>
-      <w:r>
-        <w:rPr>
-          <w:sz w:val="18"/>
-          <w:szCs w:val="18"/>
-        </w:rPr>
-        <w:t>doi</w:t>
-      </w:r>
-      <w:proofErr w:type="spellEnd"/>
-      <w:r>
-        <w:rPr>
-          <w:sz w:val="18"/>
-          <w:szCs w:val="18"/>
-        </w:rPr>
-        <w:t>: 10.3389/fphy.2022.1022475</w:t>
+        <w:t>Liu, J., Chakraborty, S., Chen, X., Wang, Z., He, F., Hu, Z., et al. (2023). Transient response of polar-cusp ionosphere to an interplanetary shock. Journal of Geophysical Research: Space Physics, 128, e2022JA030565. doi: 10.1029/2022JA030565</w:t>
       </w:r>
     </w:p>
     <w:p>
@@ -3972,39 +3566,7 @@
           <w:sz w:val="18"/>
           <w:szCs w:val="18"/>
         </w:rPr>
-        <w:t xml:space="preserve">Prikryl, P., Gillies, R. G., </w:t>
-      </w:r>
-      <w:proofErr w:type="spellStart"/>
-      <w:r>
-        <w:rPr>
-          <w:sz w:val="18"/>
-          <w:szCs w:val="18"/>
-        </w:rPr>
-        <w:t>Themens</w:t>
-      </w:r>
-      <w:proofErr w:type="spellEnd"/>
-      <w:r>
-        <w:rPr>
-          <w:sz w:val="18"/>
-          <w:szCs w:val="18"/>
-        </w:rPr>
-        <w:t xml:space="preserve">, D. R., Weygand, J. M., Thomas, E. G., and Chakraborty, S. (2022). Multi-instrument observations of polar cap patches and traveling ionospheric disturbances generated by solar wind Alfven waves coupling to the dayside magnetosphere. Ann. Geophys., 40, 619-639, </w:t>
-      </w:r>
-      <w:proofErr w:type="spellStart"/>
-      <w:r>
-        <w:rPr>
-          <w:sz w:val="18"/>
-          <w:szCs w:val="18"/>
-        </w:rPr>
-        <w:t>doi</w:t>
-      </w:r>
-      <w:proofErr w:type="spellEnd"/>
-      <w:r>
-        <w:rPr>
-          <w:sz w:val="18"/>
-          <w:szCs w:val="18"/>
-        </w:rPr>
-        <w:t>: 10.5194/angeo-40-619-2022</w:t>
+        <w:t>Collins, K., Gibbons, J., Frissell, N., Montare, A., Kazdan, D., Kalmbach, D., Swartz, D., Benedict, R., Romanek, V., Boedicker, R., Liles, W., Engelke, W., McGaw, D. G., Farmer, J., Mikitin, G., Hobart, J., Kavanagh, G., and Chakraborty, S. (2023). Crowdsourced Doppler measurements of time standard stations demonstrating ionospheric variability. Earth Syst. Sci. Data, 15, 1403-1418, doi:10.5194/essd-15-1403-2023</w:t>
       </w:r>
     </w:p>
     <w:p>
@@ -4021,23 +3583,7 @@
           <w:sz w:val="18"/>
           <w:szCs w:val="18"/>
         </w:rPr>
-        <w:t xml:space="preserve">Chakraborty, S., Qian, L., Baker, J. B. H., Ruohoniemi, J. M., Kuyeng, K., and Mclnerney, J. M. (2022). Driving influences of the Doppler flash observed by SuperDARN HF radars in response to solar flares. Journal of Geophysical Research: Space Physics, 127, e2022JA030342. </w:t>
-      </w:r>
-      <w:proofErr w:type="spellStart"/>
-      <w:r>
-        <w:rPr>
-          <w:sz w:val="18"/>
-          <w:szCs w:val="18"/>
-        </w:rPr>
-        <w:t>doi</w:t>
-      </w:r>
-      <w:proofErr w:type="spellEnd"/>
-      <w:r>
-        <w:rPr>
-          <w:sz w:val="18"/>
-          <w:szCs w:val="18"/>
-        </w:rPr>
-        <w:t>: 10.1029/2022JA030342</w:t>
+        <w:t>Chakraborty, S., Boteler DH, Shi X, Murphy BS, Hartinger MD, Wang X, Lucas G and Baker JBH (2022). Modeling geomagnetic induction in submarine cables. Front. Phys. 10:1022475. doi: 10.3389/fphy.2022.1022475</w:t>
       </w:r>
     </w:p>
     <w:p>
@@ -4054,87 +3600,7 @@
           <w:sz w:val="18"/>
           <w:szCs w:val="18"/>
         </w:rPr>
-        <w:t xml:space="preserve">Shi X, Schmidt M, Martin CJ, Billett DD, Bland E, </w:t>
-      </w:r>
-      <w:proofErr w:type="spellStart"/>
-      <w:r>
-        <w:rPr>
-          <w:sz w:val="18"/>
-          <w:szCs w:val="18"/>
-        </w:rPr>
-        <w:t>Tholley</w:t>
-      </w:r>
-      <w:proofErr w:type="spellEnd"/>
-      <w:r>
-        <w:rPr>
-          <w:sz w:val="18"/>
-          <w:szCs w:val="18"/>
-        </w:rPr>
-        <w:t xml:space="preserve"> FH, Frissell NA, Khanal K, Coyle S, Chakraborty S, Detwiller M, </w:t>
-      </w:r>
-      <w:proofErr w:type="spellStart"/>
-      <w:r>
-        <w:rPr>
-          <w:sz w:val="18"/>
-          <w:szCs w:val="18"/>
-        </w:rPr>
-        <w:t>Kunduri</w:t>
-      </w:r>
-      <w:proofErr w:type="spellEnd"/>
-      <w:r>
-        <w:rPr>
-          <w:sz w:val="18"/>
-          <w:szCs w:val="18"/>
-        </w:rPr>
-        <w:t xml:space="preserve"> B and McWilliams K (2022). </w:t>
-      </w:r>
-      <w:proofErr w:type="spellStart"/>
-      <w:r>
-        <w:rPr>
-          <w:sz w:val="18"/>
-          <w:szCs w:val="18"/>
-        </w:rPr>
-        <w:t>pyDARN</w:t>
-      </w:r>
-      <w:proofErr w:type="spellEnd"/>
-      <w:r>
-        <w:rPr>
-          <w:sz w:val="18"/>
-          <w:szCs w:val="18"/>
-        </w:rPr>
-        <w:t xml:space="preserve">: </w:t>
-      </w:r>
-      <w:proofErr w:type="gramStart"/>
-      <w:r>
-        <w:rPr>
-          <w:sz w:val="18"/>
-          <w:szCs w:val="18"/>
-        </w:rPr>
-        <w:t>A Python</w:t>
-      </w:r>
-      <w:proofErr w:type="gramEnd"/>
-      <w:r>
-        <w:rPr>
-          <w:sz w:val="18"/>
-          <w:szCs w:val="18"/>
-        </w:rPr>
-        <w:t xml:space="preserve"> software for visualizing SuperDARN radar data. Front. Astron. Space Sci. 9:1022690. </w:t>
-      </w:r>
-      <w:proofErr w:type="spellStart"/>
-      <w:r>
-        <w:rPr>
-          <w:sz w:val="18"/>
-          <w:szCs w:val="18"/>
-        </w:rPr>
-        <w:t>doi</w:t>
-      </w:r>
-      <w:proofErr w:type="spellEnd"/>
-      <w:r>
-        <w:rPr>
-          <w:sz w:val="18"/>
-          <w:szCs w:val="18"/>
-        </w:rPr>
-        <w:t>: 10.3389/fspas.2022.1022690</w:t>
+        <w:t>Prikryl, P., Gillies, R. G., Themens, D. R., Weygand, J. M., Thomas, E. G., and Chakraborty, S. (2022). Multi-instrument observations of polar cap patches and traveling ionospheric disturbances generated by solar wind Alfven waves coupling to the dayside magnetosphere. Ann. Geophys., 40, 619-639, doi: 10.5194/angeo-40-619-2022</w:t>
       </w:r>
     </w:p>
     <w:p>
@@ -4151,39 +3617,7 @@
           <w:sz w:val="18"/>
           <w:szCs w:val="18"/>
         </w:rPr>
-        <w:t>Chakraborty, S., Baker, J. B. H., and Ruohoniemi, J. M. (2021). Probabilistic Short-wave Fadeout Detection in SuperDARN Time Series Observations, 2021 IEEE International Conference on Wireless for Space and Extreme Environments (</w:t>
-      </w:r>
-      <w:proofErr w:type="spellStart"/>
-      <w:r>
-        <w:rPr>
-          <w:sz w:val="18"/>
-          <w:szCs w:val="18"/>
-        </w:rPr>
-        <w:t>WiSEE</w:t>
-      </w:r>
-      <w:proofErr w:type="spellEnd"/>
-      <w:r>
-        <w:rPr>
-          <w:sz w:val="18"/>
-          <w:szCs w:val="18"/>
-        </w:rPr>
-        <w:t xml:space="preserve">), pp. 43-48, </w:t>
-      </w:r>
-      <w:proofErr w:type="spellStart"/>
-      <w:r>
-        <w:rPr>
-          <w:sz w:val="18"/>
-          <w:szCs w:val="18"/>
-        </w:rPr>
-        <w:t>doi</w:t>
-      </w:r>
-      <w:proofErr w:type="spellEnd"/>
-      <w:r>
-        <w:rPr>
-          <w:sz w:val="18"/>
-          <w:szCs w:val="18"/>
-        </w:rPr>
-        <w:t>: 10.1109/WiSEE50203.2021.9613835</w:t>
+        <w:t>Chakraborty, S., Qian, L., Baker, J. B. H., Ruohoniemi, J. M., Kuyeng, K., and Mclnerney, J. M. (2022). Driving influences of the Doppler flash observed by SuperDARN HF radars in response to solar flares. Journal of Geophysical Research: Space Physics, 127, e2022JA030342. doi: 10.1029/2022JA030342</w:t>
       </w:r>
     </w:p>
     <w:p>
@@ -4200,39 +3634,7 @@
           <w:sz w:val="18"/>
           <w:szCs w:val="18"/>
         </w:rPr>
-        <w:t xml:space="preserve">Chakraborty, S., Qian, L., Ruohoniemi, J. M., Baker, J. B. H., </w:t>
-      </w:r>
-      <w:proofErr w:type="spellStart"/>
-      <w:r>
-        <w:rPr>
-          <w:sz w:val="18"/>
-          <w:szCs w:val="18"/>
-        </w:rPr>
-        <w:t>Mclnerney</w:t>
-      </w:r>
-      <w:proofErr w:type="spellEnd"/>
-      <w:r>
-        <w:rPr>
-          <w:sz w:val="18"/>
-          <w:szCs w:val="18"/>
-        </w:rPr>
-        <w:t xml:space="preserve">, J. M., and Nishitani, N. (2021). The role of flare-driven ionospheric electron density changes on the Doppler flash observed by SuperDARN HF radars. Journal of Geophysical Research: Space Physics, 126, e2021JA029300. </w:t>
-      </w:r>
-      <w:proofErr w:type="spellStart"/>
-      <w:r>
-        <w:rPr>
-          <w:sz w:val="18"/>
-          <w:szCs w:val="18"/>
-        </w:rPr>
-        <w:t>doi</w:t>
-      </w:r>
-      <w:proofErr w:type="spellEnd"/>
-      <w:r>
-        <w:rPr>
-          <w:sz w:val="18"/>
-          <w:szCs w:val="18"/>
-        </w:rPr>
-        <w:t>: 10.1029/2021JA029300</w:t>
+        <w:t>Shi X, Schmidt M, Martin CJ, Billett DD, Bland E, Tholley FH, Frissell NA, Khanal K, Coyle S, Chakraborty S, Detwiller M, Kunduri B and McWilliams K (2022). pyDARN: A Python software for visualizing SuperDARN radar data. Front. Astron. Space Sci. 9:1022690. doi: 10.3389/fspas.2022.1022690</w:t>
       </w:r>
     </w:p>
     <w:p>
@@ -4249,23 +3651,7 @@
           <w:sz w:val="18"/>
           <w:szCs w:val="18"/>
         </w:rPr>
-        <w:t xml:space="preserve">Fiori, R.A.D., Chakraborty, S., Nikitina, L. (2022). Data-based optimization of a simple shortwave fadeout absorption model. Journal of Atmospheric and Solar-Terrestrial Physics. </w:t>
-      </w:r>
-      <w:proofErr w:type="spellStart"/>
-      <w:r>
-        <w:rPr>
-          <w:sz w:val="18"/>
-          <w:szCs w:val="18"/>
-        </w:rPr>
-        <w:t>doi</w:t>
-      </w:r>
-      <w:proofErr w:type="spellEnd"/>
-      <w:r>
-        <w:rPr>
-          <w:sz w:val="18"/>
-          <w:szCs w:val="18"/>
-        </w:rPr>
-        <w:t>: 10.1016/j.jastp.2022.105843</w:t>
+        <w:t>Chakraborty, S., Baker, J. B. H., and Ruohoniemi, J. M. (2021). Probabilistic Short-wave Fadeout Detection in SuperDARN Time Series Observations, 2021 IEEE International Conference on Wireless for Space and Extreme Environments (WiSEE), pp. 43-48, doi: 10.1109/WiSEE50203.2021.9613835</w:t>
       </w:r>
     </w:p>
     <w:p>
@@ -4282,7 +3668,7 @@
           <w:sz w:val="18"/>
           <w:szCs w:val="18"/>
         </w:rPr>
-        <w:t>Chakraborty, S., Baker, J. B. H., Fiori, R. A. D., Ruohoniemi, J. M., and Zawdie, K. A. (2021). A modeling framework for estimating ionospheric HF absorption produced by solar flares. Radio Science, 56, e2021RS007285. doi:10.1029/2021RS007285</w:t>
+        <w:t>Chakraborty, S., Qian, L., Ruohoniemi, J. M., Baker, J. B. H., Mclnerney, J. M., and Nishitani, N. (2021). The role of flare-driven ionospheric electron density changes on the Doppler flash observed by SuperDARN HF radars. Journal of Geophysical Research: Space Physics, 126, e2021JA029300. doi: 10.1029/2021JA029300</w:t>
       </w:r>
     </w:p>
     <w:p>
@@ -4299,23 +3685,7 @@
           <w:sz w:val="18"/>
           <w:szCs w:val="18"/>
         </w:rPr>
-        <w:t xml:space="preserve">Chakraborty, S., Ruohoniemi, J. M., Baker, J. B. H., Fiori, R. A. D., Bailey, S. M., and Zawdie, K. A. (2021). Ionospheric Sluggishness: A Characteristic Time-Lag of the Ionospheric Response to Solar Flares. Journal of Geophysical Research: Space Physics, 126, e2020JA028813. </w:t>
-      </w:r>
-      <w:proofErr w:type="spellStart"/>
-      <w:r>
-        <w:rPr>
-          <w:sz w:val="18"/>
-          <w:szCs w:val="18"/>
-        </w:rPr>
-        <w:t>doi</w:t>
-      </w:r>
-      <w:proofErr w:type="spellEnd"/>
-      <w:r>
-        <w:rPr>
-          <w:sz w:val="18"/>
-          <w:szCs w:val="18"/>
-        </w:rPr>
-        <w:t>: 10.1029/2020JA028813</w:t>
+        <w:t>Fiori, R.A.D., Chakraborty, S., Nikitina, L. (2022). Data-based optimization of a simple shortwave fadeout absorption model. Journal of Atmospheric and Solar-Terrestrial Physics. doi: 10.1016/j.jastp.2022.105843</w:t>
       </w:r>
     </w:p>
     <w:p>
@@ -4332,39 +3702,7 @@
           <w:sz w:val="18"/>
           <w:szCs w:val="18"/>
         </w:rPr>
-        <w:t xml:space="preserve">Chakraborty, S. and Morley, S. K. (2020). Probabilistic Prediction of Geomagnetic Storms and the </w:t>
-      </w:r>
-      <w:proofErr w:type="spellStart"/>
-      <w:r>
-        <w:rPr>
-          <w:sz w:val="18"/>
-          <w:szCs w:val="18"/>
-        </w:rPr>
-        <w:t>Kp</w:t>
-      </w:r>
-      <w:proofErr w:type="spellEnd"/>
-      <w:r>
-        <w:rPr>
-          <w:sz w:val="18"/>
-          <w:szCs w:val="18"/>
-        </w:rPr>
-        <w:t xml:space="preserve"> Index. Journal of Space Weather and Space Climate. doi:10.1051/</w:t>
-      </w:r>
-      <w:proofErr w:type="spellStart"/>
-      <w:r>
-        <w:rPr>
-          <w:sz w:val="18"/>
-          <w:szCs w:val="18"/>
-        </w:rPr>
-        <w:t>swsc</w:t>
-      </w:r>
-      <w:proofErr w:type="spellEnd"/>
-      <w:r>
-        <w:rPr>
-          <w:sz w:val="18"/>
-          <w:szCs w:val="18"/>
-        </w:rPr>
-        <w:t>/2020037</w:t>
+        <w:t>Chakraborty, S., Baker, J. B. H., Fiori, R. A. D., Ruohoniemi, J. M., and Zawdie, K. A. (2021). A modeling framework for estimating ionospheric HF absorption produced by solar flares. Radio Science, 56, e2021RS007285. doi:10.1029/2021RS007285</w:t>
       </w:r>
     </w:p>
     <w:p>
@@ -4381,23 +3719,7 @@
           <w:sz w:val="18"/>
           <w:szCs w:val="18"/>
         </w:rPr>
-        <w:t xml:space="preserve">Mukhopadhyay, A., Welling, D. T., </w:t>
-      </w:r>
-      <w:proofErr w:type="spellStart"/>
-      <w:r>
-        <w:rPr>
-          <w:sz w:val="18"/>
-          <w:szCs w:val="18"/>
-        </w:rPr>
-        <w:t>Liemohn</w:t>
-      </w:r>
-      <w:proofErr w:type="spellEnd"/>
-      <w:r>
-        <w:rPr>
-          <w:sz w:val="18"/>
-          <w:szCs w:val="18"/>
-        </w:rPr>
-        <w:t>, M. W., Ridley, A. J., Chakraborty, S., and Anderson, B. J. (2020). Conductance Model for Extreme Events: Impact of auroral conductance on space weather forecasts. Space Weather, 18, e2020SW002551. doi:10.1029/2020SW002551</w:t>
+        <w:t>Chakraborty, S., Ruohoniemi, J. M., Baker, J. B. H., Fiori, R. A. D., Bailey, S. M., and Zawdie, K. A. (2021). Ionospheric Sluggishness: A Characteristic Time-Lag of the Ionospheric Response to Solar Flares. Journal of Geophysical Research: Space Physics, 126, e2020JA028813. doi: 10.1029/2020JA028813</w:t>
       </w:r>
     </w:p>
     <w:p>
@@ -4414,23 +3736,7 @@
           <w:sz w:val="18"/>
           <w:szCs w:val="18"/>
         </w:rPr>
-        <w:t xml:space="preserve">Chakraborty, S., Baker, J. B. H., Ruohoniemi, J. M., </w:t>
-      </w:r>
-      <w:proofErr w:type="spellStart"/>
-      <w:r>
-        <w:rPr>
-          <w:sz w:val="18"/>
-          <w:szCs w:val="18"/>
-        </w:rPr>
-        <w:t>Kunduri</w:t>
-      </w:r>
-      <w:proofErr w:type="spellEnd"/>
-      <w:r>
-        <w:rPr>
-          <w:sz w:val="18"/>
-          <w:szCs w:val="18"/>
-        </w:rPr>
-        <w:t>, B., Nishitani, N., and Shepherd, S. G. (2019). A Study of SuperDARN Response to Co-occurring Space Weather Phenomena. Space Weather, 17. doi:10.1029/2019SW002179</w:t>
+        <w:t>Chakraborty, S. and Morley, S. K. (2020). Probabilistic Prediction of Geomagnetic Storms and the Kp Index. Journal of Space Weather and Space Climate. doi:10.1051/swsc/2020037</w:t>
       </w:r>
     </w:p>
     <w:p>
@@ -4447,7 +3753,7 @@
           <w:sz w:val="18"/>
           <w:szCs w:val="18"/>
         </w:rPr>
-        <w:t>Chakraborty, S., Ruohoniemi, J. M., Baker, J. B. H., and Nishitani, N. (2018). Characterization of short-wave fadeout seen in daytime SuperDARN ground scatter observations. Radio Science, 53, 472-484. doi:10.1002/2017RS006488</w:t>
+        <w:t>Mukhopadhyay, A., Welling, D. T., Liemohn, M. W., Ridley, A. J., Chakraborty, S., and Anderson, B. J. (2020). Conductance Model for Extreme Events: Impact of auroral conductance on space weather forecasts. Space Weather, 18, e2020SW002551. doi:10.1029/2020SW002551</w:t>
       </w:r>
     </w:p>
     <w:p>
@@ -4464,51 +3770,8 @@
           <w:sz w:val="18"/>
           <w:szCs w:val="18"/>
         </w:rPr>
-        <w:t xml:space="preserve">Fiori, R. A. D., </w:t>
-      </w:r>
-      <w:proofErr w:type="spellStart"/>
-      <w:r>
-        <w:rPr>
-          <w:sz w:val="18"/>
-          <w:szCs w:val="18"/>
-        </w:rPr>
-        <w:t>Koustov</w:t>
-      </w:r>
-      <w:proofErr w:type="spellEnd"/>
-      <w:r>
-        <w:rPr>
-          <w:sz w:val="18"/>
-          <w:szCs w:val="18"/>
-        </w:rPr>
-        <w:t>, A. V., Chakraborty, S., Ruohoniemi, J. M., Danskin, D. W., Boteler, D. H., and Shepherd, S. G. (2018). Examining the Potential of the Super Dual Auroral Radar Network for Monitoring the Space Weather Impact of Solar X-Ray Flares. Space Weather, 16. doi:10.1029/2018SW001905</w:t>
-      </w:r>
-    </w:p>
-    <w:p>
-      <w:pPr>
-        <w:pBdr>
-          <w:left w:val="single" w:sz="24" w:space="8" w:color="C9A800"/>
-        </w:pBdr>
-        <w:spacing w:before="260" w:after="60"/>
-        <w:ind w:left="120"/>
-      </w:pPr>
-      <w:r>
-        <w:rPr>
-          <w:b/>
-          <w:bCs/>
-          <w:color w:val="003366"/>
-          <w:sz w:val="24"/>
-          <w:szCs w:val="24"/>
-        </w:rPr>
-        <w:t>CONFERENCE PAPERS</w:t>
-      </w:r>
-    </w:p>
-    <w:p>
-      <w:pPr>
-        <w:pBdr>
-          <w:bottom w:val="single" w:sz="4" w:space="1" w:color="003366"/>
-        </w:pBdr>
-        <w:spacing w:after="80"/>
-      </w:pPr>
+        <w:t>Chakraborty, S., Baker, J. B. H., Ruohoniemi, J. M., Kunduri, B., Nishitani, N., and Shepherd, S. G. (2019). A Study of SuperDARN Response to Co-occurring Space Weather Phenomena. Space Weather, 17. doi:10.1029/2019SW002179</w:t>
+      </w:r>
     </w:p>
     <w:p>
       <w:pPr>
@@ -4524,47 +3787,7 @@
           <w:sz w:val="18"/>
           <w:szCs w:val="18"/>
         </w:rPr>
-        <w:t xml:space="preserve">Chakraborty, S., Ruohoniemi, J. M., Baker, J. B. H., Fiori, R., Zawdie, K., Bailey, S., Nishitani, N., and Drob, D. et al. (2020). Sluggishness of the Ionosphere: Characteristic time-lag in Response to Solar Flares, 2020 </w:t>
-      </w:r>
-      <w:proofErr w:type="spellStart"/>
-      <w:r>
-        <w:rPr>
-          <w:sz w:val="18"/>
-          <w:szCs w:val="18"/>
-        </w:rPr>
-        <w:t>XXXIIIrd</w:t>
-      </w:r>
-      <w:proofErr w:type="spellEnd"/>
-      <w:r>
-        <w:rPr>
-          <w:sz w:val="18"/>
-          <w:szCs w:val="18"/>
-        </w:rPr>
-        <w:t xml:space="preserve"> General Assembly and </w:t>
-      </w:r>
-      <w:r>
-        <w:rPr>
-          <w:sz w:val="18"/>
-          <w:szCs w:val="18"/>
-        </w:rPr>
-        <w:lastRenderedPageBreak/>
-        <w:t xml:space="preserve">Scientific Symposium of the International Union of Radio Science, Rome, Italy, pp. 1-4, </w:t>
-      </w:r>
-      <w:proofErr w:type="spellStart"/>
-      <w:r>
-        <w:rPr>
-          <w:sz w:val="18"/>
-          <w:szCs w:val="18"/>
-        </w:rPr>
-        <w:t>doi</w:t>
-      </w:r>
-      <w:proofErr w:type="spellEnd"/>
-      <w:r>
-        <w:rPr>
-          <w:sz w:val="18"/>
-          <w:szCs w:val="18"/>
-        </w:rPr>
-        <w:t>: 10.23919/URSIGASS49373.2020.9232206</w:t>
+        <w:t>Chakraborty, S., Ruohoniemi, J. M., Baker, J. B. H., and Nishitani, N. (2018). Characterization of short-wave fadeout seen in daytime SuperDARN ground scatter observations. Radio Science, 53, 472-484. doi:10.1002/2017RS006488</w:t>
       </w:r>
     </w:p>
     <w:p>
@@ -4581,8 +3804,36 @@
           <w:sz w:val="18"/>
           <w:szCs w:val="18"/>
         </w:rPr>
-        <w:t>Chakraborty, S., Mukherjee, U. (2015). Circular Micro-strip Antenna Modelling using FDTD method and Design using Genetic Algorithms. CALCON-2015, ID: EC20140700015</w:t>
-      </w:r>
+        <w:t>Fiori, R. A. D., Koustov, A. V., Chakraborty, S., Ruohoniemi, J. M., Danskin, D. W., Boteler, D. H., and Shepherd, S. G. (2018). Examining the Potential of the Super Dual Auroral Radar Network for Monitoring the Space Weather Impact of Solar X-Ray Flares. Space Weather, 16. doi:10.1029/2018SW001905</w:t>
+      </w:r>
+    </w:p>
+    <w:p>
+      <w:pPr>
+        <w:pBdr>
+          <w:left w:val="single" w:sz="24" w:space="8" w:color="C9A800"/>
+        </w:pBdr>
+        <w:spacing w:before="260" w:after="60"/>
+        <w:ind w:left="120"/>
+      </w:pPr>
+      <w:r>
+        <w:rPr>
+          <w:b/>
+          <w:bCs/>
+          <w:color w:val="003366"/>
+          <w:sz w:val="24"/>
+          <w:szCs w:val="24"/>
+        </w:rPr>
+        <w:lastRenderedPageBreak/>
+        <w:t>CONFERENCE PAPERS</w:t>
+      </w:r>
+    </w:p>
+    <w:p>
+      <w:pPr>
+        <w:pBdr>
+          <w:bottom w:val="single" w:sz="4" w:space="1" w:color="003366"/>
+        </w:pBdr>
+        <w:spacing w:after="80"/>
+      </w:pPr>
     </w:p>
     <w:p>
       <w:pPr>
@@ -4598,7 +3849,7 @@
           <w:sz w:val="18"/>
           <w:szCs w:val="18"/>
         </w:rPr>
-        <w:t>Chakraborty, S., Mukherjee, U. (2014). Circular Micro-strip (Coax Feed) Antenna Modelling using FDTD Method and Design using Genetic Algorithms: A Comparative Study on Different Types of Design Techniques. ICCCT-2014, IEEE Digital Xplore. doi:10.1109/ICCCT.2014.7001514</w:t>
+        <w:t>Chakraborty, S., Ruohoniemi, J. M., Baker, J. B. H., Fiori, R., Zawdie, K., Bailey, S., Nishitani, N., and Drob, D. et al. (2020). Sluggishness of the Ionosphere: Characteristic time-lag in Response to Solar Flares, 2020 XXXIIIrd General Assembly and Scientific Symposium of the International Union of Radio Science, Rome, Italy, pp. 1-4, doi: 10.23919/URSIGASS49373.2020.9232206</w:t>
       </w:r>
     </w:p>
     <w:p>
@@ -4615,7 +3866,7 @@
           <w:sz w:val="18"/>
           <w:szCs w:val="18"/>
         </w:rPr>
-        <w:t>Chakraborty, S., Mukherjee, U. (2011). Comparative Study of Micro-strip antennas designed by coaxial feed and line feed. ICCCT-2011, IEEE Digital Xplore. doi:10.1109/ICCCT.2011.6075196</w:t>
+        <w:t>Chakraborty, S., Mukherjee, U. (2015). Circular Micro-strip Antenna Modelling using FDTD method and Design using Genetic Algorithms. CALCON-2015, ID: EC20140700015</w:t>
       </w:r>
     </w:p>
     <w:p>
@@ -4632,6 +3883,40 @@
           <w:sz w:val="18"/>
           <w:szCs w:val="18"/>
         </w:rPr>
+        <w:t>Chakraborty, S., Mukherjee, U. (2014). Circular Micro-strip (Coax Feed) Antenna Modelling using FDTD Method and Design using Genetic Algorithms: A Comparative Study on Different Types of Design Techniques. ICCCT-2014, IEEE Digital Xplore. doi:10.1109/ICCCT.2014.7001514</w:t>
+      </w:r>
+    </w:p>
+    <w:p>
+      <w:pPr>
+        <w:pStyle w:val="ListParagraph"/>
+        <w:numPr>
+          <w:ilvl w:val="0"/>
+          <w:numId w:val="2"/>
+        </w:numPr>
+        <w:spacing w:before="28" w:after="28"/>
+      </w:pPr>
+      <w:r>
+        <w:rPr>
+          <w:sz w:val="18"/>
+          <w:szCs w:val="18"/>
+        </w:rPr>
+        <w:t>Chakraborty, S., Mukherjee, U. (2011). Comparative Study of Micro-strip antennas designed by coaxial feed and line feed. ICCCT-2011, IEEE Digital Xplore. doi:10.1109/ICCCT.2011.6075196</w:t>
+      </w:r>
+    </w:p>
+    <w:p>
+      <w:pPr>
+        <w:pStyle w:val="ListParagraph"/>
+        <w:numPr>
+          <w:ilvl w:val="0"/>
+          <w:numId w:val="2"/>
+        </w:numPr>
+        <w:spacing w:before="28" w:after="28"/>
+      </w:pPr>
+      <w:r>
+        <w:rPr>
+          <w:sz w:val="18"/>
+          <w:szCs w:val="18"/>
+        </w:rPr>
         <w:t>Chakraborty, S., Mukherjee, U. (2010). Micro-strip antenna optimization using genetic algorithms. ICCCT-2010, IEEE Digital Xplore. doi:10.1109/ICCCT.2011.6075196</w:t>
       </w:r>
     </w:p>
@@ -4676,23 +3961,7 @@
           <w:sz w:val="19"/>
           <w:szCs w:val="19"/>
         </w:rPr>
-        <w:t xml:space="preserve">Chakraborty, S. (Invited). Characterization of Solar Flare Effects Observed by High Frequency Radar, HAO Colloquium, 12 </w:t>
-      </w:r>
-      <w:proofErr w:type="gramStart"/>
-      <w:r>
-        <w:rPr>
-          <w:sz w:val="19"/>
-          <w:szCs w:val="19"/>
-        </w:rPr>
-        <w:t>July,</w:t>
-      </w:r>
-      <w:proofErr w:type="gramEnd"/>
-      <w:r>
-        <w:rPr>
-          <w:sz w:val="19"/>
-          <w:szCs w:val="19"/>
-        </w:rPr>
-        <w:t xml:space="preserve"> 2023, Online.</w:t>
+        <w:t>Chakraborty, S. (Invited). Characterization of Solar Flare Effects Observed by High Frequency Radar, HAO Colloquium, 12 July, 2023, Online.</w:t>
       </w:r>
     </w:p>
     <w:p>
@@ -4721,21 +3990,12 @@
         </w:numPr>
         <w:spacing w:before="18" w:after="18"/>
       </w:pPr>
-      <w:proofErr w:type="spellStart"/>
       <w:r>
         <w:rPr>
           <w:sz w:val="19"/>
           <w:szCs w:val="19"/>
         </w:rPr>
-        <w:t>Maimaiti</w:t>
-      </w:r>
-      <w:proofErr w:type="spellEnd"/>
-      <w:r>
-        <w:rPr>
-          <w:sz w:val="19"/>
-          <w:szCs w:val="19"/>
-        </w:rPr>
-        <w:t>, M., Chakraborty, S. (Invited). SuperDARN Radars in Space Science Research, CEDAR Workshop, Keystone, June 2017.</w:t>
+        <w:t>Maimaiti, M., Chakraborty, S. (Invited). SuperDARN Radars in Space Science Research, CEDAR Workshop, Keystone, June 2017.</w:t>
       </w:r>
     </w:p>
     <w:p>
@@ -4813,23 +4073,7 @@
           <w:sz w:val="19"/>
           <w:szCs w:val="19"/>
         </w:rPr>
-        <w:t xml:space="preserve">Chakraborty, S., Nishitani, N., Ruohoniemi, J. M., Baker, J. B. H., Shi, X., Kunduri, B. Solar Flare effects on High Latitude Electrodynamics, Fall AGU, Chicago, IL, 12-16 </w:t>
-      </w:r>
-      <w:proofErr w:type="gramStart"/>
-      <w:r>
-        <w:rPr>
-          <w:sz w:val="19"/>
-          <w:szCs w:val="19"/>
-        </w:rPr>
-        <w:t>December,</w:t>
-      </w:r>
-      <w:proofErr w:type="gramEnd"/>
-      <w:r>
-        <w:rPr>
-          <w:sz w:val="19"/>
-          <w:szCs w:val="19"/>
-        </w:rPr>
-        <w:t xml:space="preserve"> 2022.</w:t>
+        <w:t>Chakraborty, S., Nishitani, N., Ruohoniemi, J. M., Baker, J. B. H., Shi, X., Kunduri, B. Solar Flare effects on High Latitude Electrodynamics, Fall AGU, Chicago, IL, 12-16 December, 2022.</w:t>
       </w:r>
     </w:p>
     <w:p>
@@ -4846,23 +4090,7 @@
           <w:sz w:val="19"/>
           <w:szCs w:val="19"/>
         </w:rPr>
-        <w:t xml:space="preserve">Boteler, D., Chakraborty, S., Shi, X., Murphy, B., Hartinger, M., Wang, X., Lucas, G., and Baker, J. Modeling Geomagnetic Induction in Submarine Cable, Fall AGU, Chicago, IL, 12-16 </w:t>
-      </w:r>
-      <w:proofErr w:type="gramStart"/>
-      <w:r>
-        <w:rPr>
-          <w:sz w:val="19"/>
-          <w:szCs w:val="19"/>
-        </w:rPr>
-        <w:t>December,</w:t>
-      </w:r>
-      <w:proofErr w:type="gramEnd"/>
-      <w:r>
-        <w:rPr>
-          <w:sz w:val="19"/>
-          <w:szCs w:val="19"/>
-        </w:rPr>
-        <w:t xml:space="preserve"> 2022.</w:t>
+        <w:t>Boteler, D., Chakraborty, S., Shi, X., Murphy, B., Hartinger, M., Wang, X., Lucas, G., and Baker, J. Modeling Geomagnetic Induction in Submarine Cable, Fall AGU, Chicago, IL, 12-16 December, 2022.</w:t>
       </w:r>
     </w:p>
     <w:p>
@@ -4879,39 +4107,7 @@
           <w:sz w:val="19"/>
           <w:szCs w:val="19"/>
         </w:rPr>
-        <w:t xml:space="preserve">Chakraborty, S., Nishitani, N., Qian, L., Ruohoniemi, J., Baker, J., </w:t>
-      </w:r>
-      <w:proofErr w:type="spellStart"/>
-      <w:r>
-        <w:rPr>
-          <w:sz w:val="19"/>
-          <w:szCs w:val="19"/>
-        </w:rPr>
-        <w:t>Mclnerney</w:t>
-      </w:r>
-      <w:proofErr w:type="spellEnd"/>
-      <w:r>
-        <w:rPr>
-          <w:sz w:val="19"/>
-          <w:szCs w:val="19"/>
-        </w:rPr>
-        <w:t xml:space="preserve">, J. The Role of Flare-Driven Ionospheric Electron Density Changes on the Doppler Flash Observed by SuperDARN HF Radars, STE, Nagoya University, Japan, 27 </w:t>
-      </w:r>
-      <w:proofErr w:type="gramStart"/>
-      <w:r>
-        <w:rPr>
-          <w:sz w:val="19"/>
-          <w:szCs w:val="19"/>
-        </w:rPr>
-        <w:t>September,</w:t>
-      </w:r>
-      <w:proofErr w:type="gramEnd"/>
-      <w:r>
-        <w:rPr>
-          <w:sz w:val="19"/>
-          <w:szCs w:val="19"/>
-        </w:rPr>
-        <w:t xml:space="preserve"> 2022.</w:t>
+        <w:t>Chakraborty, S., Nishitani, N., Qian, L., Ruohoniemi, J., Baker, J., Mclnerney, J. The Role of Flare-Driven Ionospheric Electron Density Changes on the Doppler Flash Observed by SuperDARN HF Radars, STE, Nagoya University, Japan, 27 September, 2022.</w:t>
       </w:r>
     </w:p>
     <w:p>
@@ -4928,39 +4124,7 @@
           <w:sz w:val="19"/>
           <w:szCs w:val="19"/>
         </w:rPr>
-        <w:t xml:space="preserve">Chakraborty, S., Qian, L., Mabie, J., </w:t>
-      </w:r>
-      <w:proofErr w:type="spellStart"/>
-      <w:r>
-        <w:rPr>
-          <w:sz w:val="19"/>
-          <w:szCs w:val="19"/>
-        </w:rPr>
-        <w:t>Mclnerney</w:t>
-      </w:r>
-      <w:proofErr w:type="spellEnd"/>
-      <w:r>
-        <w:rPr>
-          <w:sz w:val="19"/>
-          <w:szCs w:val="19"/>
-        </w:rPr>
-        <w:t xml:space="preserve">, J. M., Mark, S., Erickson, P. J., Earle, G. Origination of Ionospheric G-condition following a Total solar eclipse, TESS, Bellevue, WA, 8-11 </w:t>
-      </w:r>
-      <w:proofErr w:type="gramStart"/>
-      <w:r>
-        <w:rPr>
-          <w:sz w:val="19"/>
-          <w:szCs w:val="19"/>
-        </w:rPr>
-        <w:t>August,</w:t>
-      </w:r>
-      <w:proofErr w:type="gramEnd"/>
-      <w:r>
-        <w:rPr>
-          <w:sz w:val="19"/>
-          <w:szCs w:val="19"/>
-        </w:rPr>
-        <w:t xml:space="preserve"> 2022.</w:t>
+        <w:t>Chakraborty, S., Qian, L., Mabie, J., Mclnerney, J. M., Mark, S., Erickson, P. J., Earle, G. Origination of Ionospheric G-condition following a Total solar eclipse, TESS, Bellevue, WA, 8-11 August, 2022.</w:t>
       </w:r>
     </w:p>
     <w:p>
@@ -4977,39 +4141,7 @@
           <w:sz w:val="19"/>
           <w:szCs w:val="19"/>
         </w:rPr>
-        <w:t xml:space="preserve">Chakraborty, S., Nishitani, N., Ruohoniemi, J. M., and Baker, J. B. H. Ionospheric Response to Solar Flares Observed in SuperDARN HF Radars, </w:t>
-      </w:r>
-      <w:proofErr w:type="spellStart"/>
-      <w:r>
-        <w:rPr>
-          <w:sz w:val="19"/>
-          <w:szCs w:val="19"/>
-        </w:rPr>
-        <w:t>SoSpIM</w:t>
-      </w:r>
-      <w:proofErr w:type="spellEnd"/>
-      <w:r>
-        <w:rPr>
-          <w:sz w:val="19"/>
-          <w:szCs w:val="19"/>
-        </w:rPr>
-        <w:t xml:space="preserve">, Online, 27-28 </w:t>
-      </w:r>
-      <w:proofErr w:type="gramStart"/>
-      <w:r>
-        <w:rPr>
-          <w:sz w:val="19"/>
-          <w:szCs w:val="19"/>
-        </w:rPr>
-        <w:t>June,</w:t>
-      </w:r>
-      <w:proofErr w:type="gramEnd"/>
-      <w:r>
-        <w:rPr>
-          <w:sz w:val="19"/>
-          <w:szCs w:val="19"/>
-        </w:rPr>
-        <w:t xml:space="preserve"> 2022.</w:t>
+        <w:t>Chakraborty, S., Nishitani, N., Ruohoniemi, J. M., and Baker, J. B. H. Ionospheric Response to Solar Flares Observed in SuperDARN HF Radars, SoSpIM, Online, 27-28 June, 2022.</w:t>
       </w:r>
     </w:p>
     <w:p>
@@ -5104,6 +4236,7 @@
           <w:sz w:val="19"/>
           <w:szCs w:val="19"/>
         </w:rPr>
+        <w:lastRenderedPageBreak/>
         <w:t>Participated in Summer Camp for pre-college students such as (1) Imagination (rising 7th and 8th graders) and Pathways for Future Engineers (first generation rising 10-12th graders), as a volunteer faculty, organized by the Center for the Enhancement of Engineering Diversity (CEED) at Virginia Tech (Since 2021).</w:t>
       </w:r>
     </w:p>
@@ -5121,23 +4254,7 @@
           <w:sz w:val="19"/>
           <w:szCs w:val="19"/>
         </w:rPr>
-        <w:t xml:space="preserve">Participated in Science and Collaborative </w:t>
-      </w:r>
-      <w:proofErr w:type="gramStart"/>
-      <w:r>
-        <w:rPr>
-          <w:sz w:val="19"/>
-          <w:szCs w:val="19"/>
-        </w:rPr>
-        <w:t>talks</w:t>
-      </w:r>
-      <w:proofErr w:type="gramEnd"/>
-      <w:r>
-        <w:rPr>
-          <w:sz w:val="19"/>
-          <w:szCs w:val="19"/>
-        </w:rPr>
-        <w:t xml:space="preserve"> for the freshmen as a volunteer faculty, organized by the Center for the Enhancement of Engineering Diversity (CEED) at Virginia Tech (Since 2021).</w:t>
+        <w:t>Participated in Science and Collaborative talks for the freshmen as a volunteer faculty, organized by the Center for the Enhancement of Engineering Diversity (CEED) at Virginia Tech (Since 2021).</w:t>
       </w:r>
     </w:p>
     <w:p>
@@ -5156,7 +4273,6 @@
           <w:sz w:val="24"/>
           <w:szCs w:val="24"/>
         </w:rPr>
-        <w:lastRenderedPageBreak/>
         <w:t>INDUSTRIAL WORK EXPERIENCE</w:t>
       </w:r>
     </w:p>
@@ -6034,7 +5150,6 @@
             <w:pPr>
               <w:spacing w:after="20"/>
             </w:pPr>
-            <w:proofErr w:type="spellStart"/>
             <w:r>
               <w:rPr>
                 <w:b/>
@@ -6043,31 +5158,8 @@
                 <w:sz w:val="18"/>
                 <w:szCs w:val="18"/>
               </w:rPr>
-              <w:t>Aroh</w:t>
-            </w:r>
-            <w:proofErr w:type="spellEnd"/>
-            <w:r>
-              <w:rPr>
-                <w:b/>
-                <w:bCs/>
-                <w:color w:val="003366"/>
-                <w:sz w:val="18"/>
-                <w:szCs w:val="18"/>
-              </w:rPr>
-              <w:t xml:space="preserve"> </w:t>
-            </w:r>
-            <w:proofErr w:type="spellStart"/>
-            <w:r>
-              <w:rPr>
-                <w:b/>
-                <w:bCs/>
-                <w:color w:val="003366"/>
-                <w:sz w:val="18"/>
-                <w:szCs w:val="18"/>
-              </w:rPr>
-              <w:t>Barjatya</w:t>
-            </w:r>
-            <w:proofErr w:type="spellEnd"/>
+              <w:t>Aroh Barjatya</w:t>
+            </w:r>
           </w:p>
         </w:tc>
         <w:tc>
@@ -6861,6 +5953,7 @@
   <w:style w:type="character" w:default="1" w:styleId="DefaultParagraphFont">
     <w:name w:val="Default Paragraph Font"/>
     <w:uiPriority w:val="1"/>
+    <w:semiHidden/>
     <w:unhideWhenUsed/>
   </w:style>
   <w:style w:type="table" w:default="1" w:styleId="TableNormal">

</xml_diff>

<commit_message>
Update website: 5 file(s) changed — assets/pdf/Chakraborty.docx,assets/pdf/Chakraborty.pdf,assets/pdf/papers.bib,index.html,publications.html
</commit_message>
<xml_diff>
--- a/assets/pdf/Chakraborty.docx
+++ b/assets/pdf/Chakraborty.docx
@@ -1850,8 +1850,17 @@
                 <w:sz w:val="19"/>
                 <w:szCs w:val="19"/>
               </w:rPr>
-              <w:t>IEEE/WiSEE</w:t>
-            </w:r>
+              <w:t>IEEE/</w:t>
+            </w:r>
+            <w:proofErr w:type="spellStart"/>
+            <w:r>
+              <w:rPr>
+                <w:sz w:val="19"/>
+                <w:szCs w:val="19"/>
+              </w:rPr>
+              <w:t>WiSEE</w:t>
+            </w:r>
+            <w:proofErr w:type="spellEnd"/>
           </w:p>
         </w:tc>
         <w:tc>
@@ -2234,7 +2243,23 @@
                 <w:sz w:val="19"/>
                 <w:szCs w:val="19"/>
               </w:rPr>
-              <w:t>Won 'Electronically Yours' event in category 'Newron'</w:t>
+              <w:t>Won 'Electronically Yours' event in category '</w:t>
+            </w:r>
+            <w:proofErr w:type="spellStart"/>
+            <w:r>
+              <w:rPr>
+                <w:sz w:val="19"/>
+                <w:szCs w:val="19"/>
+              </w:rPr>
+              <w:t>Newron</w:t>
+            </w:r>
+            <w:proofErr w:type="spellEnd"/>
+            <w:r>
+              <w:rPr>
+                <w:sz w:val="19"/>
+                <w:szCs w:val="19"/>
+              </w:rPr>
+              <w:t>'</w:t>
             </w:r>
           </w:p>
         </w:tc>
@@ -3175,7 +3200,39 @@
           <w:sz w:val="18"/>
           <w:szCs w:val="18"/>
         </w:rPr>
-        <w:t xml:space="preserve">Chakraborty, S., Bullett, T., Barjatya, A., &amp; Mabie, J. (2026). pynasonde: An open-source Python library for ionosonde data processing. </w:t>
+        <w:t xml:space="preserve">Bergsson, B., </w:t>
+      </w:r>
+      <w:proofErr w:type="spellStart"/>
+      <w:r>
+        <w:rPr>
+          <w:sz w:val="18"/>
+          <w:szCs w:val="18"/>
+        </w:rPr>
+        <w:t>Inchin</w:t>
+      </w:r>
+      <w:proofErr w:type="spellEnd"/>
+      <w:r>
+        <w:rPr>
+          <w:sz w:val="18"/>
+          <w:szCs w:val="18"/>
+        </w:rPr>
+        <w:t xml:space="preserve">, P., </w:t>
+      </w:r>
+      <w:proofErr w:type="spellStart"/>
+      <w:r>
+        <w:rPr>
+          <w:sz w:val="18"/>
+          <w:szCs w:val="18"/>
+        </w:rPr>
+        <w:t>Debchoudhury</w:t>
+      </w:r>
+      <w:proofErr w:type="spellEnd"/>
+      <w:r>
+        <w:rPr>
+          <w:sz w:val="18"/>
+          <w:szCs w:val="18"/>
+        </w:rPr>
+        <w:t xml:space="preserve">, S., Chakraborty, S., Snively, J., &amp; Zettergren, M. (2026). Automated geolocation of diverse impulsive events using total electron content measurements. </w:t>
       </w:r>
       <w:r>
         <w:rPr>
@@ -3184,8 +3241,95 @@
           <w:sz w:val="18"/>
           <w:szCs w:val="18"/>
         </w:rPr>
+        <w:t>Frontiers in Astronomy and Space Sciences</w:t>
+      </w:r>
+      <w:r>
+        <w:rPr>
+          <w:sz w:val="18"/>
+          <w:szCs w:val="18"/>
+        </w:rPr>
+        <w:t xml:space="preserve">, </w:t>
+      </w:r>
+      <w:r>
+        <w:rPr>
+          <w:i/>
+          <w:iCs/>
+          <w:sz w:val="18"/>
+          <w:szCs w:val="18"/>
+        </w:rPr>
+        <w:t>13–2026</w:t>
+      </w:r>
+      <w:r>
+        <w:rPr>
+          <w:sz w:val="18"/>
+          <w:szCs w:val="18"/>
+        </w:rPr>
+        <w:t>. doi:10.3389/fspas.2026.1812901</w:t>
+      </w:r>
+    </w:p>
+    <w:p>
+      <w:pPr>
+        <w:pStyle w:val="ListParagraph"/>
+        <w:numPr>
+          <w:ilvl w:val="0"/>
+          <w:numId w:val="2"/>
+        </w:numPr>
+        <w:spacing w:before="28" w:after="28"/>
+        <w:rPr>
+          <w:sz w:val="18"/>
+          <w:szCs w:val="18"/>
+        </w:rPr>
+      </w:pPr>
+      <w:r>
+        <w:rPr>
+          <w:sz w:val="18"/>
+          <w:szCs w:val="18"/>
+        </w:rPr>
+        <w:t xml:space="preserve">Chakraborty, S., Bullett, T., </w:t>
+      </w:r>
+      <w:proofErr w:type="spellStart"/>
+      <w:r>
+        <w:rPr>
+          <w:sz w:val="18"/>
+          <w:szCs w:val="18"/>
+        </w:rPr>
+        <w:t>Barjatya</w:t>
+      </w:r>
+      <w:proofErr w:type="spellEnd"/>
+      <w:r>
+        <w:rPr>
+          <w:sz w:val="18"/>
+          <w:szCs w:val="18"/>
+        </w:rPr>
+        <w:t xml:space="preserve">, A., &amp; Mabie, J. (2026). </w:t>
+      </w:r>
+      <w:proofErr w:type="spellStart"/>
+      <w:r>
+        <w:rPr>
+          <w:sz w:val="18"/>
+          <w:szCs w:val="18"/>
+        </w:rPr>
+        <w:t>pynasonde</w:t>
+      </w:r>
+      <w:proofErr w:type="spellEnd"/>
+      <w:r>
+        <w:rPr>
+          <w:sz w:val="18"/>
+          <w:szCs w:val="18"/>
+        </w:rPr>
+        <w:t xml:space="preserve">: An open-source Python library for ionosonde data processing. </w:t>
+      </w:r>
+      <w:proofErr w:type="spellStart"/>
+      <w:r>
+        <w:rPr>
+          <w:i/>
+          <w:iCs/>
+          <w:sz w:val="18"/>
+          <w:szCs w:val="18"/>
+        </w:rPr>
         <w:t>SoftwareX</w:t>
       </w:r>
+      <w:proofErr w:type="spellEnd"/>
       <w:r>
         <w:rPr>
           <w:sz w:val="18"/>
@@ -3279,7 +3423,39 @@
           <w:sz w:val="18"/>
           <w:szCs w:val="18"/>
         </w:rPr>
-        <w:t>Bergsson, B., Debchoudhury, S., Inchin, P., Heale, C., Chakraborty, S., &amp; Zettergren, M. (2025). The Impact of Receiver-Satellite Line-of-Sight Orientation on GNSS TEC Observations of TIDs Induced by Gravity Waves From Convective Sources. Journal of Geophysical Research: Space Physics, 130(9), e2025JA033938.</w:t>
+        <w:t xml:space="preserve">Bergsson, B., </w:t>
+      </w:r>
+      <w:proofErr w:type="spellStart"/>
+      <w:r>
+        <w:rPr>
+          <w:sz w:val="18"/>
+          <w:szCs w:val="18"/>
+        </w:rPr>
+        <w:t>Debchoudhury</w:t>
+      </w:r>
+      <w:proofErr w:type="spellEnd"/>
+      <w:r>
+        <w:rPr>
+          <w:sz w:val="18"/>
+          <w:szCs w:val="18"/>
+        </w:rPr>
+        <w:t xml:space="preserve">, S., </w:t>
+      </w:r>
+      <w:proofErr w:type="spellStart"/>
+      <w:r>
+        <w:rPr>
+          <w:sz w:val="18"/>
+          <w:szCs w:val="18"/>
+        </w:rPr>
+        <w:t>Inchin</w:t>
+      </w:r>
+      <w:proofErr w:type="spellEnd"/>
+      <w:r>
+        <w:rPr>
+          <w:sz w:val="18"/>
+          <w:szCs w:val="18"/>
+        </w:rPr>
+        <w:t>, P., Heale, C., Chakraborty, S., &amp; Zettergren, M. (2025). The Impact of Receiver-Satellite Line-of-Sight Orientation on GNSS TEC Observations of TIDs Induced by Gravity Waves From Convective Sources. Journal of Geophysical Research: Space Physics, 130(9), e2025JA033938.</w:t>
       </w:r>
     </w:p>
     <w:p>
@@ -3291,12 +3467,37 @@
         </w:numPr>
         <w:spacing w:before="28" w:after="28"/>
       </w:pPr>
-      <w:r>
-        <w:rPr>
-          <w:sz w:val="18"/>
-          <w:szCs w:val="18"/>
-        </w:rPr>
-        <w:t>Inchin, P. A., Heale, C., Zettergren, M. D., Bergsson, B., Debchoudhury, S., &amp; Chakraborty, S. (2025). Severe weather-generated acoustic and gravity wave impacts on the ionosphere: A model-guided case study. Journal of Geophysical Research: Space Physics, 130, e2025JA034012. https://doi.org/10.1029/2025JA034012</w:t>
+      <w:proofErr w:type="spellStart"/>
+      <w:r>
+        <w:rPr>
+          <w:sz w:val="18"/>
+          <w:szCs w:val="18"/>
+        </w:rPr>
+        <w:t>Inchin</w:t>
+      </w:r>
+      <w:proofErr w:type="spellEnd"/>
+      <w:r>
+        <w:rPr>
+          <w:sz w:val="18"/>
+          <w:szCs w:val="18"/>
+        </w:rPr>
+        <w:t xml:space="preserve">, P. A., Heale, C., Zettergren, M. D., Bergsson, B., </w:t>
+      </w:r>
+      <w:proofErr w:type="spellStart"/>
+      <w:r>
+        <w:rPr>
+          <w:sz w:val="18"/>
+          <w:szCs w:val="18"/>
+        </w:rPr>
+        <w:t>Debchoudhury</w:t>
+      </w:r>
+      <w:proofErr w:type="spellEnd"/>
+      <w:r>
+        <w:rPr>
+          <w:sz w:val="18"/>
+          <w:szCs w:val="18"/>
+        </w:rPr>
+        <w:t>, S., &amp; Chakraborty, S. (2025). Severe weather-generated acoustic and gravity wave impacts on the ionosphere: A model-guided case study. Journal of Geophysical Research: Space Physics, 130, e2025JA034012. https://doi.org/10.1029/2025JA034012</w:t>
       </w:r>
     </w:p>
     <w:p>
@@ -3313,7 +3514,23 @@
           <w:sz w:val="18"/>
           <w:szCs w:val="18"/>
         </w:rPr>
-        <w:t>Prikryl, P., Themens, D. R., Chum, J., Chakraborty, S., Gillies, R. G., and Weygand, J. M. (2025). Observations of traveling ionospheric disturbances driven by gravity waves from sources in the upper and lower atmosphere. Ann. Geophys., 43, 511-534, https://doi.org/10.5194/angeo-43-511-2025</w:t>
+        <w:t xml:space="preserve">Prikryl, P., </w:t>
+      </w:r>
+      <w:proofErr w:type="spellStart"/>
+      <w:r>
+        <w:rPr>
+          <w:sz w:val="18"/>
+          <w:szCs w:val="18"/>
+        </w:rPr>
+        <w:t>Themens</w:t>
+      </w:r>
+      <w:proofErr w:type="spellEnd"/>
+      <w:r>
+        <w:rPr>
+          <w:sz w:val="18"/>
+          <w:szCs w:val="18"/>
+        </w:rPr>
+        <w:t>, D. R., Chum, J., Chakraborty, S., Gillies, R. G., and Weygand, J. M. (2025). Observations of traveling ionospheric disturbances driven by gravity waves from sources in the upper and lower atmosphere. Ann. Geophys., 43, 511-534, https://doi.org/10.5194/angeo-43-511-2025</w:t>
       </w:r>
     </w:p>
     <w:p>
@@ -3330,7 +3547,23 @@
           <w:sz w:val="18"/>
           <w:szCs w:val="18"/>
         </w:rPr>
-        <w:t>Chakraborty, S., Qian, L., Mrak, S., Mabie, J., Goncharenko, L., Mclnerney, J. M., &amp; Bullett, T. (2025). Formation of the ionospheric G-condition following the 2017 Great American Eclipse. Earth and Space Science, 12, e2024EA004007. https://doi.org/10.1029/2024EA004007</w:t>
+        <w:t xml:space="preserve">Chakraborty, S., Qian, L., Mrak, S., Mabie, J., Goncharenko, L., </w:t>
+      </w:r>
+      <w:proofErr w:type="spellStart"/>
+      <w:r>
+        <w:rPr>
+          <w:sz w:val="18"/>
+          <w:szCs w:val="18"/>
+        </w:rPr>
+        <w:t>Mclnerney</w:t>
+      </w:r>
+      <w:proofErr w:type="spellEnd"/>
+      <w:r>
+        <w:rPr>
+          <w:sz w:val="18"/>
+          <w:szCs w:val="18"/>
+        </w:rPr>
+        <w:t>, J. M., &amp; Bullett, T. (2025). Formation of the ionospheric G-condition following the 2017 Great American Eclipse. Earth and Space Science, 12, e2024EA004007. https://doi.org/10.1029/2024EA004007</w:t>
       </w:r>
     </w:p>
     <w:p>
@@ -3347,7 +3580,23 @@
           <w:sz w:val="18"/>
           <w:szCs w:val="18"/>
         </w:rPr>
-        <w:t>Oberheide, J., Aggarwal, D., Bergsson, B., Chakraborty, S. et al. (2025). Impact of Terrestrial Weather on the Space Weather of the Ionosphere-Thermosphere: Initial Results from a NASA Living with a Star Focused Science Topic. Surv Geophys. https://doi.org/10.1007/s10712-025-09895-7</w:t>
+        <w:t xml:space="preserve">Oberheide, J., Aggarwal, D., Bergsson, B., Chakraborty, S. et al. (2025). Impact of Terrestrial Weather on the Space Weather of the Ionosphere-Thermosphere: Initial Results from a NASA Living with a Star Focused Science Topic. </w:t>
+      </w:r>
+      <w:proofErr w:type="spellStart"/>
+      <w:r>
+        <w:rPr>
+          <w:sz w:val="18"/>
+          <w:szCs w:val="18"/>
+        </w:rPr>
+        <w:t>Surv</w:t>
+      </w:r>
+      <w:proofErr w:type="spellEnd"/>
+      <w:r>
+        <w:rPr>
+          <w:sz w:val="18"/>
+          <w:szCs w:val="18"/>
+        </w:rPr>
+        <w:t xml:space="preserve"> Geophys. https://doi.org/10.1007/s10712-025-09895-7</w:t>
       </w:r>
     </w:p>
     <w:p>
@@ -3412,6 +3661,7 @@
           <w:sz w:val="18"/>
           <w:szCs w:val="18"/>
         </w:rPr>
+        <w:lastRenderedPageBreak/>
         <w:t>Liu, X., Zhang, D., Coster, A. J., Xu, Z., Shi, X., &amp; Chakraborty, S. (2024). The morphology and oscillations of nightside mid-latitude ionospheric trough at designated longitudes in the Northern Hemisphere. Journal of Geophysical Research: Space Physics, 129, e2024JA032864. https://doi.org/10.1029/2024JA032864</w:t>
       </w:r>
     </w:p>
@@ -3424,13 +3674,37 @@
         </w:numPr>
         <w:spacing w:before="28" w:after="28"/>
       </w:pPr>
-      <w:r>
-        <w:rPr>
-          <w:sz w:val="18"/>
-          <w:szCs w:val="18"/>
-        </w:rPr>
-        <w:lastRenderedPageBreak/>
-        <w:t>Inchin, P. A., Bhatt, A., Bramberger, M., Chakraborty, S., Debchoudhury, S., &amp; Heale, C. (2024). Atmospheric and ionospheric responses to orographic gravity waves prior to the December 2022 cold air outbreak. Journal of Geophysical Research: Space Physics, 129, e2024JA032485. https://doi.org/10.1029/2024JA032485</w:t>
+      <w:proofErr w:type="spellStart"/>
+      <w:r>
+        <w:rPr>
+          <w:sz w:val="18"/>
+          <w:szCs w:val="18"/>
+        </w:rPr>
+        <w:t>Inchin</w:t>
+      </w:r>
+      <w:proofErr w:type="spellEnd"/>
+      <w:r>
+        <w:rPr>
+          <w:sz w:val="18"/>
+          <w:szCs w:val="18"/>
+        </w:rPr>
+        <w:t xml:space="preserve">, P. A., Bhatt, A., Bramberger, M., Chakraborty, S., </w:t>
+      </w:r>
+      <w:proofErr w:type="spellStart"/>
+      <w:r>
+        <w:rPr>
+          <w:sz w:val="18"/>
+          <w:szCs w:val="18"/>
+        </w:rPr>
+        <w:t>Debchoudhury</w:t>
+      </w:r>
+      <w:proofErr w:type="spellEnd"/>
+      <w:r>
+        <w:rPr>
+          <w:sz w:val="18"/>
+          <w:szCs w:val="18"/>
+        </w:rPr>
+        <w:t>, S., &amp; Heale, C. (2024). Atmospheric and ionospheric responses to orographic gravity waves prior to the December 2022 cold air outbreak. Journal of Geophysical Research: Space Physics, 129, e2024JA032485. https://doi.org/10.1029/2024JA032485</w:t>
       </w:r>
     </w:p>
     <w:p>
@@ -3442,12 +3716,37 @@
         </w:numPr>
         <w:spacing w:before="28" w:after="28"/>
       </w:pPr>
-      <w:r>
-        <w:rPr>
-          <w:sz w:val="18"/>
-          <w:szCs w:val="18"/>
-        </w:rPr>
-        <w:t>Gowtam, V. S., Connor, H., Kunduri, B. S. R., Raeder, J., Laundal, K. M., Tulasi Ram, S., Chakraborty S., et al. (2024). Calculating the high-latitude ionospheric electrodynamics using a machine learning-based field-aligned current model. Space Weather, 22, e2023SW003683. https://doi.org/10.1029/2023SW003683</w:t>
+      <w:proofErr w:type="spellStart"/>
+      <w:r>
+        <w:rPr>
+          <w:sz w:val="18"/>
+          <w:szCs w:val="18"/>
+        </w:rPr>
+        <w:t>Gowtam</w:t>
+      </w:r>
+      <w:proofErr w:type="spellEnd"/>
+      <w:r>
+        <w:rPr>
+          <w:sz w:val="18"/>
+          <w:szCs w:val="18"/>
+        </w:rPr>
+        <w:t xml:space="preserve">, V. S., Connor, H., </w:t>
+      </w:r>
+      <w:proofErr w:type="spellStart"/>
+      <w:r>
+        <w:rPr>
+          <w:sz w:val="18"/>
+          <w:szCs w:val="18"/>
+        </w:rPr>
+        <w:t>Kunduri</w:t>
+      </w:r>
+      <w:proofErr w:type="spellEnd"/>
+      <w:r>
+        <w:rPr>
+          <w:sz w:val="18"/>
+          <w:szCs w:val="18"/>
+        </w:rPr>
+        <w:t>, B. S. R., Raeder, J., Laundal, K. M., Tulasi Ram, S., Chakraborty S., et al. (2024). Calculating the high-latitude ionospheric electrodynamics using a machine learning-based field-aligned current model. Space Weather, 22, e2023SW003683. https://doi.org/10.1029/2023SW003683</w:t>
       </w:r>
     </w:p>
     <w:p>
@@ -3498,7 +3797,55 @@
           <w:sz w:val="18"/>
           <w:szCs w:val="18"/>
         </w:rPr>
-        <w:t>Reiss, M. A., Muglach, K., Mason, E., Davies, E. E., Chakraborty, S., Delouille, V., ... &amp; Veronig, A. (2023). A Community Dataset for Comparing Automated Coronal Hole Detection Schemes. Astrophysical Journal Supplement. https://ore.exeter.ac.uk/repository/handle/10871/134745</w:t>
+        <w:t xml:space="preserve">Reiss, M. A., </w:t>
+      </w:r>
+      <w:proofErr w:type="spellStart"/>
+      <w:r>
+        <w:rPr>
+          <w:sz w:val="18"/>
+          <w:szCs w:val="18"/>
+        </w:rPr>
+        <w:t>Muglach</w:t>
+      </w:r>
+      <w:proofErr w:type="spellEnd"/>
+      <w:r>
+        <w:rPr>
+          <w:sz w:val="18"/>
+          <w:szCs w:val="18"/>
+        </w:rPr>
+        <w:t xml:space="preserve">, K., Mason, E., Davies, E. E., Chakraborty, S., </w:t>
+      </w:r>
+      <w:proofErr w:type="spellStart"/>
+      <w:r>
+        <w:rPr>
+          <w:sz w:val="18"/>
+          <w:szCs w:val="18"/>
+        </w:rPr>
+        <w:t>Delouille</w:t>
+      </w:r>
+      <w:proofErr w:type="spellEnd"/>
+      <w:r>
+        <w:rPr>
+          <w:sz w:val="18"/>
+          <w:szCs w:val="18"/>
+        </w:rPr>
+        <w:t xml:space="preserve">, V., ... &amp; </w:t>
+      </w:r>
+      <w:proofErr w:type="spellStart"/>
+      <w:r>
+        <w:rPr>
+          <w:sz w:val="18"/>
+          <w:szCs w:val="18"/>
+        </w:rPr>
+        <w:t>Veronig</w:t>
+      </w:r>
+      <w:proofErr w:type="spellEnd"/>
+      <w:r>
+        <w:rPr>
+          <w:sz w:val="18"/>
+          <w:szCs w:val="18"/>
+        </w:rPr>
+        <w:t>, A. (2023). A Community Dataset for Comparing Automated Coronal Hole Detection Schemes. Astrophysical Journal Supplement. https://ore.exeter.ac.uk/repository/handle/10871/134745</w:t>
       </w:r>
     </w:p>
     <w:p>
@@ -3515,7 +3862,23 @@
           <w:sz w:val="18"/>
           <w:szCs w:val="18"/>
         </w:rPr>
-        <w:t>Boteler, D., Chakraborty, S., Shi, X., Hartinger, M. and Wang, X. (2023). Transmission Line Modelling of Geomagnetic Induction in the Ocean/Earth Conductivity Structure. International Journal of Geosciences, 14, 767-791. doi: 10.4236/ijg.2023.148041</w:t>
+        <w:t xml:space="preserve">Boteler, D., Chakraborty, S., Shi, X., Hartinger, M. and Wang, X. (2023). Transmission Line Modelling of Geomagnetic Induction in the Ocean/Earth Conductivity Structure. International Journal of Geosciences, 14, 767-791. </w:t>
+      </w:r>
+      <w:proofErr w:type="spellStart"/>
+      <w:r>
+        <w:rPr>
+          <w:sz w:val="18"/>
+          <w:szCs w:val="18"/>
+        </w:rPr>
+        <w:t>doi</w:t>
+      </w:r>
+      <w:proofErr w:type="spellEnd"/>
+      <w:r>
+        <w:rPr>
+          <w:sz w:val="18"/>
+          <w:szCs w:val="18"/>
+        </w:rPr>
+        <w:t>: 10.4236/ijg.2023.148041</w:t>
       </w:r>
     </w:p>
     <w:p>
@@ -3532,7 +3895,23 @@
           <w:sz w:val="18"/>
           <w:szCs w:val="18"/>
         </w:rPr>
-        <w:t>Rout, D., Patra, S., Kumar, S., Chakrabarty, D., Reeves, G. D., Stolle, C., Pandey, K., Chakraborty, S., Spencer E. A. (2023). The growth of ring current/SYM-H under northward IMF Bz conditions present during the 21-22 January 2005 geomagnetic storm. Space Weather, 21, e2023SW003489. https://doi.org/10.1029/2023SW003489</w:t>
+        <w:t xml:space="preserve">Rout, D., Patra, S., Kumar, S., Chakrabarty, D., Reeves, G. D., Stolle, C., Pandey, K., Chakraborty, S., Spencer E. A. (2023). The growth of ring current/SYM-H under northward IMF </w:t>
+      </w:r>
+      <w:proofErr w:type="spellStart"/>
+      <w:r>
+        <w:rPr>
+          <w:sz w:val="18"/>
+          <w:szCs w:val="18"/>
+        </w:rPr>
+        <w:t>Bz</w:t>
+      </w:r>
+      <w:proofErr w:type="spellEnd"/>
+      <w:r>
+        <w:rPr>
+          <w:sz w:val="18"/>
+          <w:szCs w:val="18"/>
+        </w:rPr>
+        <w:t xml:space="preserve"> conditions present during the 21-22 January 2005 geomagnetic storm. Space Weather, 21, e2023SW003489. https://doi.org/10.1029/2023SW003489</w:t>
       </w:r>
     </w:p>
     <w:p>
@@ -3549,7 +3928,23 @@
           <w:sz w:val="18"/>
           <w:szCs w:val="18"/>
         </w:rPr>
-        <w:t>Liu, J., Chakraborty, S., Chen, X., Wang, Z., He, F., Hu, Z., et al. (2023). Transient response of polar-cusp ionosphere to an interplanetary shock. Journal of Geophysical Research: Space Physics, 128, e2022JA030565. doi: 10.1029/2022JA030565</w:t>
+        <w:t xml:space="preserve">Liu, J., Chakraborty, S., Chen, X., Wang, Z., He, F., Hu, Z., et al. (2023). Transient response of polar-cusp ionosphere to an interplanetary shock. Journal of Geophysical Research: Space Physics, 128, e2022JA030565. </w:t>
+      </w:r>
+      <w:proofErr w:type="spellStart"/>
+      <w:r>
+        <w:rPr>
+          <w:sz w:val="18"/>
+          <w:szCs w:val="18"/>
+        </w:rPr>
+        <w:t>doi</w:t>
+      </w:r>
+      <w:proofErr w:type="spellEnd"/>
+      <w:r>
+        <w:rPr>
+          <w:sz w:val="18"/>
+          <w:szCs w:val="18"/>
+        </w:rPr>
+        <w:t>: 10.1029/2022JA030565</w:t>
       </w:r>
     </w:p>
     <w:p>
@@ -3566,7 +3961,55 @@
           <w:sz w:val="18"/>
           <w:szCs w:val="18"/>
         </w:rPr>
-        <w:t>Collins, K., Gibbons, J., Frissell, N., Montare, A., Kazdan, D., Kalmbach, D., Swartz, D., Benedict, R., Romanek, V., Boedicker, R., Liles, W., Engelke, W., McGaw, D. G., Farmer, J., Mikitin, G., Hobart, J., Kavanagh, G., and Chakraborty, S. (2023). Crowdsourced Doppler measurements of time standard stations demonstrating ionospheric variability. Earth Syst. Sci. Data, 15, 1403-1418, doi:10.5194/essd-15-1403-2023</w:t>
+        <w:t xml:space="preserve">Collins, K., Gibbons, J., Frissell, N., </w:t>
+      </w:r>
+      <w:proofErr w:type="spellStart"/>
+      <w:r>
+        <w:rPr>
+          <w:sz w:val="18"/>
+          <w:szCs w:val="18"/>
+        </w:rPr>
+        <w:t>Montare</w:t>
+      </w:r>
+      <w:proofErr w:type="spellEnd"/>
+      <w:r>
+        <w:rPr>
+          <w:sz w:val="18"/>
+          <w:szCs w:val="18"/>
+        </w:rPr>
+        <w:t xml:space="preserve">, A., </w:t>
+      </w:r>
+      <w:proofErr w:type="spellStart"/>
+      <w:r>
+        <w:rPr>
+          <w:sz w:val="18"/>
+          <w:szCs w:val="18"/>
+        </w:rPr>
+        <w:t>Kazdan</w:t>
+      </w:r>
+      <w:proofErr w:type="spellEnd"/>
+      <w:r>
+        <w:rPr>
+          <w:sz w:val="18"/>
+          <w:szCs w:val="18"/>
+        </w:rPr>
+        <w:t xml:space="preserve">, D., Kalmbach, D., Swartz, D., Benedict, R., Romanek, V., Boedicker, R., Liles, W., Engelke, W., McGaw, D. G., Farmer, J., </w:t>
+      </w:r>
+      <w:proofErr w:type="spellStart"/>
+      <w:r>
+        <w:rPr>
+          <w:sz w:val="18"/>
+          <w:szCs w:val="18"/>
+        </w:rPr>
+        <w:t>Mikitin</w:t>
+      </w:r>
+      <w:proofErr w:type="spellEnd"/>
+      <w:r>
+        <w:rPr>
+          <w:sz w:val="18"/>
+          <w:szCs w:val="18"/>
+        </w:rPr>
+        <w:t>, G., Hobart, J., Kavanagh, G., and Chakraborty, S. (2023). Crowdsourced Doppler measurements of time standard stations demonstrating ionospheric variability. Earth Syst. Sci. Data, 15, 1403-1418, doi:10.5194/essd-15-1403-2023</w:t>
       </w:r>
     </w:p>
     <w:p>
@@ -3583,7 +4026,23 @@
           <w:sz w:val="18"/>
           <w:szCs w:val="18"/>
         </w:rPr>
-        <w:t>Chakraborty, S., Boteler DH, Shi X, Murphy BS, Hartinger MD, Wang X, Lucas G and Baker JBH (2022). Modeling geomagnetic induction in submarine cables. Front. Phys. 10:1022475. doi: 10.3389/fphy.2022.1022475</w:t>
+        <w:t xml:space="preserve">Chakraborty, S., Boteler DH, Shi X, Murphy BS, Hartinger MD, Wang X, Lucas G and Baker JBH (2022). Modeling geomagnetic induction in submarine cables. Front. Phys. 10:1022475. </w:t>
+      </w:r>
+      <w:proofErr w:type="spellStart"/>
+      <w:r>
+        <w:rPr>
+          <w:sz w:val="18"/>
+          <w:szCs w:val="18"/>
+        </w:rPr>
+        <w:t>doi</w:t>
+      </w:r>
+      <w:proofErr w:type="spellEnd"/>
+      <w:r>
+        <w:rPr>
+          <w:sz w:val="18"/>
+          <w:szCs w:val="18"/>
+        </w:rPr>
+        <w:t>: 10.3389/fphy.2022.1022475</w:t>
       </w:r>
     </w:p>
     <w:p>
@@ -3600,7 +4059,39 @@
           <w:sz w:val="18"/>
           <w:szCs w:val="18"/>
         </w:rPr>
-        <w:t>Prikryl, P., Gillies, R. G., Themens, D. R., Weygand, J. M., Thomas, E. G., and Chakraborty, S. (2022). Multi-instrument observations of polar cap patches and traveling ionospheric disturbances generated by solar wind Alfven waves coupling to the dayside magnetosphere. Ann. Geophys., 40, 619-639, doi: 10.5194/angeo-40-619-2022</w:t>
+        <w:t xml:space="preserve">Prikryl, P., Gillies, R. G., </w:t>
+      </w:r>
+      <w:proofErr w:type="spellStart"/>
+      <w:r>
+        <w:rPr>
+          <w:sz w:val="18"/>
+          <w:szCs w:val="18"/>
+        </w:rPr>
+        <w:t>Themens</w:t>
+      </w:r>
+      <w:proofErr w:type="spellEnd"/>
+      <w:r>
+        <w:rPr>
+          <w:sz w:val="18"/>
+          <w:szCs w:val="18"/>
+        </w:rPr>
+        <w:t xml:space="preserve">, D. R., Weygand, J. M., Thomas, E. G., and Chakraborty, S. (2022). Multi-instrument observations of polar cap patches and traveling ionospheric disturbances generated by solar wind Alfven waves coupling to the dayside magnetosphere. Ann. Geophys., 40, 619-639, </w:t>
+      </w:r>
+      <w:proofErr w:type="spellStart"/>
+      <w:r>
+        <w:rPr>
+          <w:sz w:val="18"/>
+          <w:szCs w:val="18"/>
+        </w:rPr>
+        <w:t>doi</w:t>
+      </w:r>
+      <w:proofErr w:type="spellEnd"/>
+      <w:r>
+        <w:rPr>
+          <w:sz w:val="18"/>
+          <w:szCs w:val="18"/>
+        </w:rPr>
+        <w:t>: 10.5194/angeo-40-619-2022</w:t>
       </w:r>
     </w:p>
     <w:p>
@@ -3617,7 +4108,23 @@
           <w:sz w:val="18"/>
           <w:szCs w:val="18"/>
         </w:rPr>
-        <w:t>Chakraborty, S., Qian, L., Baker, J. B. H., Ruohoniemi, J. M., Kuyeng, K., and Mclnerney, J. M. (2022). Driving influences of the Doppler flash observed by SuperDARN HF radars in response to solar flares. Journal of Geophysical Research: Space Physics, 127, e2022JA030342. doi: 10.1029/2022JA030342</w:t>
+        <w:t xml:space="preserve">Chakraborty, S., Qian, L., Baker, J. B. H., Ruohoniemi, J. M., Kuyeng, K., and Mclnerney, J. M. (2022). Driving influences of the Doppler flash observed by SuperDARN HF radars in response to solar flares. Journal of Geophysical Research: Space Physics, 127, e2022JA030342. </w:t>
+      </w:r>
+      <w:proofErr w:type="spellStart"/>
+      <w:r>
+        <w:rPr>
+          <w:sz w:val="18"/>
+          <w:szCs w:val="18"/>
+        </w:rPr>
+        <w:t>doi</w:t>
+      </w:r>
+      <w:proofErr w:type="spellEnd"/>
+      <w:r>
+        <w:rPr>
+          <w:sz w:val="18"/>
+          <w:szCs w:val="18"/>
+        </w:rPr>
+        <w:t>: 10.1029/2022JA030342</w:t>
       </w:r>
     </w:p>
     <w:p>
@@ -3634,7 +4141,71 @@
           <w:sz w:val="18"/>
           <w:szCs w:val="18"/>
         </w:rPr>
-        <w:t>Shi X, Schmidt M, Martin CJ, Billett DD, Bland E, Tholley FH, Frissell NA, Khanal K, Coyle S, Chakraborty S, Detwiller M, Kunduri B and McWilliams K (2022). pyDARN: A Python software for visualizing SuperDARN radar data. Front. Astron. Space Sci. 9:1022690. doi: 10.3389/fspas.2022.1022690</w:t>
+        <w:t xml:space="preserve">Shi X, Schmidt M, Martin CJ, Billett DD, Bland E, </w:t>
+      </w:r>
+      <w:proofErr w:type="spellStart"/>
+      <w:r>
+        <w:rPr>
+          <w:sz w:val="18"/>
+          <w:szCs w:val="18"/>
+        </w:rPr>
+        <w:t>Tholley</w:t>
+      </w:r>
+      <w:proofErr w:type="spellEnd"/>
+      <w:r>
+        <w:rPr>
+          <w:sz w:val="18"/>
+          <w:szCs w:val="18"/>
+        </w:rPr>
+        <w:t xml:space="preserve"> FH, Frissell NA, Khanal K, Coyle S, Chakraborty S, Detwiller M, </w:t>
+      </w:r>
+      <w:proofErr w:type="spellStart"/>
+      <w:r>
+        <w:rPr>
+          <w:sz w:val="18"/>
+          <w:szCs w:val="18"/>
+        </w:rPr>
+        <w:t>Kunduri</w:t>
+      </w:r>
+      <w:proofErr w:type="spellEnd"/>
+      <w:r>
+        <w:rPr>
+          <w:sz w:val="18"/>
+          <w:szCs w:val="18"/>
+        </w:rPr>
+        <w:t xml:space="preserve"> B and McWilliams K (2022). </w:t>
+      </w:r>
+      <w:proofErr w:type="spellStart"/>
+      <w:r>
+        <w:rPr>
+          <w:sz w:val="18"/>
+          <w:szCs w:val="18"/>
+        </w:rPr>
+        <w:t>pyDARN</w:t>
+      </w:r>
+      <w:proofErr w:type="spellEnd"/>
+      <w:r>
+        <w:rPr>
+          <w:sz w:val="18"/>
+          <w:szCs w:val="18"/>
+        </w:rPr>
+        <w:t xml:space="preserve">: A Python software for visualizing SuperDARN radar data. Front. Astron. Space Sci. 9:1022690. </w:t>
+      </w:r>
+      <w:proofErr w:type="spellStart"/>
+      <w:r>
+        <w:rPr>
+          <w:sz w:val="18"/>
+          <w:szCs w:val="18"/>
+        </w:rPr>
+        <w:t>doi</w:t>
+      </w:r>
+      <w:proofErr w:type="spellEnd"/>
+      <w:r>
+        <w:rPr>
+          <w:sz w:val="18"/>
+          <w:szCs w:val="18"/>
+        </w:rPr>
+        <w:t>: 10.3389/fspas.2022.1022690</w:t>
       </w:r>
     </w:p>
     <w:p>
@@ -3651,7 +4222,39 @@
           <w:sz w:val="18"/>
           <w:szCs w:val="18"/>
         </w:rPr>
-        <w:t>Chakraborty, S., Baker, J. B. H., and Ruohoniemi, J. M. (2021). Probabilistic Short-wave Fadeout Detection in SuperDARN Time Series Observations, 2021 IEEE International Conference on Wireless for Space and Extreme Environments (WiSEE), pp. 43-48, doi: 10.1109/WiSEE50203.2021.9613835</w:t>
+        <w:t>Chakraborty, S., Baker, J. B. H., and Ruohoniemi, J. M. (2021). Probabilistic Short-wave Fadeout Detection in SuperDARN Time Series Observations, 2021 IEEE International Conference on Wireless for Space and Extreme Environments (</w:t>
+      </w:r>
+      <w:proofErr w:type="spellStart"/>
+      <w:r>
+        <w:rPr>
+          <w:sz w:val="18"/>
+          <w:szCs w:val="18"/>
+        </w:rPr>
+        <w:t>WiSEE</w:t>
+      </w:r>
+      <w:proofErr w:type="spellEnd"/>
+      <w:r>
+        <w:rPr>
+          <w:sz w:val="18"/>
+          <w:szCs w:val="18"/>
+        </w:rPr>
+        <w:t xml:space="preserve">), pp. 43-48, </w:t>
+      </w:r>
+      <w:proofErr w:type="spellStart"/>
+      <w:r>
+        <w:rPr>
+          <w:sz w:val="18"/>
+          <w:szCs w:val="18"/>
+        </w:rPr>
+        <w:t>doi</w:t>
+      </w:r>
+      <w:proofErr w:type="spellEnd"/>
+      <w:r>
+        <w:rPr>
+          <w:sz w:val="18"/>
+          <w:szCs w:val="18"/>
+        </w:rPr>
+        <w:t>: 10.1109/WiSEE50203.2021.9613835</w:t>
       </w:r>
     </w:p>
     <w:p>
@@ -3668,7 +4271,39 @@
           <w:sz w:val="18"/>
           <w:szCs w:val="18"/>
         </w:rPr>
-        <w:t>Chakraborty, S., Qian, L., Ruohoniemi, J. M., Baker, J. B. H., Mclnerney, J. M., and Nishitani, N. (2021). The role of flare-driven ionospheric electron density changes on the Doppler flash observed by SuperDARN HF radars. Journal of Geophysical Research: Space Physics, 126, e2021JA029300. doi: 10.1029/2021JA029300</w:t>
+        <w:t xml:space="preserve">Chakraborty, S., Qian, L., Ruohoniemi, J. M., Baker, J. B. H., </w:t>
+      </w:r>
+      <w:proofErr w:type="spellStart"/>
+      <w:r>
+        <w:rPr>
+          <w:sz w:val="18"/>
+          <w:szCs w:val="18"/>
+        </w:rPr>
+        <w:t>Mclnerney</w:t>
+      </w:r>
+      <w:proofErr w:type="spellEnd"/>
+      <w:r>
+        <w:rPr>
+          <w:sz w:val="18"/>
+          <w:szCs w:val="18"/>
+        </w:rPr>
+        <w:t xml:space="preserve">, J. M., and Nishitani, N. (2021). The role of flare-driven ionospheric electron density changes on the Doppler flash observed by SuperDARN HF radars. Journal of Geophysical Research: Space Physics, 126, e2021JA029300. </w:t>
+      </w:r>
+      <w:proofErr w:type="spellStart"/>
+      <w:r>
+        <w:rPr>
+          <w:sz w:val="18"/>
+          <w:szCs w:val="18"/>
+        </w:rPr>
+        <w:t>doi</w:t>
+      </w:r>
+      <w:proofErr w:type="spellEnd"/>
+      <w:r>
+        <w:rPr>
+          <w:sz w:val="18"/>
+          <w:szCs w:val="18"/>
+        </w:rPr>
+        <w:t>: 10.1029/2021JA029300</w:t>
       </w:r>
     </w:p>
     <w:p>
@@ -3685,7 +4320,23 @@
           <w:sz w:val="18"/>
           <w:szCs w:val="18"/>
         </w:rPr>
-        <w:t>Fiori, R.A.D., Chakraborty, S., Nikitina, L. (2022). Data-based optimization of a simple shortwave fadeout absorption model. Journal of Atmospheric and Solar-Terrestrial Physics. doi: 10.1016/j.jastp.2022.105843</w:t>
+        <w:t xml:space="preserve">Fiori, R.A.D., Chakraborty, S., Nikitina, L. (2022). Data-based optimization of a simple shortwave fadeout absorption model. Journal of Atmospheric and Solar-Terrestrial Physics. </w:t>
+      </w:r>
+      <w:proofErr w:type="spellStart"/>
+      <w:r>
+        <w:rPr>
+          <w:sz w:val="18"/>
+          <w:szCs w:val="18"/>
+        </w:rPr>
+        <w:t>doi</w:t>
+      </w:r>
+      <w:proofErr w:type="spellEnd"/>
+      <w:r>
+        <w:rPr>
+          <w:sz w:val="18"/>
+          <w:szCs w:val="18"/>
+        </w:rPr>
+        <w:t>: 10.1016/j.jastp.2022.105843</w:t>
       </w:r>
     </w:p>
     <w:p>
@@ -3719,7 +4370,23 @@
           <w:sz w:val="18"/>
           <w:szCs w:val="18"/>
         </w:rPr>
-        <w:t>Chakraborty, S., Ruohoniemi, J. M., Baker, J. B. H., Fiori, R. A. D., Bailey, S. M., and Zawdie, K. A. (2021). Ionospheric Sluggishness: A Characteristic Time-Lag of the Ionospheric Response to Solar Flares. Journal of Geophysical Research: Space Physics, 126, e2020JA028813. doi: 10.1029/2020JA028813</w:t>
+        <w:t xml:space="preserve">Chakraborty, S., Ruohoniemi, J. M., Baker, J. B. H., Fiori, R. A. D., Bailey, S. M., and Zawdie, K. A. (2021). Ionospheric Sluggishness: A Characteristic Time-Lag of the Ionospheric Response to Solar Flares. Journal of Geophysical Research: Space Physics, 126, e2020JA028813. </w:t>
+      </w:r>
+      <w:proofErr w:type="spellStart"/>
+      <w:r>
+        <w:rPr>
+          <w:sz w:val="18"/>
+          <w:szCs w:val="18"/>
+        </w:rPr>
+        <w:t>doi</w:t>
+      </w:r>
+      <w:proofErr w:type="spellEnd"/>
+      <w:r>
+        <w:rPr>
+          <w:sz w:val="18"/>
+          <w:szCs w:val="18"/>
+        </w:rPr>
+        <w:t>: 10.1029/2020JA028813</w:t>
       </w:r>
     </w:p>
     <w:p>
@@ -3736,7 +4403,39 @@
           <w:sz w:val="18"/>
           <w:szCs w:val="18"/>
         </w:rPr>
-        <w:t>Chakraborty, S. and Morley, S. K. (2020). Probabilistic Prediction of Geomagnetic Storms and the Kp Index. Journal of Space Weather and Space Climate. doi:10.1051/swsc/2020037</w:t>
+        <w:t xml:space="preserve">Chakraborty, S. and Morley, S. K. (2020). Probabilistic Prediction of Geomagnetic Storms and the </w:t>
+      </w:r>
+      <w:proofErr w:type="spellStart"/>
+      <w:r>
+        <w:rPr>
+          <w:sz w:val="18"/>
+          <w:szCs w:val="18"/>
+        </w:rPr>
+        <w:t>Kp</w:t>
+      </w:r>
+      <w:proofErr w:type="spellEnd"/>
+      <w:r>
+        <w:rPr>
+          <w:sz w:val="18"/>
+          <w:szCs w:val="18"/>
+        </w:rPr>
+        <w:t xml:space="preserve"> Index. Journal of Space Weather and Space Climate. doi:10.1051/</w:t>
+      </w:r>
+      <w:proofErr w:type="spellStart"/>
+      <w:r>
+        <w:rPr>
+          <w:sz w:val="18"/>
+          <w:szCs w:val="18"/>
+        </w:rPr>
+        <w:t>swsc</w:t>
+      </w:r>
+      <w:proofErr w:type="spellEnd"/>
+      <w:r>
+        <w:rPr>
+          <w:sz w:val="18"/>
+          <w:szCs w:val="18"/>
+        </w:rPr>
+        <w:t>/2020037</w:t>
       </w:r>
     </w:p>
     <w:p>
@@ -3753,7 +4452,23 @@
           <w:sz w:val="18"/>
           <w:szCs w:val="18"/>
         </w:rPr>
-        <w:t>Mukhopadhyay, A., Welling, D. T., Liemohn, M. W., Ridley, A. J., Chakraborty, S., and Anderson, B. J. (2020). Conductance Model for Extreme Events: Impact of auroral conductance on space weather forecasts. Space Weather, 18, e2020SW002551. doi:10.1029/2020SW002551</w:t>
+        <w:t xml:space="preserve">Mukhopadhyay, A., Welling, D. T., </w:t>
+      </w:r>
+      <w:proofErr w:type="spellStart"/>
+      <w:r>
+        <w:rPr>
+          <w:sz w:val="18"/>
+          <w:szCs w:val="18"/>
+        </w:rPr>
+        <w:t>Liemohn</w:t>
+      </w:r>
+      <w:proofErr w:type="spellEnd"/>
+      <w:r>
+        <w:rPr>
+          <w:sz w:val="18"/>
+          <w:szCs w:val="18"/>
+        </w:rPr>
+        <w:t>, M. W., Ridley, A. J., Chakraborty, S., and Anderson, B. J. (2020). Conductance Model for Extreme Events: Impact of auroral conductance on space weather forecasts. Space Weather, 18, e2020SW002551. doi:10.1029/2020SW002551</w:t>
       </w:r>
     </w:p>
     <w:p>
@@ -3770,7 +4485,23 @@
           <w:sz w:val="18"/>
           <w:szCs w:val="18"/>
         </w:rPr>
-        <w:t>Chakraborty, S., Baker, J. B. H., Ruohoniemi, J. M., Kunduri, B., Nishitani, N., and Shepherd, S. G. (2019). A Study of SuperDARN Response to Co-occurring Space Weather Phenomena. Space Weather, 17. doi:10.1029/2019SW002179</w:t>
+        <w:t xml:space="preserve">Chakraborty, S., Baker, J. B. H., Ruohoniemi, J. M., </w:t>
+      </w:r>
+      <w:proofErr w:type="spellStart"/>
+      <w:r>
+        <w:rPr>
+          <w:sz w:val="18"/>
+          <w:szCs w:val="18"/>
+        </w:rPr>
+        <w:t>Kunduri</w:t>
+      </w:r>
+      <w:proofErr w:type="spellEnd"/>
+      <w:r>
+        <w:rPr>
+          <w:sz w:val="18"/>
+          <w:szCs w:val="18"/>
+        </w:rPr>
+        <w:t>, B., Nishitani, N., and Shepherd, S. G. (2019). A Study of SuperDARN Response to Co-occurring Space Weather Phenomena. Space Weather, 17. doi:10.1029/2019SW002179</w:t>
       </w:r>
     </w:p>
     <w:p>
@@ -3804,7 +4535,24 @@
           <w:sz w:val="18"/>
           <w:szCs w:val="18"/>
         </w:rPr>
-        <w:t>Fiori, R. A. D., Koustov, A. V., Chakraborty, S., Ruohoniemi, J. M., Danskin, D. W., Boteler, D. H., and Shepherd, S. G. (2018). Examining the Potential of the Super Dual Auroral Radar Network for Monitoring the Space Weather Impact of Solar X-Ray Flares. Space Weather, 16. doi:10.1029/2018SW001905</w:t>
+        <w:lastRenderedPageBreak/>
+        <w:t xml:space="preserve">Fiori, R. A. D., </w:t>
+      </w:r>
+      <w:proofErr w:type="spellStart"/>
+      <w:r>
+        <w:rPr>
+          <w:sz w:val="18"/>
+          <w:szCs w:val="18"/>
+        </w:rPr>
+        <w:t>Koustov</w:t>
+      </w:r>
+      <w:proofErr w:type="spellEnd"/>
+      <w:r>
+        <w:rPr>
+          <w:sz w:val="18"/>
+          <w:szCs w:val="18"/>
+        </w:rPr>
+        <w:t>, A. V., Chakraborty, S., Ruohoniemi, J. M., Danskin, D. W., Boteler, D. H., and Shepherd, S. G. (2018). Examining the Potential of the Super Dual Auroral Radar Network for Monitoring the Space Weather Impact of Solar X-Ray Flares. Space Weather, 16. doi:10.1029/2018SW001905</w:t>
       </w:r>
     </w:p>
     <w:p>
@@ -3823,7 +4571,6 @@
           <w:sz w:val="24"/>
           <w:szCs w:val="24"/>
         </w:rPr>
-        <w:lastRenderedPageBreak/>
         <w:t>CONFERENCE PAPERS</w:t>
       </w:r>
     </w:p>
@@ -3849,7 +4596,39 @@
           <w:sz w:val="18"/>
           <w:szCs w:val="18"/>
         </w:rPr>
-        <w:t>Chakraborty, S., Ruohoniemi, J. M., Baker, J. B. H., Fiori, R., Zawdie, K., Bailey, S., Nishitani, N., and Drob, D. et al. (2020). Sluggishness of the Ionosphere: Characteristic time-lag in Response to Solar Flares, 2020 XXXIIIrd General Assembly and Scientific Symposium of the International Union of Radio Science, Rome, Italy, pp. 1-4, doi: 10.23919/URSIGASS49373.2020.9232206</w:t>
+        <w:t xml:space="preserve">Chakraborty, S., Ruohoniemi, J. M., Baker, J. B. H., Fiori, R., Zawdie, K., Bailey, S., Nishitani, N., and Drob, D. et al. (2020). Sluggishness of the Ionosphere: Characteristic time-lag in Response to Solar Flares, 2020 </w:t>
+      </w:r>
+      <w:proofErr w:type="spellStart"/>
+      <w:r>
+        <w:rPr>
+          <w:sz w:val="18"/>
+          <w:szCs w:val="18"/>
+        </w:rPr>
+        <w:t>XXXIIIrd</w:t>
+      </w:r>
+      <w:proofErr w:type="spellEnd"/>
+      <w:r>
+        <w:rPr>
+          <w:sz w:val="18"/>
+          <w:szCs w:val="18"/>
+        </w:rPr>
+        <w:t xml:space="preserve"> General Assembly and Scientific Symposium of the International Union of Radio Science, Rome, Italy, pp. 1-4, </w:t>
+      </w:r>
+      <w:proofErr w:type="spellStart"/>
+      <w:r>
+        <w:rPr>
+          <w:sz w:val="18"/>
+          <w:szCs w:val="18"/>
+        </w:rPr>
+        <w:t>doi</w:t>
+      </w:r>
+      <w:proofErr w:type="spellEnd"/>
+      <w:r>
+        <w:rPr>
+          <w:sz w:val="18"/>
+          <w:szCs w:val="18"/>
+        </w:rPr>
+        <w:t>: 10.23919/URSIGASS49373.2020.9232206</w:t>
       </w:r>
     </w:p>
     <w:p>
@@ -3990,12 +4769,21 @@
         </w:numPr>
         <w:spacing w:before="18" w:after="18"/>
       </w:pPr>
+      <w:proofErr w:type="spellStart"/>
       <w:r>
         <w:rPr>
           <w:sz w:val="19"/>
           <w:szCs w:val="19"/>
         </w:rPr>
-        <w:t>Maimaiti, M., Chakraborty, S. (Invited). SuperDARN Radars in Space Science Research, CEDAR Workshop, Keystone, June 2017.</w:t>
+        <w:t>Maimaiti</w:t>
+      </w:r>
+      <w:proofErr w:type="spellEnd"/>
+      <w:r>
+        <w:rPr>
+          <w:sz w:val="19"/>
+          <w:szCs w:val="19"/>
+        </w:rPr>
+        <w:t>, M., Chakraborty, S. (Invited). SuperDARN Radars in Space Science Research, CEDAR Workshop, Keystone, June 2017.</w:t>
       </w:r>
     </w:p>
     <w:p>
@@ -4107,7 +4895,23 @@
           <w:sz w:val="19"/>
           <w:szCs w:val="19"/>
         </w:rPr>
-        <w:t>Chakraborty, S., Nishitani, N., Qian, L., Ruohoniemi, J., Baker, J., Mclnerney, J. The Role of Flare-Driven Ionospheric Electron Density Changes on the Doppler Flash Observed by SuperDARN HF Radars, STE, Nagoya University, Japan, 27 September, 2022.</w:t>
+        <w:t xml:space="preserve">Chakraborty, S., Nishitani, N., Qian, L., Ruohoniemi, J., Baker, J., </w:t>
+      </w:r>
+      <w:proofErr w:type="spellStart"/>
+      <w:r>
+        <w:rPr>
+          <w:sz w:val="19"/>
+          <w:szCs w:val="19"/>
+        </w:rPr>
+        <w:t>Mclnerney</w:t>
+      </w:r>
+      <w:proofErr w:type="spellEnd"/>
+      <w:r>
+        <w:rPr>
+          <w:sz w:val="19"/>
+          <w:szCs w:val="19"/>
+        </w:rPr>
+        <w:t>, J. The Role of Flare-Driven Ionospheric Electron Density Changes on the Doppler Flash Observed by SuperDARN HF Radars, STE, Nagoya University, Japan, 27 September, 2022.</w:t>
       </w:r>
     </w:p>
     <w:p>
@@ -4124,7 +4928,23 @@
           <w:sz w:val="19"/>
           <w:szCs w:val="19"/>
         </w:rPr>
-        <w:t>Chakraborty, S., Qian, L., Mabie, J., Mclnerney, J. M., Mark, S., Erickson, P. J., Earle, G. Origination of Ionospheric G-condition following a Total solar eclipse, TESS, Bellevue, WA, 8-11 August, 2022.</w:t>
+        <w:t xml:space="preserve">Chakraborty, S., Qian, L., Mabie, J., </w:t>
+      </w:r>
+      <w:proofErr w:type="spellStart"/>
+      <w:r>
+        <w:rPr>
+          <w:sz w:val="19"/>
+          <w:szCs w:val="19"/>
+        </w:rPr>
+        <w:t>Mclnerney</w:t>
+      </w:r>
+      <w:proofErr w:type="spellEnd"/>
+      <w:r>
+        <w:rPr>
+          <w:sz w:val="19"/>
+          <w:szCs w:val="19"/>
+        </w:rPr>
+        <w:t>, J. M., Mark, S., Erickson, P. J., Earle, G. Origination of Ionospheric G-condition following a Total solar eclipse, TESS, Bellevue, WA, 8-11 August, 2022.</w:t>
       </w:r>
     </w:p>
     <w:p>
@@ -4141,7 +4961,23 @@
           <w:sz w:val="19"/>
           <w:szCs w:val="19"/>
         </w:rPr>
-        <w:t>Chakraborty, S., Nishitani, N., Ruohoniemi, J. M., and Baker, J. B. H. Ionospheric Response to Solar Flares Observed in SuperDARN HF Radars, SoSpIM, Online, 27-28 June, 2022.</w:t>
+        <w:t xml:space="preserve">Chakraborty, S., Nishitani, N., Ruohoniemi, J. M., and Baker, J. B. H. Ionospheric Response to Solar Flares Observed in SuperDARN HF Radars, </w:t>
+      </w:r>
+      <w:proofErr w:type="spellStart"/>
+      <w:r>
+        <w:rPr>
+          <w:sz w:val="19"/>
+          <w:szCs w:val="19"/>
+        </w:rPr>
+        <w:t>SoSpIM</w:t>
+      </w:r>
+      <w:proofErr w:type="spellEnd"/>
+      <w:r>
+        <w:rPr>
+          <w:sz w:val="19"/>
+          <w:szCs w:val="19"/>
+        </w:rPr>
+        <w:t>, Online, 27-28 June, 2022.</w:t>
       </w:r>
     </w:p>
     <w:p>
@@ -4211,6 +5047,7 @@
           <w:sz w:val="24"/>
           <w:szCs w:val="24"/>
         </w:rPr>
+        <w:lastRenderedPageBreak/>
         <w:t>OUTREACH &amp; ACTIVITIES</w:t>
       </w:r>
     </w:p>
@@ -4236,7 +5073,6 @@
           <w:sz w:val="19"/>
           <w:szCs w:val="19"/>
         </w:rPr>
-        <w:lastRenderedPageBreak/>
         <w:t>Participated in Summer Camp for pre-college students such as (1) Imagination (rising 7th and 8th graders) and Pathways for Future Engineers (first generation rising 10-12th graders), as a volunteer faculty, organized by the Center for the Enhancement of Engineering Diversity (CEED) at Virginia Tech (Since 2021).</w:t>
       </w:r>
     </w:p>
@@ -5150,6 +5986,7 @@
             <w:pPr>
               <w:spacing w:after="20"/>
             </w:pPr>
+            <w:proofErr w:type="spellStart"/>
             <w:r>
               <w:rPr>
                 <w:b/>
@@ -5158,8 +5995,31 @@
                 <w:sz w:val="18"/>
                 <w:szCs w:val="18"/>
               </w:rPr>
-              <w:t>Aroh Barjatya</w:t>
-            </w:r>
+              <w:t>Aroh</w:t>
+            </w:r>
+            <w:proofErr w:type="spellEnd"/>
+            <w:r>
+              <w:rPr>
+                <w:b/>
+                <w:bCs/>
+                <w:color w:val="003366"/>
+                <w:sz w:val="18"/>
+                <w:szCs w:val="18"/>
+              </w:rPr>
+              <w:t xml:space="preserve"> </w:t>
+            </w:r>
+            <w:proofErr w:type="spellStart"/>
+            <w:r>
+              <w:rPr>
+                <w:b/>
+                <w:bCs/>
+                <w:color w:val="003366"/>
+                <w:sz w:val="18"/>
+                <w:szCs w:val="18"/>
+              </w:rPr>
+              <w:t>Barjatya</w:t>
+            </w:r>
+            <w:proofErr w:type="spellEnd"/>
           </w:p>
         </w:tc>
         <w:tc>
@@ -5953,7 +6813,6 @@
   <w:style w:type="character" w:default="1" w:styleId="DefaultParagraphFont">
     <w:name w:val="Default Paragraph Font"/>
     <w:uiPriority w:val="1"/>
-    <w:semiHidden/>
     <w:unhideWhenUsed/>
   </w:style>
   <w:style w:type="table" w:default="1" w:styleId="TableNormal">

</xml_diff>

<commit_message>
Update website: 7 file(s) changed — assets/pdf/Chakraborty.docx,assets/pdf/Chakraborty.pdf,assets/pdf/papers.bib,cv-1page.html,cv-2page.html,index.html
</commit_message>
<xml_diff>
--- a/assets/pdf/Chakraborty.docx
+++ b/assets/pdf/Chakraborty.docx
@@ -77,7 +77,61 @@
                 <w:sz w:val="17"/>
                 <w:szCs w:val="17"/>
               </w:rPr>
-              <w:t>Space Weather  ·  Ionospheric Physics  ·  HF Propagation  ·  ML/AI</w:t>
+              <w:t xml:space="preserve">Space </w:t>
+            </w:r>
+            <w:proofErr w:type="gramStart"/>
+            <w:r>
+              <w:rPr>
+                <w:color w:val="9FBBDA"/>
+                <w:sz w:val="17"/>
+                <w:szCs w:val="17"/>
+              </w:rPr>
+              <w:t>Weather  ·</w:t>
+            </w:r>
+            <w:proofErr w:type="gramEnd"/>
+            <w:r>
+              <w:rPr>
+                <w:color w:val="9FBBDA"/>
+                <w:sz w:val="17"/>
+                <w:szCs w:val="17"/>
+              </w:rPr>
+              <w:t xml:space="preserve">  Ionospheric </w:t>
+            </w:r>
+            <w:proofErr w:type="gramStart"/>
+            <w:r>
+              <w:rPr>
+                <w:color w:val="9FBBDA"/>
+                <w:sz w:val="17"/>
+                <w:szCs w:val="17"/>
+              </w:rPr>
+              <w:t>Physics  ·</w:t>
+            </w:r>
+            <w:proofErr w:type="gramEnd"/>
+            <w:r>
+              <w:rPr>
+                <w:color w:val="9FBBDA"/>
+                <w:sz w:val="17"/>
+                <w:szCs w:val="17"/>
+              </w:rPr>
+              <w:t xml:space="preserve">  HF </w:t>
+            </w:r>
+            <w:proofErr w:type="gramStart"/>
+            <w:r>
+              <w:rPr>
+                <w:color w:val="9FBBDA"/>
+                <w:sz w:val="17"/>
+                <w:szCs w:val="17"/>
+              </w:rPr>
+              <w:t>Propagation  ·</w:t>
+            </w:r>
+            <w:proofErr w:type="gramEnd"/>
+            <w:r>
+              <w:rPr>
+                <w:color w:val="9FBBDA"/>
+                <w:sz w:val="17"/>
+                <w:szCs w:val="17"/>
+              </w:rPr>
+              <w:t xml:space="preserve">  ML/AI</w:t>
             </w:r>
           </w:p>
         </w:tc>
@@ -3200,72 +3254,17 @@
           <w:sz w:val="18"/>
           <w:szCs w:val="18"/>
         </w:rPr>
-        <w:t xml:space="preserve">Bergsson, B., </w:t>
-      </w:r>
-      <w:proofErr w:type="spellStart"/>
-      <w:r>
-        <w:rPr>
-          <w:sz w:val="18"/>
-          <w:szCs w:val="18"/>
-        </w:rPr>
-        <w:t>Inchin</w:t>
-      </w:r>
-      <w:proofErr w:type="spellEnd"/>
-      <w:r>
-        <w:rPr>
-          <w:sz w:val="18"/>
-          <w:szCs w:val="18"/>
-        </w:rPr>
-        <w:t xml:space="preserve">, P., </w:t>
-      </w:r>
-      <w:proofErr w:type="spellStart"/>
-      <w:r>
-        <w:rPr>
-          <w:sz w:val="18"/>
-          <w:szCs w:val="18"/>
-        </w:rPr>
-        <w:t>Debchoudhury</w:t>
-      </w:r>
-      <w:proofErr w:type="spellEnd"/>
-      <w:r>
-        <w:rPr>
-          <w:sz w:val="18"/>
-          <w:szCs w:val="18"/>
-        </w:rPr>
-        <w:t xml:space="preserve">, S., Chakraborty, S., Snively, J., &amp; Zettergren, M. (2026). Automated geolocation of diverse impulsive events using total electron content measurements. </w:t>
-      </w:r>
-      <w:r>
-        <w:rPr>
-          <w:i/>
-          <w:iCs/>
-          <w:sz w:val="18"/>
-          <w:szCs w:val="18"/>
-        </w:rPr>
-        <w:t>Frontiers in Astronomy and Space Sciences</w:t>
-      </w:r>
-      <w:r>
-        <w:rPr>
-          <w:sz w:val="18"/>
-          <w:szCs w:val="18"/>
-        </w:rPr>
-        <w:t xml:space="preserve">, </w:t>
-      </w:r>
-      <w:r>
-        <w:rPr>
-          <w:i/>
-          <w:iCs/>
-          <w:sz w:val="18"/>
-          <w:szCs w:val="18"/>
-        </w:rPr>
-        <w:t>13–2026</w:t>
-      </w:r>
-      <w:r>
-        <w:rPr>
-          <w:sz w:val="18"/>
-          <w:szCs w:val="18"/>
-        </w:rPr>
-        <w:t>. doi:10.3389/fspas.2026.1812901</w:t>
-      </w:r>
+        <w:t xml:space="preserve">Chakraborty, S., Hartinger, M. D., Shi, X., Boteler, D. H., Lawrence, E., Boteler, C., et al. (2026). Validating SCUBAS predictions of geomagnetically induced voltage in submarine cables using legacy superstorm observations. Space Weather, 24, e2025SW004843. </w:t>
+      </w:r>
+      <w:hyperlink r:id="rId5" w:history="1">
+        <w:r>
+          <w:rPr>
+            <w:sz w:val="18"/>
+            <w:szCs w:val="18"/>
+          </w:rPr>
+          <w:t>https://doi.org/10.1029/2025SW004843</w:t>
+        </w:r>
+      </w:hyperlink>
     </w:p>
     <w:p>
       <w:pPr>
@@ -3285,7 +3284,7 @@
           <w:sz w:val="18"/>
           <w:szCs w:val="18"/>
         </w:rPr>
-        <w:t xml:space="preserve">Chakraborty, S., Bullett, T., </w:t>
+        <w:t xml:space="preserve">Bergsson, B., </w:t>
       </w:r>
       <w:proofErr w:type="spellStart"/>
       <w:r>
@@ -3293,7 +3292,7 @@
           <w:sz w:val="18"/>
           <w:szCs w:val="18"/>
         </w:rPr>
-        <w:t>Barjatya</w:t>
+        <w:t>Inchin</w:t>
       </w:r>
       <w:proofErr w:type="spellEnd"/>
       <w:r>
@@ -3301,7 +3300,7 @@
           <w:sz w:val="18"/>
           <w:szCs w:val="18"/>
         </w:rPr>
-        <w:t xml:space="preserve">, A., &amp; Mabie, J. (2026). </w:t>
+        <w:t xml:space="preserve">, P., </w:t>
       </w:r>
       <w:proofErr w:type="spellStart"/>
       <w:r>
@@ -3309,7 +3308,7 @@
           <w:sz w:val="18"/>
           <w:szCs w:val="18"/>
         </w:rPr>
-        <w:t>pynasonde</w:t>
+        <w:t>Debchoudhury</w:t>
       </w:r>
       <w:proofErr w:type="spellEnd"/>
       <w:r>
@@ -3317,9 +3316,8 @@
           <w:sz w:val="18"/>
           <w:szCs w:val="18"/>
         </w:rPr>
-        <w:t xml:space="preserve">: An open-source Python library for ionosonde data processing. </w:t>
-      </w:r>
-      <w:proofErr w:type="spellStart"/>
+        <w:t xml:space="preserve">, S., Chakraborty, S., Snively, J., &amp; Zettergren, M. (2026). Automated geolocation of diverse impulsive events using total electron content measurements. </w:t>
+      </w:r>
       <w:r>
         <w:rPr>
           <w:i/>
@@ -3327,9 +3325,8 @@
           <w:sz w:val="18"/>
           <w:szCs w:val="18"/>
         </w:rPr>
-        <w:t>SoftwareX</w:t>
-      </w:r>
-      <w:proofErr w:type="spellEnd"/>
+        <w:t>Frontiers in Astronomy and Space Sciences</w:t>
+      </w:r>
       <w:r>
         <w:rPr>
           <w:sz w:val="18"/>
@@ -3344,6 +3341,93 @@
           <w:sz w:val="18"/>
           <w:szCs w:val="18"/>
         </w:rPr>
+        <w:t>13–2026</w:t>
+      </w:r>
+      <w:r>
+        <w:rPr>
+          <w:sz w:val="18"/>
+          <w:szCs w:val="18"/>
+        </w:rPr>
+        <w:t>. doi:10.3389/fspas.2026.1812901</w:t>
+      </w:r>
+    </w:p>
+    <w:p>
+      <w:pPr>
+        <w:pStyle w:val="ListParagraph"/>
+        <w:numPr>
+          <w:ilvl w:val="0"/>
+          <w:numId w:val="2"/>
+        </w:numPr>
+        <w:spacing w:before="28" w:after="28"/>
+        <w:rPr>
+          <w:sz w:val="18"/>
+          <w:szCs w:val="18"/>
+        </w:rPr>
+      </w:pPr>
+      <w:r>
+        <w:rPr>
+          <w:sz w:val="18"/>
+          <w:szCs w:val="18"/>
+        </w:rPr>
+        <w:t xml:space="preserve">Chakraborty, S., Bullett, T., </w:t>
+      </w:r>
+      <w:proofErr w:type="spellStart"/>
+      <w:r>
+        <w:rPr>
+          <w:sz w:val="18"/>
+          <w:szCs w:val="18"/>
+        </w:rPr>
+        <w:t>Barjatya</w:t>
+      </w:r>
+      <w:proofErr w:type="spellEnd"/>
+      <w:r>
+        <w:rPr>
+          <w:sz w:val="18"/>
+          <w:szCs w:val="18"/>
+        </w:rPr>
+        <w:t xml:space="preserve">, A., &amp; Mabie, J. (2026). </w:t>
+      </w:r>
+      <w:proofErr w:type="spellStart"/>
+      <w:r>
+        <w:rPr>
+          <w:sz w:val="18"/>
+          <w:szCs w:val="18"/>
+        </w:rPr>
+        <w:t>pynasonde</w:t>
+      </w:r>
+      <w:proofErr w:type="spellEnd"/>
+      <w:r>
+        <w:rPr>
+          <w:sz w:val="18"/>
+          <w:szCs w:val="18"/>
+        </w:rPr>
+        <w:t xml:space="preserve">: An open-source Python library for ionosonde data processing. </w:t>
+      </w:r>
+      <w:proofErr w:type="spellStart"/>
+      <w:r>
+        <w:rPr>
+          <w:i/>
+          <w:iCs/>
+          <w:sz w:val="18"/>
+          <w:szCs w:val="18"/>
+        </w:rPr>
+        <w:t>SoftwareX</w:t>
+      </w:r>
+      <w:proofErr w:type="spellEnd"/>
+      <w:r>
+        <w:rPr>
+          <w:sz w:val="18"/>
+          <w:szCs w:val="18"/>
+        </w:rPr>
+        <w:t xml:space="preserve">, </w:t>
+      </w:r>
+      <w:r>
+        <w:rPr>
+          <w:i/>
+          <w:iCs/>
+          <w:sz w:val="18"/>
+          <w:szCs w:val="18"/>
+        </w:rPr>
         <w:t>34</w:t>
       </w:r>
       <w:r>
@@ -3353,7 +3437,7 @@
         </w:rPr>
         <w:t xml:space="preserve">, 102617. </w:t>
       </w:r>
-      <w:hyperlink r:id="rId5" w:tgtFrame="_blank" w:history="1">
+      <w:hyperlink r:id="rId6" w:tgtFrame="_blank" w:history="1">
         <w:r>
           <w:rPr>
             <w:sz w:val="18"/>
@@ -3455,7 +3539,23 @@
           <w:sz w:val="18"/>
           <w:szCs w:val="18"/>
         </w:rPr>
-        <w:t>, P., Heale, C., Chakraborty, S., &amp; Zettergren, M. (2025). The Impact of Receiver-Satellite Line-of-Sight Orientation on GNSS TEC Observations of TIDs Induced by Gravity Waves From Convective Sources. Journal of Geophysical Research: Space Physics, 130(9), e2025JA033938.</w:t>
+        <w:t xml:space="preserve">, P., Heale, C., Chakraborty, S., &amp; Zettergren, M. (2025). The Impact of Receiver-Satellite Line-of-Sight Orientation on GNSS TEC Observations of TIDs Induced by Gravity Waves </w:t>
+      </w:r>
+      <w:proofErr w:type="gramStart"/>
+      <w:r>
+        <w:rPr>
+          <w:sz w:val="18"/>
+          <w:szCs w:val="18"/>
+        </w:rPr>
+        <w:t>From</w:t>
+      </w:r>
+      <w:proofErr w:type="gramEnd"/>
+      <w:r>
+        <w:rPr>
+          <w:sz w:val="18"/>
+          <w:szCs w:val="18"/>
+        </w:rPr>
+        <w:t xml:space="preserve"> Convective Sources. Journal of Geophysical Research: Space Physics, 130(9), e2025JA033938.</w:t>
       </w:r>
     </w:p>
     <w:p>
@@ -3644,6 +3744,7 @@
           <w:sz w:val="18"/>
           <w:szCs w:val="18"/>
         </w:rPr>
+        <w:lastRenderedPageBreak/>
         <w:t>Shi, X., Chakraborty, S., Baker, J. B. H., Hartinger, M. D., Wang, W., Ruohoniemi, J. M., et al. (2025). Statistical characterization of joule heating associated with ionospheric ULF perturbations using SuperDARN data. Journal of Geophysical Research: Space Physics, 130, e2024JA033452. https://doi.org/10.1029/2024JA033452</w:t>
       </w:r>
     </w:p>
@@ -3661,7 +3762,6 @@
           <w:sz w:val="18"/>
           <w:szCs w:val="18"/>
         </w:rPr>
-        <w:lastRenderedPageBreak/>
         <w:t>Liu, X., Zhang, D., Coster, A. J., Xu, Z., Shi, X., &amp; Chakraborty, S. (2024). The morphology and oscillations of nightside mid-latitude ionospheric trough at designated longitudes in the Northern Hemisphere. Journal of Geophysical Research: Space Physics, 129, e2024JA032864. https://doi.org/10.1029/2024JA032864</w:t>
       </w:r>
     </w:p>
@@ -3746,7 +3846,23 @@
           <w:sz w:val="18"/>
           <w:szCs w:val="18"/>
         </w:rPr>
-        <w:t>, B. S. R., Raeder, J., Laundal, K. M., Tulasi Ram, S., Chakraborty S., et al. (2024). Calculating the high-latitude ionospheric electrodynamics using a machine learning-based field-aligned current model. Space Weather, 22, e2023SW003683. https://doi.org/10.1029/2023SW003683</w:t>
+        <w:t xml:space="preserve">, B. S. R., Raeder, J., Laundal, K. M., Tulasi Ram, S., Chakraborty S., et al. (2024). Calculating </w:t>
+      </w:r>
+      <w:proofErr w:type="gramStart"/>
+      <w:r>
+        <w:rPr>
+          <w:sz w:val="18"/>
+          <w:szCs w:val="18"/>
+        </w:rPr>
+        <w:t>the high</w:t>
+      </w:r>
+      <w:proofErr w:type="gramEnd"/>
+      <w:r>
+        <w:rPr>
+          <w:sz w:val="18"/>
+          <w:szCs w:val="18"/>
+        </w:rPr>
+        <w:t>-latitude ionospheric electrodynamics using a machine learning-based field-aligned current model. Space Weather, 22, e2023SW003683. https://doi.org/10.1029/2023SW003683</w:t>
       </w:r>
     </w:p>
     <w:p>
@@ -4009,7 +4125,23 @@
           <w:sz w:val="18"/>
           <w:szCs w:val="18"/>
         </w:rPr>
-        <w:t>, G., Hobart, J., Kavanagh, G., and Chakraborty, S. (2023). Crowdsourced Doppler measurements of time standard stations demonstrating ionospheric variability. Earth Syst. Sci. Data, 15, 1403-1418, doi:10.5194/essd-15-1403-2023</w:t>
+        <w:t xml:space="preserve">, G., Hobart, J., Kavanagh, G., and Chakraborty, S. (2023). Crowdsourced Doppler measurements of time standard stations </w:t>
+      </w:r>
+      <w:proofErr w:type="gramStart"/>
+      <w:r>
+        <w:rPr>
+          <w:sz w:val="18"/>
+          <w:szCs w:val="18"/>
+        </w:rPr>
+        <w:t>demonstrating</w:t>
+      </w:r>
+      <w:proofErr w:type="gramEnd"/>
+      <w:r>
+        <w:rPr>
+          <w:sz w:val="18"/>
+          <w:szCs w:val="18"/>
+        </w:rPr>
+        <w:t xml:space="preserve"> ionospheric variability. Earth Syst. Sci. Data, 15, 1403-1418, doi:10.5194/essd-15-1403-2023</w:t>
       </w:r>
     </w:p>
     <w:p>
@@ -4189,7 +4321,23 @@
           <w:sz w:val="18"/>
           <w:szCs w:val="18"/>
         </w:rPr>
-        <w:t xml:space="preserve">: A Python software for visualizing SuperDARN radar data. Front. Astron. Space Sci. 9:1022690. </w:t>
+        <w:t xml:space="preserve">: </w:t>
+      </w:r>
+      <w:proofErr w:type="gramStart"/>
+      <w:r>
+        <w:rPr>
+          <w:sz w:val="18"/>
+          <w:szCs w:val="18"/>
+        </w:rPr>
+        <w:t>A Python</w:t>
+      </w:r>
+      <w:proofErr w:type="gramEnd"/>
+      <w:r>
+        <w:rPr>
+          <w:sz w:val="18"/>
+          <w:szCs w:val="18"/>
+        </w:rPr>
+        <w:t xml:space="preserve"> software for visualizing SuperDARN radar data. Front. Astron. Space Sci. 9:1022690. </w:t>
       </w:r>
       <w:proofErr w:type="spellStart"/>
       <w:r>
@@ -4518,6 +4666,7 @@
           <w:sz w:val="18"/>
           <w:szCs w:val="18"/>
         </w:rPr>
+        <w:lastRenderedPageBreak/>
         <w:t>Chakraborty, S., Ruohoniemi, J. M., Baker, J. B. H., and Nishitani, N. (2018). Characterization of short-wave fadeout seen in daytime SuperDARN ground scatter observations. Radio Science, 53, 472-484. doi:10.1002/2017RS006488</w:t>
       </w:r>
     </w:p>
@@ -4535,7 +4684,6 @@
           <w:sz w:val="18"/>
           <w:szCs w:val="18"/>
         </w:rPr>
-        <w:lastRenderedPageBreak/>
         <w:t xml:space="preserve">Fiori, R. A. D., </w:t>
       </w:r>
       <w:proofErr w:type="spellStart"/>
@@ -4740,7 +4888,23 @@
           <w:sz w:val="19"/>
           <w:szCs w:val="19"/>
         </w:rPr>
-        <w:t>Chakraborty, S. (Invited). Characterization of Solar Flare Effects Observed by High Frequency Radar, HAO Colloquium, 12 July, 2023, Online.</w:t>
+        <w:t xml:space="preserve">Chakraborty, S. (Invited). Characterization of Solar Flare Effects Observed by High Frequency Radar, HAO Colloquium, 12 </w:t>
+      </w:r>
+      <w:proofErr w:type="gramStart"/>
+      <w:r>
+        <w:rPr>
+          <w:sz w:val="19"/>
+          <w:szCs w:val="19"/>
+        </w:rPr>
+        <w:t>July,</w:t>
+      </w:r>
+      <w:proofErr w:type="gramEnd"/>
+      <w:r>
+        <w:rPr>
+          <w:sz w:val="19"/>
+          <w:szCs w:val="19"/>
+        </w:rPr>
+        <w:t xml:space="preserve"> 2023, Online.</w:t>
       </w:r>
     </w:p>
     <w:p>
@@ -4861,7 +5025,23 @@
           <w:sz w:val="19"/>
           <w:szCs w:val="19"/>
         </w:rPr>
-        <w:t>Chakraborty, S., Nishitani, N., Ruohoniemi, J. M., Baker, J. B. H., Shi, X., Kunduri, B. Solar Flare effects on High Latitude Electrodynamics, Fall AGU, Chicago, IL, 12-16 December, 2022.</w:t>
+        <w:t xml:space="preserve">Chakraborty, S., Nishitani, N., Ruohoniemi, J. M., Baker, J. B. H., Shi, X., Kunduri, B. Solar Flare effects on High Latitude Electrodynamics, Fall AGU, Chicago, IL, 12-16 </w:t>
+      </w:r>
+      <w:proofErr w:type="gramStart"/>
+      <w:r>
+        <w:rPr>
+          <w:sz w:val="19"/>
+          <w:szCs w:val="19"/>
+        </w:rPr>
+        <w:t>December,</w:t>
+      </w:r>
+      <w:proofErr w:type="gramEnd"/>
+      <w:r>
+        <w:rPr>
+          <w:sz w:val="19"/>
+          <w:szCs w:val="19"/>
+        </w:rPr>
+        <w:t xml:space="preserve"> 2022.</w:t>
       </w:r>
     </w:p>
     <w:p>
@@ -4878,7 +5058,23 @@
           <w:sz w:val="19"/>
           <w:szCs w:val="19"/>
         </w:rPr>
-        <w:t>Boteler, D., Chakraborty, S., Shi, X., Murphy, B., Hartinger, M., Wang, X., Lucas, G., and Baker, J. Modeling Geomagnetic Induction in Submarine Cable, Fall AGU, Chicago, IL, 12-16 December, 2022.</w:t>
+        <w:t xml:space="preserve">Boteler, D., Chakraborty, S., Shi, X., Murphy, B., Hartinger, M., Wang, X., Lucas, G., and Baker, J. Modeling Geomagnetic Induction in Submarine Cable, Fall AGU, Chicago, IL, 12-16 </w:t>
+      </w:r>
+      <w:proofErr w:type="gramStart"/>
+      <w:r>
+        <w:rPr>
+          <w:sz w:val="19"/>
+          <w:szCs w:val="19"/>
+        </w:rPr>
+        <w:t>December,</w:t>
+      </w:r>
+      <w:proofErr w:type="gramEnd"/>
+      <w:r>
+        <w:rPr>
+          <w:sz w:val="19"/>
+          <w:szCs w:val="19"/>
+        </w:rPr>
+        <w:t xml:space="preserve"> 2022.</w:t>
       </w:r>
     </w:p>
     <w:p>
@@ -4911,7 +5107,23 @@
           <w:sz w:val="19"/>
           <w:szCs w:val="19"/>
         </w:rPr>
-        <w:t>, J. The Role of Flare-Driven Ionospheric Electron Density Changes on the Doppler Flash Observed by SuperDARN HF Radars, STE, Nagoya University, Japan, 27 September, 2022.</w:t>
+        <w:t xml:space="preserve">, J. The Role of Flare-Driven Ionospheric Electron Density Changes on the Doppler Flash Observed by SuperDARN HF Radars, STE, Nagoya University, Japan, 27 </w:t>
+      </w:r>
+      <w:proofErr w:type="gramStart"/>
+      <w:r>
+        <w:rPr>
+          <w:sz w:val="19"/>
+          <w:szCs w:val="19"/>
+        </w:rPr>
+        <w:t>September,</w:t>
+      </w:r>
+      <w:proofErr w:type="gramEnd"/>
+      <w:r>
+        <w:rPr>
+          <w:sz w:val="19"/>
+          <w:szCs w:val="19"/>
+        </w:rPr>
+        <w:t xml:space="preserve"> 2022.</w:t>
       </w:r>
     </w:p>
     <w:p>
@@ -4944,7 +5156,23 @@
           <w:sz w:val="19"/>
           <w:szCs w:val="19"/>
         </w:rPr>
-        <w:t>, J. M., Mark, S., Erickson, P. J., Earle, G. Origination of Ionospheric G-condition following a Total solar eclipse, TESS, Bellevue, WA, 8-11 August, 2022.</w:t>
+        <w:t xml:space="preserve">, J. M., Mark, S., Erickson, P. J., Earle, G. Origination of Ionospheric G-condition following a Total solar eclipse, TESS, Bellevue, WA, 8-11 </w:t>
+      </w:r>
+      <w:proofErr w:type="gramStart"/>
+      <w:r>
+        <w:rPr>
+          <w:sz w:val="19"/>
+          <w:szCs w:val="19"/>
+        </w:rPr>
+        <w:t>August,</w:t>
+      </w:r>
+      <w:proofErr w:type="gramEnd"/>
+      <w:r>
+        <w:rPr>
+          <w:sz w:val="19"/>
+          <w:szCs w:val="19"/>
+        </w:rPr>
+        <w:t xml:space="preserve"> 2022.</w:t>
       </w:r>
     </w:p>
     <w:p>
@@ -4977,7 +5205,23 @@
           <w:sz w:val="19"/>
           <w:szCs w:val="19"/>
         </w:rPr>
-        <w:t>, Online, 27-28 June, 2022.</w:t>
+        <w:t xml:space="preserve">, Online, 27-28 </w:t>
+      </w:r>
+      <w:proofErr w:type="gramStart"/>
+      <w:r>
+        <w:rPr>
+          <w:sz w:val="19"/>
+          <w:szCs w:val="19"/>
+        </w:rPr>
+        <w:t>June,</w:t>
+      </w:r>
+      <w:proofErr w:type="gramEnd"/>
+      <w:r>
+        <w:rPr>
+          <w:sz w:val="19"/>
+          <w:szCs w:val="19"/>
+        </w:rPr>
+        <w:t xml:space="preserve"> 2022.</w:t>
       </w:r>
     </w:p>
     <w:p>
@@ -5028,6 +5272,7 @@
           <w:sz w:val="19"/>
           <w:szCs w:val="19"/>
         </w:rPr>
+        <w:lastRenderedPageBreak/>
         <w:t>Chakraborty, S., Baker, J. B. H., Ruohoniemi, J. M., Bailey, S., Fiori, R. A. D., Nishitani, N. A Study of Solar Flare Effects on Mid and High Latitude Radio Wave Propagation using SuperDARN HF Radar, AGU Fall Meeting, Washington DC, 2018.</w:t>
       </w:r>
     </w:p>
@@ -5047,7 +5292,6 @@
           <w:sz w:val="24"/>
           <w:szCs w:val="24"/>
         </w:rPr>
-        <w:lastRenderedPageBreak/>
         <w:t>OUTREACH &amp; ACTIVITIES</w:t>
       </w:r>
     </w:p>
@@ -5090,7 +5334,23 @@
           <w:sz w:val="19"/>
           <w:szCs w:val="19"/>
         </w:rPr>
-        <w:t>Participated in Science and Collaborative talks for the freshmen as a volunteer faculty, organized by the Center for the Enhancement of Engineering Diversity (CEED) at Virginia Tech (Since 2021).</w:t>
+        <w:t xml:space="preserve">Participated in Science and Collaborative </w:t>
+      </w:r>
+      <w:proofErr w:type="gramStart"/>
+      <w:r>
+        <w:rPr>
+          <w:sz w:val="19"/>
+          <w:szCs w:val="19"/>
+        </w:rPr>
+        <w:t>talks</w:t>
+      </w:r>
+      <w:proofErr w:type="gramEnd"/>
+      <w:r>
+        <w:rPr>
+          <w:sz w:val="19"/>
+          <w:szCs w:val="19"/>
+        </w:rPr>
+        <w:t xml:space="preserve"> for the freshmen as a volunteer faculty, organized by the Center for the Enhancement of Engineering Diversity (CEED) at Virginia Tech (Since 2021).</w:t>
       </w:r>
     </w:p>
     <w:p>

</xml_diff>

<commit_message>
Add 2026 Radio Science paper and update website publication records
</commit_message>
<xml_diff>
--- a/assets/pdf/Chakraborty.docx
+++ b/assets/pdf/Chakraborty.docx
@@ -1,6 +1,6 @@
 
 <file path=word/document.xml><?xml version="1.0" encoding="utf-8"?>
-<w:document xmlns:wpc="http://schemas.microsoft.com/office/word/2010/wordprocessingCanvas" xmlns:cx="http://schemas.microsoft.com/office/drawing/2014/chartex" xmlns:cx1="http://schemas.microsoft.com/office/drawing/2015/9/8/chartex" xmlns:cx2="http://schemas.microsoft.com/office/drawing/2015/10/21/chartex" xmlns:cx3="http://schemas.microsoft.com/office/drawing/2016/5/9/chartex" xmlns:cx4="http://schemas.microsoft.com/office/drawing/2016/5/10/chartex" xmlns:cx5="http://schemas.microsoft.com/office/drawing/2016/5/11/chartex" xmlns:cx6="http://schemas.microsoft.com/office/drawing/2016/5/12/chartex" xmlns:cx7="http://schemas.microsoft.com/office/drawing/2016/5/13/chartex" xmlns:cx8="http://schemas.microsoft.com/office/drawing/2016/5/14/chartex" xmlns:mc="http://schemas.openxmlformats.org/markup-compatibility/2006" xmlns:aink="http://schemas.microsoft.com/office/drawing/2016/ink" xmlns:am3d="http://schemas.microsoft.com/office/drawing/2017/model3d" xmlns:o="urn:schemas-microsoft-com:office:office" xmlns:oel="http://schemas.microsoft.com/office/2019/extlst" xmlns:r="http://schemas.openxmlformats.org/officeDocument/2006/relationships" xmlns:m="http://schemas.openxmlformats.org/officeDocument/2006/math" xmlns:v="urn:schemas-microsoft-com:vml" xmlns:wp14="http://schemas.microsoft.com/office/word/2010/wordprocessingDrawing" xmlns:wp="http://schemas.openxmlformats.org/drawingml/2006/wordprocessingDrawing" xmlns:w10="urn:schemas-microsoft-com:office:word" xmlns:w="http://schemas.openxmlformats.org/wordprocessingml/2006/main" xmlns:w14="http://schemas.microsoft.com/office/word/2010/wordml" xmlns:w15="http://schemas.microsoft.com/office/word/2012/wordml" xmlns:w16cei="http://schemas.microsoft.com/office/word/2026/wordml/cei" xmlns:w16cex="http://schemas.microsoft.com/office/word/2018/wordml/cex" xmlns:w16cid="http://schemas.microsoft.com/office/word/2016/wordml/cid" xmlns:w16="http://schemas.microsoft.com/office/word/2018/wordml" xmlns:w16du="http://schemas.microsoft.com/office/word/2023/wordml/word16du" xmlns:w16sdtdh="http://schemas.microsoft.com/office/word/2020/wordml/sdtdatahash" xmlns:w16sdtfl="http://schemas.microsoft.com/office/word/2024/wordml/sdtformatlock" xmlns:w16se="http://schemas.microsoft.com/office/word/2015/wordml/symex" xmlns:wpg="http://schemas.microsoft.com/office/word/2010/wordprocessingGroup" xmlns:wpi="http://schemas.microsoft.com/office/word/2010/wordprocessingInk" xmlns:wne="http://schemas.microsoft.com/office/word/2006/wordml" xmlns:wps="http://schemas.microsoft.com/office/word/2010/wordprocessingShape" mc:Ignorable="w14 w15 w16se w16cid w16 w16cex w16sdtdh w16sdtfl w16du wp14">
+<w:document xmlns:wpc="http://schemas.microsoft.com/office/word/2010/wordprocessingCanvas" xmlns:cx="http://schemas.microsoft.com/office/drawing/2014/chartex" xmlns:cx1="http://schemas.microsoft.com/office/drawing/2015/9/8/chartex" xmlns:cx2="http://schemas.microsoft.com/office/drawing/2015/10/21/chartex" xmlns:cx3="http://schemas.microsoft.com/office/drawing/2016/5/9/chartex" xmlns:cx4="http://schemas.microsoft.com/office/drawing/2016/5/10/chartex" xmlns:cx5="http://schemas.microsoft.com/office/drawing/2016/5/11/chartex" xmlns:cx6="http://schemas.microsoft.com/office/drawing/2016/5/12/chartex" xmlns:cx7="http://schemas.microsoft.com/office/drawing/2016/5/13/chartex" xmlns:cx8="http://schemas.microsoft.com/office/drawing/2016/5/14/chartex" xmlns:mc="http://schemas.openxmlformats.org/markup-compatibility/2006" xmlns:aink="http://schemas.microsoft.com/office/drawing/2016/ink" xmlns:am3d="http://schemas.microsoft.com/office/drawing/2017/model3d" xmlns:o="urn:schemas-microsoft-com:office:office" xmlns:oel="http://schemas.microsoft.com/office/2019/extlst" xmlns:r="http://schemas.openxmlformats.org/officeDocument/2006/relationships" xmlns:m="http://schemas.openxmlformats.org/officeDocument/2006/math" xmlns:v="urn:schemas-microsoft-com:vml" xmlns:wp14="http://schemas.microsoft.com/office/word/2010/wordprocessingDrawing" xmlns:wp="http://schemas.openxmlformats.org/drawingml/2006/wordprocessingDrawing" xmlns:w10="urn:schemas-microsoft-com:office:word" xmlns:w="http://schemas.openxmlformats.org/wordprocessingml/2006/main" xmlns:w14="http://schemas.microsoft.com/office/word/2010/wordml" xmlns:w15="http://schemas.microsoft.com/office/word/2012/wordml" xmlns:w16cex="http://schemas.microsoft.com/office/word/2018/wordml/cex" xmlns:w16cid="http://schemas.microsoft.com/office/word/2016/wordml/cid" xmlns:w16="http://schemas.microsoft.com/office/word/2018/wordml" xmlns:w16du="http://schemas.microsoft.com/office/word/2023/wordml/word16du" xmlns:w16sdtdh="http://schemas.microsoft.com/office/word/2020/wordml/sdtdatahash" xmlns:w16sdtfl="http://schemas.microsoft.com/office/word/2024/wordml/sdtformatlock" xmlns:w16se="http://schemas.microsoft.com/office/word/2015/wordml/symex" xmlns:wpg="http://schemas.microsoft.com/office/word/2010/wordprocessingGroup" xmlns:wpi="http://schemas.microsoft.com/office/word/2010/wordprocessingInk" xmlns:wne="http://schemas.microsoft.com/office/word/2006/wordml" xmlns:wps="http://schemas.microsoft.com/office/word/2010/wordprocessingShape" mc:Ignorable="w14 w15 w16se w16cid w16 w16cex w16sdtdh w16sdtfl w16du wp14">
   <w:body>
     <w:p>
       <w:pPr>
@@ -1724,6 +1724,68 @@
           <w:rFonts w:ascii="Georgia" w:eastAsia="Georgia" w:hAnsi="Georgia" w:cs="Georgia"/>
           <w:color w:val="201F1D"/>
         </w:rPr>
+        <w:t xml:space="preserve">Chakraborty, S., </w:t>
+      </w:r>
+      <w:proofErr w:type="spellStart"/>
+      <w:r>
+        <w:rPr>
+          <w:rFonts w:ascii="Georgia" w:eastAsia="Georgia" w:hAnsi="Georgia" w:cs="Georgia"/>
+          <w:color w:val="201F1D"/>
+        </w:rPr>
+        <w:t>Inchin</w:t>
+      </w:r>
+      <w:proofErr w:type="spellEnd"/>
+      <w:r>
+        <w:rPr>
+          <w:rFonts w:ascii="Georgia" w:eastAsia="Georgia" w:hAnsi="Georgia" w:cs="Georgia"/>
+          <w:color w:val="201F1D"/>
+        </w:rPr>
+        <w:t xml:space="preserve">, P. A., </w:t>
+      </w:r>
+      <w:proofErr w:type="spellStart"/>
+      <w:r>
+        <w:rPr>
+          <w:rFonts w:ascii="Georgia" w:eastAsia="Georgia" w:hAnsi="Georgia" w:cs="Georgia"/>
+          <w:color w:val="201F1D"/>
+        </w:rPr>
+        <w:t>Debchoudhury</w:t>
+      </w:r>
+      <w:proofErr w:type="spellEnd"/>
+      <w:r>
+        <w:rPr>
+          <w:rFonts w:ascii="Georgia" w:eastAsia="Georgia" w:hAnsi="Georgia" w:cs="Georgia"/>
+          <w:color w:val="201F1D"/>
+        </w:rPr>
+        <w:t xml:space="preserve">, S., Bergsson, B., Zettergren, M., &amp; Ruohoniemi, J. M. (2026). The Impacts of tropospheric gravity wave-generated MSTIDs on skywaves at mid-latitude north American sector observed and modeled using SuperDARN HF radars. Radio Science, 61, e2025RS008464. </w:t>
+      </w:r>
+      <w:hyperlink r:id="rId5" w:history="1">
+        <w:r>
+          <w:rPr>
+            <w:color w:val="201F1D"/>
+          </w:rPr>
+          <w:t>https://doi.org/10.1029/2025RS008464</w:t>
+        </w:r>
+      </w:hyperlink>
+    </w:p>
+    <w:p>
+      <w:pPr>
+        <w:pStyle w:val="ListParagraph"/>
+        <w:numPr>
+          <w:ilvl w:val="0"/>
+          <w:numId w:val="3"/>
+        </w:numPr>
+        <w:spacing w:after="120"/>
+        <w:jc w:val="both"/>
+        <w:rPr>
+          <w:rFonts w:ascii="Georgia" w:eastAsia="Georgia" w:hAnsi="Georgia" w:cs="Georgia"/>
+          <w:color w:val="201F1D"/>
+        </w:rPr>
+      </w:pPr>
+      <w:r>
+        <w:rPr>
+          <w:rFonts w:ascii="Georgia" w:eastAsia="Georgia" w:hAnsi="Georgia" w:cs="Georgia"/>
+          <w:color w:val="201F1D"/>
+        </w:rPr>
         <w:t xml:space="preserve">Valentine, H. C., Barjatya, A., Chakraborty, S., Graves, N. P., Clayton, R. E., </w:t>
       </w:r>
       <w:proofErr w:type="spellStart"/>
@@ -1742,7 +1804,7 @@
         </w:rPr>
         <w:t xml:space="preserve">, S., et al. (2026). Simultaneous multi-point in situ plasma density measurements of a mid-latitude sporadic E layer. Journal of Geophysical Research: Space Physics, 131, e2026JA035164. </w:t>
       </w:r>
-      <w:hyperlink r:id="rId5" w:history="1">
+      <w:hyperlink r:id="rId6" w:history="1">
         <w:r>
           <w:rPr>
             <w:rFonts w:ascii="Georgia" w:eastAsia="Georgia" w:hAnsi="Georgia" w:cs="Georgia"/>
@@ -2092,6 +2154,7 @@
           <w:rFonts w:ascii="Georgia" w:eastAsia="Georgia" w:hAnsi="Georgia" w:cs="Georgia"/>
           <w:color w:val="201F1D"/>
         </w:rPr>
+        <w:lastRenderedPageBreak/>
         <w:t xml:space="preserve">Prikryl, P., </w:t>
       </w:r>
       <w:proofErr w:type="spellStart"/>
@@ -2130,7 +2193,6 @@
           <w:rFonts w:ascii="Georgia" w:eastAsia="Georgia" w:hAnsi="Georgia" w:cs="Georgia"/>
           <w:color w:val="201F1D"/>
         </w:rPr>
-        <w:lastRenderedPageBreak/>
         <w:t xml:space="preserve">Chakraborty, S., Qian, L., Mrak, S., Mabie, J., Goncharenko, L., </w:t>
       </w:r>
       <w:proofErr w:type="spellStart"/>
@@ -2781,6 +2843,7 @@
           <w:rFonts w:ascii="Georgia" w:eastAsia="Georgia" w:hAnsi="Georgia" w:cs="Georgia"/>
           <w:color w:val="201F1D"/>
         </w:rPr>
+        <w:lastRenderedPageBreak/>
         <w:t xml:space="preserve">Chakraborty, S., Qian, L., Baker, J. B. H., Ruohoniemi, J. M., Kuyeng, K., and Mclnerney, J. M. (2022). Driving influences of the Doppler flash observed by SuperDARN HF radars in response to solar flares. Journal of Geophysical Research: Space Physics, 127, e2022JA030342. </w:t>
       </w:r>
       <w:proofErr w:type="spellStart"/>
@@ -2815,7 +2878,6 @@
           <w:rFonts w:ascii="Georgia" w:eastAsia="Georgia" w:hAnsi="Georgia" w:cs="Georgia"/>
           <w:color w:val="201F1D"/>
         </w:rPr>
-        <w:lastRenderedPageBreak/>
         <w:t xml:space="preserve">Shi, X., Schmidt, M., Martin, C. J., Billett, D. D., Bland, E., </w:t>
       </w:r>
       <w:proofErr w:type="spellStart"/>
@@ -3480,6 +3542,7 @@
           <w:rFonts w:ascii="Georgia" w:eastAsia="Georgia" w:hAnsi="Georgia" w:cs="Georgia"/>
           <w:color w:val="201F1D"/>
         </w:rPr>
+        <w:lastRenderedPageBreak/>
         <w:t xml:space="preserve">Chakraborty, S. (Invited). Characterization of Solar Flare Effects Observed by High Frequency Radar. HAO Colloquium, 12 July 2023, </w:t>
       </w:r>
       <w:proofErr w:type="gramStart"/>
@@ -3518,7 +3581,6 @@
           <w:rFonts w:ascii="Georgia" w:eastAsia="Georgia" w:hAnsi="Georgia" w:cs="Georgia"/>
           <w:color w:val="201F1D"/>
         </w:rPr>
-        <w:lastRenderedPageBreak/>
         <w:t>Chakraborty, S. (Invited), Shi, X., Chisham, G., Ruohoniemi, J. M., Baker, J. B. H., Stern, K., and Thomas, E. G. Coordinated Investigation of Antarctic Total Solar Eclipse (TSE) using SuperDARN HF Radars. CEDAR Workshop, Austin, June 2022.</w:t>
       </w:r>
     </w:p>
@@ -4197,7 +4259,7 @@
 </file>
 
 <file path=word/numbering.xml><?xml version="1.0" encoding="utf-8"?>
-<w:numbering xmlns:wpc="http://schemas.microsoft.com/office/word/2010/wordprocessingCanvas" xmlns:cx="http://schemas.microsoft.com/office/drawing/2014/chartex" xmlns:cx1="http://schemas.microsoft.com/office/drawing/2015/9/8/chartex" xmlns:cx2="http://schemas.microsoft.com/office/drawing/2015/10/21/chartex" xmlns:cx3="http://schemas.microsoft.com/office/drawing/2016/5/9/chartex" xmlns:cx4="http://schemas.microsoft.com/office/drawing/2016/5/10/chartex" xmlns:cx5="http://schemas.microsoft.com/office/drawing/2016/5/11/chartex" xmlns:cx6="http://schemas.microsoft.com/office/drawing/2016/5/12/chartex" xmlns:cx7="http://schemas.microsoft.com/office/drawing/2016/5/13/chartex" xmlns:cx8="http://schemas.microsoft.com/office/drawing/2016/5/14/chartex" xmlns:mc="http://schemas.openxmlformats.org/markup-compatibility/2006" xmlns:aink="http://schemas.microsoft.com/office/drawing/2016/ink" xmlns:am3d="http://schemas.microsoft.com/office/drawing/2017/model3d" xmlns:o="urn:schemas-microsoft-com:office:office" xmlns:oel="http://schemas.microsoft.com/office/2019/extlst" xmlns:r="http://schemas.openxmlformats.org/officeDocument/2006/relationships" xmlns:m="http://schemas.openxmlformats.org/officeDocument/2006/math" xmlns:v="urn:schemas-microsoft-com:vml" xmlns:wp14="http://schemas.microsoft.com/office/word/2010/wordprocessingDrawing" xmlns:wp="http://schemas.openxmlformats.org/drawingml/2006/wordprocessingDrawing" xmlns:w10="urn:schemas-microsoft-com:office:word" xmlns:w="http://schemas.openxmlformats.org/wordprocessingml/2006/main" xmlns:w14="http://schemas.microsoft.com/office/word/2010/wordml" xmlns:w15="http://schemas.microsoft.com/office/word/2012/wordml" xmlns:w16cei="http://schemas.microsoft.com/office/word/2026/wordml/cei" xmlns:w16cex="http://schemas.microsoft.com/office/word/2018/wordml/cex" xmlns:w16cid="http://schemas.microsoft.com/office/word/2016/wordml/cid" xmlns:w16="http://schemas.microsoft.com/office/word/2018/wordml" xmlns:w16du="http://schemas.microsoft.com/office/word/2023/wordml/word16du" xmlns:w16sdtdh="http://schemas.microsoft.com/office/word/2020/wordml/sdtdatahash" xmlns:w16sdtfl="http://schemas.microsoft.com/office/word/2024/wordml/sdtformatlock" xmlns:w16se="http://schemas.microsoft.com/office/word/2015/wordml/symex" xmlns:wpg="http://schemas.microsoft.com/office/word/2010/wordprocessingGroup" xmlns:wpi="http://schemas.microsoft.com/office/word/2010/wordprocessingInk" xmlns:wne="http://schemas.microsoft.com/office/word/2006/wordml" xmlns:wps="http://schemas.microsoft.com/office/word/2010/wordprocessingShape" mc:Ignorable="w14 w15 w16se w16cid w16 w16cex w16sdtdh w16sdtfl w16du wp14">
+<w:numbering xmlns:wpc="http://schemas.microsoft.com/office/word/2010/wordprocessingCanvas" xmlns:cx="http://schemas.microsoft.com/office/drawing/2014/chartex" xmlns:cx1="http://schemas.microsoft.com/office/drawing/2015/9/8/chartex" xmlns:cx2="http://schemas.microsoft.com/office/drawing/2015/10/21/chartex" xmlns:cx3="http://schemas.microsoft.com/office/drawing/2016/5/9/chartex" xmlns:cx4="http://schemas.microsoft.com/office/drawing/2016/5/10/chartex" xmlns:cx5="http://schemas.microsoft.com/office/drawing/2016/5/11/chartex" xmlns:cx6="http://schemas.microsoft.com/office/drawing/2016/5/12/chartex" xmlns:cx7="http://schemas.microsoft.com/office/drawing/2016/5/13/chartex" xmlns:cx8="http://schemas.microsoft.com/office/drawing/2016/5/14/chartex" xmlns:mc="http://schemas.openxmlformats.org/markup-compatibility/2006" xmlns:aink="http://schemas.microsoft.com/office/drawing/2016/ink" xmlns:am3d="http://schemas.microsoft.com/office/drawing/2017/model3d" xmlns:o="urn:schemas-microsoft-com:office:office" xmlns:oel="http://schemas.microsoft.com/office/2019/extlst" xmlns:r="http://schemas.openxmlformats.org/officeDocument/2006/relationships" xmlns:m="http://schemas.openxmlformats.org/officeDocument/2006/math" xmlns:v="urn:schemas-microsoft-com:vml" xmlns:wp14="http://schemas.microsoft.com/office/word/2010/wordprocessingDrawing" xmlns:wp="http://schemas.openxmlformats.org/drawingml/2006/wordprocessingDrawing" xmlns:w10="urn:schemas-microsoft-com:office:word" xmlns:w="http://schemas.openxmlformats.org/wordprocessingml/2006/main" xmlns:w14="http://schemas.microsoft.com/office/word/2010/wordml" xmlns:w15="http://schemas.microsoft.com/office/word/2012/wordml" xmlns:w16cex="http://schemas.microsoft.com/office/word/2018/wordml/cex" xmlns:w16cid="http://schemas.microsoft.com/office/word/2016/wordml/cid" xmlns:w16="http://schemas.microsoft.com/office/word/2018/wordml" xmlns:w16du="http://schemas.microsoft.com/office/word/2023/wordml/word16du" xmlns:w16sdtdh="http://schemas.microsoft.com/office/word/2020/wordml/sdtdatahash" xmlns:w16sdtfl="http://schemas.microsoft.com/office/word/2024/wordml/sdtformatlock" xmlns:w16se="http://schemas.microsoft.com/office/word/2015/wordml/symex" xmlns:wpg="http://schemas.microsoft.com/office/word/2010/wordprocessingGroup" xmlns:wpi="http://schemas.microsoft.com/office/word/2010/wordprocessingInk" xmlns:wne="http://schemas.microsoft.com/office/word/2006/wordml" xmlns:wps="http://schemas.microsoft.com/office/word/2010/wordprocessingShape" mc:Ignorable="w14 w15 w16se w16cid w16 w16cex w16sdtdh w16sdtfl w16du wp14">
   <w:abstractNum w:abstractNumId="0" w15:restartNumberingAfterBreak="0">
     <w:nsid w:val="048E5DF6"/>
     <w:multiLevelType w:val="hybridMultilevel"/>

</xml_diff>